<commit_message>
Add importable solution packages
Co-authored-by: Copilot <223556219+Copilot@users.noreply.github.com>
</commit_message>
<xml_diff>
--- a/Orphaned Flow Finder - Deployment and Tenant Onboarding Guide.docx
+++ b/Orphaned Flow Finder - Deployment and Tenant Onboarding Guide.docx
@@ -225,6 +225,187 @@
       <w:r>
         <w:rPr/>
         <w:t xml:space="preserve">Developers responsible for the Code App source</w:t>
+      </w:r>
+    </w:p>
+    <w:p>
+      <w:pPr>
+        <w:pStyle w:val="Heading1"/>
+        <w:spacing w:before="280" w:after="120" w:line="276" w:lineRule="auto"/>
+      </w:pPr>
+      <w:r>
+        <w:rPr/>
+        <w:t xml:space="preserve">Quick installation path</w:t>
+      </w:r>
+    </w:p>
+    <w:p>
+      <w:pPr>
+        <w:pStyle w:val="Normal"/>
+        <w:spacing w:before="0" w:after="120" w:line="276" w:lineRule="auto"/>
+      </w:pPr>
+      <w:r>
+        <w:rPr/>
+        <w:t xml:space="preserve">Use this path when installing the published package from the project repository. Sections 3 and 4 are for maintainers who build a new release and can be skipped by a target-tenant installer.</w:t>
+      </w:r>
+    </w:p>
+    <w:p>
+      <w:pPr>
+        <w:pStyle w:val="Normal"/>
+        <w:spacing w:before="0" w:after="120" w:line="276" w:lineRule="auto"/>
+        <w:ind w:left="540" w:hanging="360"/>
+      </w:pPr>
+      <w:r>
+        <w:rPr>
+          <w:b/>
+        </w:rPr>
+        <w:t xml:space="preserve">1. </w:t>
+      </w:r>
+      <w:r>
+        <w:rPr/>
+        <w:t xml:space="preserve">Download</w:t>
+      </w:r>
+    </w:p>
+    <w:p>
+      <w:pPr>
+        <w:pStyle w:val="Normal"/>
+        <w:spacing w:before="0" w:after="120" w:line="276" w:lineRule="auto"/>
+      </w:pPr>
+      <w:r>
+        <w:rPr>
+          <w:rFonts w:ascii="Consolas" w:hAnsi="Consolas"/>
+          <w:sz w:val="18"/>
+          <w:szCs w:val="18"/>
+          <w:shd w:val="clear" w:color="auto" w:fill="F3F4F6"/>
+        </w:rPr>
+        <w:t xml:space="preserve">solutions/OrphanedFlowFinder_1_0_0_0_managed.zip</w:t>
+      </w:r>
+      <w:r>
+        <w:rPr/>
+        <w:t xml:space="preserve">.</w:t>
+      </w:r>
+    </w:p>
+    <w:p>
+      <w:pPr>
+        <w:pStyle w:val="Normal"/>
+        <w:spacing w:before="0" w:after="120" w:line="276" w:lineRule="auto"/>
+        <w:ind w:left="540" w:hanging="360"/>
+      </w:pPr>
+      <w:r>
+        <w:rPr>
+          <w:b/>
+        </w:rPr>
+        <w:t xml:space="preserve">2. </w:t>
+      </w:r>
+      <w:r>
+        <w:rPr/>
+        <w:t xml:space="preserve">Confirm the file hash against </w:t>
+      </w:r>
+      <w:r>
+        <w:rPr>
+          <w:rFonts w:ascii="Consolas" w:hAnsi="Consolas"/>
+          <w:sz w:val="18"/>
+          <w:szCs w:val="18"/>
+          <w:shd w:val="clear" w:color="auto" w:fill="F3F4F6"/>
+        </w:rPr>
+        <w:t xml:space="preserve">solutions/SHA256SUMS.txt</w:t>
+      </w:r>
+      <w:r>
+        <w:rPr/>
+        <w:t xml:space="preserve">.</w:t>
+      </w:r>
+    </w:p>
+    <w:p>
+      <w:pPr>
+        <w:pStyle w:val="Normal"/>
+        <w:spacing w:before="0" w:after="120" w:line="276" w:lineRule="auto"/>
+        <w:ind w:left="540" w:hanging="360"/>
+      </w:pPr>
+      <w:r>
+        <w:rPr>
+          <w:b/>
+        </w:rPr>
+        <w:t xml:space="preserve">3. </w:t>
+      </w:r>
+      <w:r>
+        <w:rPr/>
+        <w:t xml:space="preserve">Complete the target prerequisites in section 5.</w:t>
+      </w:r>
+    </w:p>
+    <w:p>
+      <w:pPr>
+        <w:pStyle w:val="Normal"/>
+        <w:spacing w:before="0" w:after="120" w:line="276" w:lineRule="auto"/>
+        <w:ind w:left="540" w:hanging="360"/>
+      </w:pPr>
+      <w:r>
+        <w:rPr>
+          <w:b/>
+        </w:rPr>
+        <w:t xml:space="preserve">4. </w:t>
+      </w:r>
+      <w:r>
+        <w:rPr/>
+        <w:t xml:space="preserve">Create the four target connections in section 6.</w:t>
+      </w:r>
+    </w:p>
+    <w:p>
+      <w:pPr>
+        <w:pStyle w:val="Normal"/>
+        <w:spacing w:before="0" w:after="120" w:line="276" w:lineRule="auto"/>
+        <w:ind w:left="540" w:hanging="360"/>
+      </w:pPr>
+      <w:r>
+        <w:rPr>
+          <w:b/>
+        </w:rPr>
+        <w:t xml:space="preserve">5. </w:t>
+      </w:r>
+      <w:r>
+        <w:rPr/>
+        <w:t xml:space="preserve">Import the managed ZIP and map the four connection references as described</w:t>
+      </w:r>
+    </w:p>
+    <w:p>
+      <w:pPr>
+        <w:pStyle w:val="Normal"/>
+        <w:spacing w:before="0" w:after="120" w:line="276" w:lineRule="auto"/>
+      </w:pPr>
+      <w:r>
+        <w:rPr/>
+        <w:t xml:space="preserve">in section 7.</w:t>
+      </w:r>
+    </w:p>
+    <w:p>
+      <w:pPr>
+        <w:pStyle w:val="Normal"/>
+        <w:spacing w:before="0" w:after="120" w:line="276" w:lineRule="auto"/>
+        <w:ind w:left="540" w:hanging="360"/>
+      </w:pPr>
+      <w:r>
+        <w:rPr>
+          <w:b/>
+        </w:rPr>
+        <w:t xml:space="preserve">6. </w:t>
+      </w:r>
+      <w:r>
+        <w:rPr/>
+        <w:t xml:space="preserve">Complete first-run consent and the acceptance test in sections 8 and 9.</w:t>
+      </w:r>
+    </w:p>
+    <w:p>
+      <w:pPr>
+        <w:pStyle w:val="Normal"/>
+        <w:spacing w:before="0" w:after="120" w:line="276" w:lineRule="auto"/>
+        <w:ind w:left="540" w:hanging="360"/>
+      </w:pPr>
+      <w:r>
+        <w:rPr>
+          <w:b/>
+        </w:rPr>
+        <w:t xml:space="preserve">7. </w:t>
+      </w:r>
+      <w:r>
+        <w:rPr/>
+        <w:t xml:space="preserve">Share Run access only with approved administrators.</w:t>
       </w:r>
     </w:p>
     <w:p>
@@ -977,6 +1158,29 @@
     </w:p>
     <w:p>
       <w:pPr>
+        <w:pStyle w:val="Normal"/>
+        <w:spacing w:before="0" w:after="120" w:line="276" w:lineRule="auto"/>
+      </w:pPr>
+      <w:r>
+        <w:rPr/>
+        <w:t xml:space="preserve">This section is for project maintainers. It has already been completed for the published solution packages in </w:t>
+      </w:r>
+      <w:r>
+        <w:rPr>
+          <w:rFonts w:ascii="Consolas" w:hAnsi="Consolas"/>
+          <w:sz w:val="18"/>
+          <w:szCs w:val="18"/>
+          <w:shd w:val="clear" w:color="auto" w:fill="F3F4F6"/>
+        </w:rPr>
+        <w:t xml:space="preserve">solutions/</w:t>
+      </w:r>
+      <w:r>
+        <w:rPr/>
+        <w:t xml:space="preserve">.</w:t>
+      </w:r>
+    </w:p>
+    <w:p>
+      <w:pPr>
         <w:pStyle w:val="Heading2"/>
         <w:spacing w:before="220" w:after="100" w:line="276" w:lineRule="auto"/>
       </w:pPr>
@@ -3000,512 +3204,26 @@
     </w:p>
     <w:p>
       <w:pPr>
-        <w:pStyle w:val="Heading1"/>
-        <w:spacing w:before="280" w:after="120" w:line="276" w:lineRule="auto"/>
-      </w:pPr>
-      <w:r>
-        <w:rPr/>
-        <w:t xml:space="preserve">5. Target tenant prerequisites</w:t>
-      </w:r>
-    </w:p>
-    <w:p>
-      <w:pPr>
-        <w:pStyle w:val="Normal"/>
-        <w:spacing w:before="0" w:after="120" w:line="276" w:lineRule="auto"/>
-      </w:pPr>
-      <w:r>
-        <w:rPr/>
-        <w:t xml:space="preserve">The target environment must have:</w:t>
-      </w:r>
-    </w:p>
-    <w:p>
-      <w:pPr>
-        <w:pStyle w:val="Normal"/>
-        <w:spacing w:before="0" w:after="120" w:line="276" w:lineRule="auto"/>
-        <w:ind w:left="540" w:hanging="360"/>
-      </w:pPr>
-      <w:r>
-        <w:rPr>
-          <w:b/>
-        </w:rPr>
-        <w:t xml:space="preserve">• </w:t>
-      </w:r>
-      <w:r>
-        <w:rPr/>
-        <w:t xml:space="preserve">Microsoft Dataverse</w:t>
-      </w:r>
-    </w:p>
-    <w:p>
-      <w:pPr>
-        <w:pStyle w:val="Normal"/>
-        <w:spacing w:before="0" w:after="120" w:line="276" w:lineRule="auto"/>
-        <w:ind w:left="540" w:hanging="360"/>
-      </w:pPr>
-      <w:r>
-        <w:rPr>
-          <w:b/>
-        </w:rPr>
-        <w:t xml:space="preserve">• </w:t>
-      </w:r>
-      <w:r>
-        <w:rPr/>
-        <w:t xml:space="preserve">Code Apps enabled</w:t>
-      </w:r>
-    </w:p>
-    <w:p>
-      <w:pPr>
-        <w:pStyle w:val="Normal"/>
-        <w:spacing w:before="0" w:after="120" w:line="276" w:lineRule="auto"/>
-        <w:ind w:left="540" w:hanging="360"/>
-      </w:pPr>
-      <w:r>
-        <w:rPr>
-          <w:b/>
-        </w:rPr>
-        <w:t xml:space="preserve">• </w:t>
-      </w:r>
-      <w:r>
-        <w:rPr/>
-        <w:t xml:space="preserve">Power Platform Inventory available</w:t>
-      </w:r>
-    </w:p>
-    <w:p>
-      <w:pPr>
-        <w:pStyle w:val="Normal"/>
-        <w:spacing w:before="0" w:after="120" w:line="276" w:lineRule="auto"/>
-        <w:ind w:left="540" w:hanging="360"/>
-      </w:pPr>
-      <w:r>
-        <w:rPr>
-          <w:b/>
-        </w:rPr>
-        <w:t xml:space="preserve">• </w:t>
-      </w:r>
-      <w:r>
-        <w:rPr/>
-        <w:t xml:space="preserve">All four required connectors allowed by Data Loss Prevention policy</w:t>
-      </w:r>
-    </w:p>
-    <w:p>
-      <w:pPr>
-        <w:pStyle w:val="Normal"/>
-        <w:spacing w:before="0" w:after="120" w:line="276" w:lineRule="auto"/>
-        <w:ind w:left="540" w:hanging="360"/>
-      </w:pPr>
-      <w:r>
-        <w:rPr>
-          <w:b/>
-        </w:rPr>
-        <w:t xml:space="preserve">• </w:t>
-      </w:r>
-      <w:r>
-        <w:rPr/>
-        <w:t xml:space="preserve">An appropriate Power Apps license for every operator</w:t>
-      </w:r>
-    </w:p>
-    <w:p>
-      <w:pPr>
-        <w:pStyle w:val="Normal"/>
-        <w:spacing w:before="0" w:after="120" w:line="276" w:lineRule="auto"/>
-        <w:ind w:left="540" w:hanging="360"/>
-      </w:pPr>
-      <w:r>
-        <w:rPr>
-          <w:b/>
-        </w:rPr>
-        <w:t xml:space="preserve">• </w:t>
-      </w:r>
-      <w:r>
-        <w:rPr/>
-        <w:t xml:space="preserve">Premium connector entitlement for HTTP with Microsoft Entra ID</w:t>
-      </w:r>
-    </w:p>
-    <w:p>
-      <w:pPr>
-        <w:pStyle w:val="Normal"/>
-        <w:spacing w:before="0" w:after="120" w:line="276" w:lineRule="auto"/>
-      </w:pPr>
-      <w:r>
-        <w:rPr/>
-        <w:t xml:space="preserve">(preauthorized)</w:t>
-      </w:r>
-    </w:p>
-    <w:p>
-      <w:pPr>
-        <w:pStyle w:val="Normal"/>
-        <w:spacing w:before="0" w:after="120" w:line="276" w:lineRule="auto"/>
-        <w:ind w:left="540" w:hanging="360"/>
-      </w:pPr>
-      <w:r>
-        <w:rPr>
-          <w:b/>
-        </w:rPr>
-        <w:t xml:space="preserve">• </w:t>
-      </w:r>
-      <w:r>
-        <w:rPr/>
-        <w:t xml:space="preserve">Network access to the target Power Platform, Power Apps, connector, and</w:t>
-      </w:r>
-    </w:p>
-    <w:p>
-      <w:pPr>
-        <w:pStyle w:val="Normal"/>
-        <w:spacing w:before="0" w:after="120" w:line="276" w:lineRule="auto"/>
-      </w:pPr>
-      <w:r>
-        <w:rPr/>
-        <w:t xml:space="preserve">Microsoft Entra endpoints</w:t>
-      </w:r>
-    </w:p>
-    <w:p>
-      <w:pPr>
-        <w:pStyle w:val="Heading2"/>
-        <w:spacing w:before="220" w:after="100" w:line="276" w:lineRule="auto"/>
-      </w:pPr>
-      <w:r>
-        <w:rPr/>
-        <w:t xml:space="preserve">Required administrator role</w:t>
-      </w:r>
-    </w:p>
-    <w:p>
-      <w:pPr>
-        <w:pStyle w:val="Normal"/>
-        <w:spacing w:before="0" w:after="120" w:line="276" w:lineRule="auto"/>
-      </w:pPr>
-      <w:r>
-        <w:rPr/>
-        <w:t xml:space="preserve">Operators who scan and recover flows should hold one of:</w:t>
-      </w:r>
-    </w:p>
-    <w:p>
-      <w:pPr>
-        <w:pStyle w:val="Normal"/>
-        <w:spacing w:before="0" w:after="120" w:line="276" w:lineRule="auto"/>
-        <w:ind w:left="540" w:hanging="360"/>
-      </w:pPr>
-      <w:r>
-        <w:rPr>
-          <w:b/>
-        </w:rPr>
-        <w:t xml:space="preserve">• </w:t>
-      </w:r>
-      <w:r>
-        <w:rPr/>
-        <w:t xml:space="preserve">Power Platform Administrator</w:t>
-      </w:r>
-    </w:p>
-    <w:p>
-      <w:pPr>
-        <w:pStyle w:val="Normal"/>
-        <w:spacing w:before="0" w:after="120" w:line="276" w:lineRule="auto"/>
-        <w:ind w:left="540" w:hanging="360"/>
-      </w:pPr>
-      <w:r>
-        <w:rPr>
-          <w:b/>
-        </w:rPr>
-        <w:t xml:space="preserve">• </w:t>
-      </w:r>
-      <w:r>
-        <w:rPr/>
-        <w:t xml:space="preserve">Dynamics 365 Administrator, with access to the applicable environment</w:t>
-      </w:r>
-    </w:p>
-    <w:p>
-      <w:pPr>
-        <w:pStyle w:val="Normal"/>
-        <w:spacing w:before="0" w:after="120" w:line="276" w:lineRule="auto"/>
-        <w:ind w:left="540" w:hanging="360"/>
-      </w:pPr>
-      <w:r>
-        <w:rPr>
-          <w:b/>
-        </w:rPr>
-        <w:t xml:space="preserve">• </w:t>
-      </w:r>
-      <w:r>
-        <w:rPr/>
-        <w:t xml:space="preserve">Global Administrator, where organizational policy permits</w:t>
-      </w:r>
-    </w:p>
-    <w:p>
-      <w:pPr>
-        <w:pStyle w:val="Normal"/>
-        <w:spacing w:before="0" w:after="120" w:line="276" w:lineRule="auto"/>
-      </w:pPr>
-      <w:r>
-        <w:rPr/>
-        <w:t xml:space="preserve">Do not broadly share this governance app with regular environment users. A regular user might be able to launch the app but won't have the tenant-wide admin permissions required by its connectors.</w:t>
-      </w:r>
-    </w:p>
-    <w:p>
-      <w:pPr>
-        <w:pStyle w:val="Normal"/>
-        <w:spacing w:before="0" w:after="120" w:line="276" w:lineRule="auto"/>
-      </w:pPr>
-      <w:r>
-        <w:rPr/>
-        <w:t xml:space="preserve">Use a dedicated Microsoft Entra security group for authorized governance operators whenever possible.</w:t>
-      </w:r>
-    </w:p>
-    <w:p>
-      <w:pPr>
-        <w:pStyle w:val="Heading1"/>
-        <w:spacing w:before="280" w:after="120" w:line="276" w:lineRule="auto"/>
-      </w:pPr>
-      <w:r>
-        <w:rPr/>
-        <w:t xml:space="preserve">6. Create connections in the target environment</w:t>
-      </w:r>
-    </w:p>
-    <w:p>
-      <w:pPr>
-        <w:pStyle w:val="Normal"/>
-        <w:spacing w:before="0" w:after="120" w:line="276" w:lineRule="auto"/>
-      </w:pPr>
-      <w:r>
-        <w:rPr/>
-        <w:t xml:space="preserve">Create the target connections before importing the solution. Sign in with an authorized target-tenant administrator.</w:t>
-      </w:r>
-    </w:p>
-    <w:p>
-      <w:pPr>
-        <w:pStyle w:val="Heading2"/>
-        <w:spacing w:before="220" w:after="100" w:line="276" w:lineRule="auto"/>
-      </w:pPr>
-      <w:r>
-        <w:rPr/>
-        <w:t xml:space="preserve">6.1 Power Platform for Admins</w:t>
-      </w:r>
-    </w:p>
-    <w:p>
-      <w:pPr>
-        <w:pStyle w:val="Normal"/>
-        <w:spacing w:before="0" w:after="120" w:line="276" w:lineRule="auto"/>
-        <w:ind w:left="540" w:hanging="360"/>
-      </w:pPr>
-      <w:r>
-        <w:rPr>
-          <w:b/>
-        </w:rPr>
-        <w:t xml:space="preserve">1. </w:t>
-      </w:r>
-      <w:r>
-        <w:rPr/>
-        <w:t xml:space="preserve">Go to the target maker portal.</w:t>
-      </w:r>
-    </w:p>
-    <w:p>
-      <w:pPr>
-        <w:pStyle w:val="Normal"/>
-        <w:spacing w:before="0" w:after="120" w:line="276" w:lineRule="auto"/>
-        <w:ind w:left="540" w:hanging="360"/>
-      </w:pPr>
-      <w:r>
-        <w:rPr>
-          <w:b/>
-        </w:rPr>
-        <w:t xml:space="preserve">2. </w:t>
-      </w:r>
-      <w:r>
-        <w:rPr/>
-        <w:t xml:space="preserve">Select the target environment.</w:t>
-      </w:r>
-    </w:p>
-    <w:p>
-      <w:pPr>
-        <w:pStyle w:val="Normal"/>
-        <w:spacing w:before="0" w:after="120" w:line="276" w:lineRule="auto"/>
-        <w:ind w:left="540" w:hanging="360"/>
-      </w:pPr>
-      <w:r>
-        <w:rPr>
-          <w:b/>
-        </w:rPr>
-        <w:t xml:space="preserve">3. </w:t>
-      </w:r>
-      <w:r>
-        <w:rPr/>
-        <w:t xml:space="preserve">Open </w:t>
-      </w:r>
-      <w:r>
-        <w:rPr>
-          <w:b/>
-        </w:rPr>
-        <w:t xml:space="preserve">Connections</w:t>
-      </w:r>
-      <w:r>
-        <w:rPr/>
-        <w:t xml:space="preserve">.</w:t>
-      </w:r>
-    </w:p>
-    <w:p>
-      <w:pPr>
-        <w:pStyle w:val="Normal"/>
-        <w:spacing w:before="0" w:after="120" w:line="276" w:lineRule="auto"/>
-        <w:ind w:left="540" w:hanging="360"/>
-      </w:pPr>
-      <w:r>
-        <w:rPr>
-          <w:b/>
-        </w:rPr>
-        <w:t xml:space="preserve">4. </w:t>
-      </w:r>
-      <w:r>
-        <w:rPr/>
-        <w:t xml:space="preserve">Select </w:t>
-      </w:r>
-      <w:r>
-        <w:rPr>
-          <w:b/>
-        </w:rPr>
-        <w:t xml:space="preserve">New connection</w:t>
-      </w:r>
-      <w:r>
-        <w:rPr/>
-        <w:t xml:space="preserve">.</w:t>
-      </w:r>
-    </w:p>
-    <w:p>
-      <w:pPr>
-        <w:pStyle w:val="Normal"/>
-        <w:spacing w:before="0" w:after="120" w:line="276" w:lineRule="auto"/>
-        <w:ind w:left="540" w:hanging="360"/>
-      </w:pPr>
-      <w:r>
-        <w:rPr>
-          <w:b/>
-        </w:rPr>
-        <w:t xml:space="preserve">5. </w:t>
-      </w:r>
-      <w:r>
-        <w:rPr/>
-        <w:t xml:space="preserve">Create </w:t>
-      </w:r>
-      <w:r>
-        <w:rPr>
-          <w:b/>
-        </w:rPr>
-        <w:t xml:space="preserve">Power Platform for Admins</w:t>
-      </w:r>
-      <w:r>
-        <w:rPr/>
-        <w:t xml:space="preserve">.</w:t>
-      </w:r>
-    </w:p>
-    <w:p>
-      <w:pPr>
-        <w:pStyle w:val="Normal"/>
-        <w:spacing w:before="0" w:after="120" w:line="276" w:lineRule="auto"/>
-        <w:ind w:left="540" w:hanging="360"/>
-      </w:pPr>
-      <w:r>
-        <w:rPr>
-          <w:b/>
-        </w:rPr>
-        <w:t xml:space="preserve">6. </w:t>
-      </w:r>
-      <w:r>
-        <w:rPr/>
-        <w:t xml:space="preserve">Confirm the connection shows </w:t>
-      </w:r>
-      <w:r>
-        <w:rPr>
-          <w:b/>
-        </w:rPr>
-        <w:t xml:space="preserve">Connected</w:t>
-      </w:r>
-      <w:r>
-        <w:rPr/>
-        <w:t xml:space="preserve">.</w:t>
-      </w:r>
-    </w:p>
-    <w:p>
-      <w:pPr>
-        <w:pStyle w:val="Heading2"/>
-        <w:spacing w:before="220" w:after="100" w:line="276" w:lineRule="auto"/>
-      </w:pPr>
-      <w:r>
-        <w:rPr/>
-        <w:t xml:space="preserve">6.2 HTTP with Microsoft Entra ID (preauthorized)</w:t>
-      </w:r>
-    </w:p>
-    <w:p>
-      <w:pPr>
-        <w:pStyle w:val="Normal"/>
-        <w:spacing w:before="0" w:after="120" w:line="276" w:lineRule="auto"/>
-        <w:ind w:left="540" w:hanging="360"/>
-      </w:pPr>
-      <w:r>
-        <w:rPr>
-          <w:b/>
-        </w:rPr>
-        <w:t xml:space="preserve">1. </w:t>
-      </w:r>
-      <w:r>
-        <w:rPr/>
-        <w:t xml:space="preserve">Create </w:t>
-      </w:r>
-      <w:r>
-        <w:rPr>
-          <w:b/>
-        </w:rPr>
-        <w:t xml:space="preserve">HTTP with Microsoft Entra ID (preauthorized)</w:t>
-      </w:r>
-      <w:r>
-        <w:rPr/>
-        <w:t xml:space="preserve">.</w:t>
-      </w:r>
-    </w:p>
-    <w:p>
-      <w:pPr>
-        <w:pStyle w:val="Normal"/>
-        <w:spacing w:before="0" w:after="120" w:line="276" w:lineRule="auto"/>
-        <w:ind w:left="540" w:hanging="360"/>
-      </w:pPr>
-      <w:r>
-        <w:rPr>
-          <w:b/>
-        </w:rPr>
-        <w:t xml:space="preserve">2. </w:t>
-      </w:r>
-      <w:r>
-        <w:rPr/>
-        <w:t xml:space="preserve">Select </w:t>
-      </w:r>
-      <w:r>
-        <w:rPr>
-          <w:b/>
-        </w:rPr>
-        <w:t xml:space="preserve">Log in with Microsoft Entra ID</w:t>
-      </w:r>
-      <w:r>
-        <w:rPr/>
-        <w:t xml:space="preserve">.</w:t>
-      </w:r>
-    </w:p>
-    <w:p>
-      <w:pPr>
-        <w:pStyle w:val="Normal"/>
-        <w:spacing w:before="0" w:after="120" w:line="276" w:lineRule="auto"/>
-        <w:ind w:left="540" w:hanging="360"/>
-      </w:pPr>
-      <w:r>
-        <w:rPr>
-          <w:b/>
-        </w:rPr>
-        <w:t xml:space="preserve">3. </w:t>
-      </w:r>
-      <w:r>
-        <w:rPr/>
-        <w:t xml:space="preserve">For GCC, set both connection fields to:</w:t>
-      </w:r>
-    </w:p>
-    <w:p>
-      <w:pPr>
-        <w:pStyle w:val="Normal"/>
-        <w:spacing w:before="0" w:after="120" w:line="276" w:lineRule="auto"/>
-      </w:pPr>
+        <w:pStyle w:val="Normal"/>
+        <w:spacing w:before="0" w:after="120" w:line="276" w:lineRule="auto"/>
+      </w:pPr>
+      <w:r>
+        <w:rPr/>
+        <w:t xml:space="preserve">The repository's official release artifacts are:</w:t>
+      </w:r>
+    </w:p>
+    <w:p>
+      <w:pPr>
+        <w:pStyle w:val="Normal"/>
+        <w:spacing w:before="0" w:after="120" w:line="276" w:lineRule="auto"/>
+        <w:ind w:left="540" w:hanging="360"/>
+      </w:pPr>
+      <w:r>
+        <w:rPr>
+          <w:b/>
+        </w:rPr>
+        <w:t xml:space="preserve">• </w:t>
+      </w:r>
       <w:r>
         <w:rPr>
           <w:rFonts w:ascii="Consolas" w:hAnsi="Consolas"/>
@@ -3513,61 +3231,210 @@
           <w:szCs w:val="18"/>
           <w:shd w:val="clear" w:color="auto" w:fill="F3F4F6"/>
         </w:rPr>
-        <w:t xml:space="preserve">https://api.gov.powerplatform.microsoft.us</w:t>
-      </w:r>
-    </w:p>
-    <w:p>
-      <w:pPr>
-        <w:pStyle w:val="Normal"/>
-        <w:spacing w:before="0" w:after="120" w:line="276" w:lineRule="auto"/>
-        <w:ind w:left="540" w:hanging="360"/>
-      </w:pPr>
-      <w:r>
-        <w:rPr>
-          <w:b/>
-        </w:rPr>
-        <w:t xml:space="preserve">4. </w:t>
-      </w:r>
-      <w:r>
-        <w:rPr/>
-        <w:t xml:space="preserve">Complete sign-in.</w:t>
-      </w:r>
-    </w:p>
-    <w:p>
-      <w:pPr>
-        <w:pStyle w:val="Normal"/>
-        <w:spacing w:before="0" w:after="120" w:line="276" w:lineRule="auto"/>
-        <w:ind w:left="540" w:hanging="360"/>
-      </w:pPr>
-      <w:r>
-        <w:rPr>
-          <w:b/>
-        </w:rPr>
-        <w:t xml:space="preserve">5. </w:t>
-      </w:r>
-      <w:r>
-        <w:rPr/>
-        <w:t xml:space="preserve">Confirm the connection shows </w:t>
-      </w:r>
-      <w:r>
-        <w:rPr>
-          <w:b/>
-        </w:rPr>
-        <w:t xml:space="preserve">Connected</w:t>
-      </w:r>
-      <w:r>
-        <w:rPr/>
-        <w:t xml:space="preserve">.</w:t>
-      </w:r>
-    </w:p>
-    <w:p>
-      <w:pPr>
-        <w:pStyle w:val="Normal"/>
-        <w:spacing w:before="0" w:after="120" w:line="276" w:lineRule="auto"/>
-      </w:pPr>
-      <w:r>
-        <w:rPr/>
-        <w:t xml:space="preserve">This is a Premium connector. If creation fails, confirm licensing, DLP policy, the exact GCC endpoint, and administrator permissions.</w:t>
+        <w:t xml:space="preserve">solutions/OrphanedFlowFinder_1_0_0_0_managed.zip</w:t>
+      </w:r>
+    </w:p>
+    <w:p>
+      <w:pPr>
+        <w:pStyle w:val="Normal"/>
+        <w:spacing w:before="0" w:after="120" w:line="276" w:lineRule="auto"/>
+        <w:ind w:left="540" w:hanging="360"/>
+      </w:pPr>
+      <w:r>
+        <w:rPr>
+          <w:b/>
+        </w:rPr>
+        <w:t xml:space="preserve">• </w:t>
+      </w:r>
+      <w:r>
+        <w:rPr>
+          <w:rFonts w:ascii="Consolas" w:hAnsi="Consolas"/>
+          <w:sz w:val="18"/>
+          <w:szCs w:val="18"/>
+          <w:shd w:val="clear" w:color="auto" w:fill="F3F4F6"/>
+        </w:rPr>
+        <w:t xml:space="preserve">solutions/OrphanedFlowFinder_1_0_0_0_unmanaged.zip</w:t>
+      </w:r>
+    </w:p>
+    <w:p>
+      <w:pPr>
+        <w:pStyle w:val="Normal"/>
+        <w:spacing w:before="0" w:after="120" w:line="276" w:lineRule="auto"/>
+        <w:ind w:left="540" w:hanging="360"/>
+      </w:pPr>
+      <w:r>
+        <w:rPr>
+          <w:b/>
+        </w:rPr>
+        <w:t xml:space="preserve">• </w:t>
+      </w:r>
+      <w:r>
+        <w:rPr>
+          <w:rFonts w:ascii="Consolas" w:hAnsi="Consolas"/>
+          <w:sz w:val="18"/>
+          <w:szCs w:val="18"/>
+          <w:shd w:val="clear" w:color="auto" w:fill="F3F4F6"/>
+        </w:rPr>
+        <w:t xml:space="preserve">solutions/SHA256SUMS.txt</w:t>
+      </w:r>
+    </w:p>
+    <w:p>
+      <w:pPr>
+        <w:pStyle w:val="Heading1"/>
+        <w:spacing w:before="280" w:after="120" w:line="276" w:lineRule="auto"/>
+      </w:pPr>
+      <w:r>
+        <w:rPr/>
+        <w:t xml:space="preserve">5. Target tenant prerequisites</w:t>
+      </w:r>
+    </w:p>
+    <w:p>
+      <w:pPr>
+        <w:pStyle w:val="Normal"/>
+        <w:spacing w:before="0" w:after="120" w:line="276" w:lineRule="auto"/>
+      </w:pPr>
+      <w:r>
+        <w:rPr/>
+        <w:t xml:space="preserve">The target environment must have:</w:t>
+      </w:r>
+    </w:p>
+    <w:p>
+      <w:pPr>
+        <w:pStyle w:val="Normal"/>
+        <w:spacing w:before="0" w:after="120" w:line="276" w:lineRule="auto"/>
+        <w:ind w:left="540" w:hanging="360"/>
+      </w:pPr>
+      <w:r>
+        <w:rPr>
+          <w:b/>
+        </w:rPr>
+        <w:t xml:space="preserve">• </w:t>
+      </w:r>
+      <w:r>
+        <w:rPr/>
+        <w:t xml:space="preserve">Microsoft Dataverse</w:t>
+      </w:r>
+    </w:p>
+    <w:p>
+      <w:pPr>
+        <w:pStyle w:val="Normal"/>
+        <w:spacing w:before="0" w:after="120" w:line="276" w:lineRule="auto"/>
+        <w:ind w:left="540" w:hanging="360"/>
+      </w:pPr>
+      <w:r>
+        <w:rPr>
+          <w:b/>
+        </w:rPr>
+        <w:t xml:space="preserve">• </w:t>
+      </w:r>
+      <w:r>
+        <w:rPr/>
+        <w:t xml:space="preserve">Code Apps enabled</w:t>
+      </w:r>
+    </w:p>
+    <w:p>
+      <w:pPr>
+        <w:pStyle w:val="Normal"/>
+        <w:spacing w:before="0" w:after="120" w:line="276" w:lineRule="auto"/>
+        <w:ind w:left="540" w:hanging="360"/>
+      </w:pPr>
+      <w:r>
+        <w:rPr>
+          <w:b/>
+        </w:rPr>
+        <w:t xml:space="preserve">• </w:t>
+      </w:r>
+      <w:r>
+        <w:rPr/>
+        <w:t xml:space="preserve">Power Platform Inventory available</w:t>
+      </w:r>
+    </w:p>
+    <w:p>
+      <w:pPr>
+        <w:pStyle w:val="Normal"/>
+        <w:spacing w:before="0" w:after="120" w:line="276" w:lineRule="auto"/>
+        <w:ind w:left="540" w:hanging="360"/>
+      </w:pPr>
+      <w:r>
+        <w:rPr>
+          <w:b/>
+        </w:rPr>
+        <w:t xml:space="preserve">• </w:t>
+      </w:r>
+      <w:r>
+        <w:rPr/>
+        <w:t xml:space="preserve">All four required connectors allowed by Data Loss Prevention policy</w:t>
+      </w:r>
+    </w:p>
+    <w:p>
+      <w:pPr>
+        <w:pStyle w:val="Normal"/>
+        <w:spacing w:before="0" w:after="120" w:line="276" w:lineRule="auto"/>
+        <w:ind w:left="540" w:hanging="360"/>
+      </w:pPr>
+      <w:r>
+        <w:rPr>
+          <w:b/>
+        </w:rPr>
+        <w:t xml:space="preserve">• </w:t>
+      </w:r>
+      <w:r>
+        <w:rPr/>
+        <w:t xml:space="preserve">An appropriate Power Apps license for every operator</w:t>
+      </w:r>
+    </w:p>
+    <w:p>
+      <w:pPr>
+        <w:pStyle w:val="Normal"/>
+        <w:spacing w:before="0" w:after="120" w:line="276" w:lineRule="auto"/>
+        <w:ind w:left="540" w:hanging="360"/>
+      </w:pPr>
+      <w:r>
+        <w:rPr>
+          <w:b/>
+        </w:rPr>
+        <w:t xml:space="preserve">• </w:t>
+      </w:r>
+      <w:r>
+        <w:rPr/>
+        <w:t xml:space="preserve">Premium connector entitlement for HTTP with Microsoft Entra ID</w:t>
+      </w:r>
+    </w:p>
+    <w:p>
+      <w:pPr>
+        <w:pStyle w:val="Normal"/>
+        <w:spacing w:before="0" w:after="120" w:line="276" w:lineRule="auto"/>
+      </w:pPr>
+      <w:r>
+        <w:rPr/>
+        <w:t xml:space="preserve">(preauthorized)</w:t>
+      </w:r>
+    </w:p>
+    <w:p>
+      <w:pPr>
+        <w:pStyle w:val="Normal"/>
+        <w:spacing w:before="0" w:after="120" w:line="276" w:lineRule="auto"/>
+        <w:ind w:left="540" w:hanging="360"/>
+      </w:pPr>
+      <w:r>
+        <w:rPr>
+          <w:b/>
+        </w:rPr>
+        <w:t xml:space="preserve">• </w:t>
+      </w:r>
+      <w:r>
+        <w:rPr/>
+        <w:t xml:space="preserve">Network access to the target Power Platform, Power Apps, connector, and</w:t>
+      </w:r>
+    </w:p>
+    <w:p>
+      <w:pPr>
+        <w:pStyle w:val="Normal"/>
+        <w:spacing w:before="0" w:after="120" w:line="276" w:lineRule="auto"/>
+      </w:pPr>
+      <w:r>
+        <w:rPr/>
+        <w:t xml:space="preserve">Microsoft Entra endpoints</w:t>
       </w:r>
     </w:p>
     <w:p>
@@ -3577,78 +3444,108 @@
       </w:pPr>
       <w:r>
         <w:rPr/>
-        <w:t xml:space="preserve">6.3 Office 365 Users</w:t>
-      </w:r>
-    </w:p>
-    <w:p>
-      <w:pPr>
-        <w:pStyle w:val="Normal"/>
-        <w:spacing w:before="0" w:after="120" w:line="276" w:lineRule="auto"/>
-        <w:ind w:left="540" w:hanging="360"/>
-      </w:pPr>
-      <w:r>
-        <w:rPr>
-          <w:b/>
-        </w:rPr>
-        <w:t xml:space="preserve">1. </w:t>
-      </w:r>
-      <w:r>
-        <w:rPr/>
-        <w:t xml:space="preserve">Create </w:t>
-      </w:r>
-      <w:r>
-        <w:rPr>
-          <w:b/>
-        </w:rPr>
-        <w:t xml:space="preserve">Office 365 Users</w:t>
-      </w:r>
-      <w:r>
-        <w:rPr/>
-        <w:t xml:space="preserve">.</w:t>
-      </w:r>
-    </w:p>
-    <w:p>
-      <w:pPr>
-        <w:pStyle w:val="Normal"/>
-        <w:spacing w:before="0" w:after="120" w:line="276" w:lineRule="auto"/>
-        <w:ind w:left="540" w:hanging="360"/>
-      </w:pPr>
-      <w:r>
-        <w:rPr>
-          <w:b/>
-        </w:rPr>
-        <w:t xml:space="preserve">2. </w:t>
-      </w:r>
-      <w:r>
-        <w:rPr/>
-        <w:t xml:space="preserve">Sign in with the target-tenant administrator.</w:t>
-      </w:r>
-    </w:p>
-    <w:p>
-      <w:pPr>
-        <w:pStyle w:val="Normal"/>
-        <w:spacing w:before="0" w:after="120" w:line="276" w:lineRule="auto"/>
-        <w:ind w:left="540" w:hanging="360"/>
-      </w:pPr>
-      <w:r>
-        <w:rPr>
-          <w:b/>
-        </w:rPr>
-        <w:t xml:space="preserve">3. </w:t>
-      </w:r>
-      <w:r>
-        <w:rPr/>
-        <w:t xml:space="preserve">Confirm the connection shows </w:t>
-      </w:r>
-      <w:r>
-        <w:rPr>
-          <w:b/>
-        </w:rPr>
-        <w:t xml:space="preserve">Connected</w:t>
-      </w:r>
-      <w:r>
-        <w:rPr/>
-        <w:t xml:space="preserve">.</w:t>
+        <w:t xml:space="preserve">Required administrator role</w:t>
+      </w:r>
+    </w:p>
+    <w:p>
+      <w:pPr>
+        <w:pStyle w:val="Normal"/>
+        <w:spacing w:before="0" w:after="120" w:line="276" w:lineRule="auto"/>
+      </w:pPr>
+      <w:r>
+        <w:rPr/>
+        <w:t xml:space="preserve">Operators who scan and recover flows should hold one of:</w:t>
+      </w:r>
+    </w:p>
+    <w:p>
+      <w:pPr>
+        <w:pStyle w:val="Normal"/>
+        <w:spacing w:before="0" w:after="120" w:line="276" w:lineRule="auto"/>
+        <w:ind w:left="540" w:hanging="360"/>
+      </w:pPr>
+      <w:r>
+        <w:rPr>
+          <w:b/>
+        </w:rPr>
+        <w:t xml:space="preserve">• </w:t>
+      </w:r>
+      <w:r>
+        <w:rPr/>
+        <w:t xml:space="preserve">Power Platform Administrator</w:t>
+      </w:r>
+    </w:p>
+    <w:p>
+      <w:pPr>
+        <w:pStyle w:val="Normal"/>
+        <w:spacing w:before="0" w:after="120" w:line="276" w:lineRule="auto"/>
+        <w:ind w:left="540" w:hanging="360"/>
+      </w:pPr>
+      <w:r>
+        <w:rPr>
+          <w:b/>
+        </w:rPr>
+        <w:t xml:space="preserve">• </w:t>
+      </w:r>
+      <w:r>
+        <w:rPr/>
+        <w:t xml:space="preserve">Dynamics 365 Administrator, with access to the applicable environment</w:t>
+      </w:r>
+    </w:p>
+    <w:p>
+      <w:pPr>
+        <w:pStyle w:val="Normal"/>
+        <w:spacing w:before="0" w:after="120" w:line="276" w:lineRule="auto"/>
+        <w:ind w:left="540" w:hanging="360"/>
+      </w:pPr>
+      <w:r>
+        <w:rPr>
+          <w:b/>
+        </w:rPr>
+        <w:t xml:space="preserve">• </w:t>
+      </w:r>
+      <w:r>
+        <w:rPr/>
+        <w:t xml:space="preserve">Global Administrator, where organizational policy permits</w:t>
+      </w:r>
+    </w:p>
+    <w:p>
+      <w:pPr>
+        <w:pStyle w:val="Normal"/>
+        <w:spacing w:before="0" w:after="120" w:line="276" w:lineRule="auto"/>
+      </w:pPr>
+      <w:r>
+        <w:rPr/>
+        <w:t xml:space="preserve">Do not broadly share this governance app with regular environment users. A regular user might be able to launch the app but won't have the tenant-wide admin permissions required by its connectors.</w:t>
+      </w:r>
+    </w:p>
+    <w:p>
+      <w:pPr>
+        <w:pStyle w:val="Normal"/>
+        <w:spacing w:before="0" w:after="120" w:line="276" w:lineRule="auto"/>
+      </w:pPr>
+      <w:r>
+        <w:rPr/>
+        <w:t xml:space="preserve">Use a dedicated Microsoft Entra security group for authorized governance operators whenever possible.</w:t>
+      </w:r>
+    </w:p>
+    <w:p>
+      <w:pPr>
+        <w:pStyle w:val="Heading1"/>
+        <w:spacing w:before="280" w:after="120" w:line="276" w:lineRule="auto"/>
+      </w:pPr>
+      <w:r>
+        <w:rPr/>
+        <w:t xml:space="preserve">6. Create connections in the target environment</w:t>
+      </w:r>
+    </w:p>
+    <w:p>
+      <w:pPr>
+        <w:pStyle w:val="Normal"/>
+        <w:spacing w:before="0" w:after="120" w:line="276" w:lineRule="auto"/>
+      </w:pPr>
+      <w:r>
+        <w:rPr/>
+        <w:t xml:space="preserve">Create the target connections before importing the solution. Sign in with an authorized target-tenant administrator.</w:t>
       </w:r>
     </w:p>
     <w:p>
@@ -3658,6 +3555,389 @@
       </w:pPr>
       <w:r>
         <w:rPr/>
+        <w:t xml:space="preserve">6.1 Power Platform for Admins</w:t>
+      </w:r>
+    </w:p>
+    <w:p>
+      <w:pPr>
+        <w:pStyle w:val="Normal"/>
+        <w:spacing w:before="0" w:after="120" w:line="276" w:lineRule="auto"/>
+        <w:ind w:left="540" w:hanging="360"/>
+      </w:pPr>
+      <w:r>
+        <w:rPr>
+          <w:b/>
+        </w:rPr>
+        <w:t xml:space="preserve">1. </w:t>
+      </w:r>
+      <w:r>
+        <w:rPr/>
+        <w:t xml:space="preserve">Go to the target maker portal.</w:t>
+      </w:r>
+    </w:p>
+    <w:p>
+      <w:pPr>
+        <w:pStyle w:val="Normal"/>
+        <w:spacing w:before="0" w:after="120" w:line="276" w:lineRule="auto"/>
+        <w:ind w:left="540" w:hanging="360"/>
+      </w:pPr>
+      <w:r>
+        <w:rPr>
+          <w:b/>
+        </w:rPr>
+        <w:t xml:space="preserve">2. </w:t>
+      </w:r>
+      <w:r>
+        <w:rPr/>
+        <w:t xml:space="preserve">Select the target environment.</w:t>
+      </w:r>
+    </w:p>
+    <w:p>
+      <w:pPr>
+        <w:pStyle w:val="Normal"/>
+        <w:spacing w:before="0" w:after="120" w:line="276" w:lineRule="auto"/>
+        <w:ind w:left="540" w:hanging="360"/>
+      </w:pPr>
+      <w:r>
+        <w:rPr>
+          <w:b/>
+        </w:rPr>
+        <w:t xml:space="preserve">3. </w:t>
+      </w:r>
+      <w:r>
+        <w:rPr/>
+        <w:t xml:space="preserve">Open </w:t>
+      </w:r>
+      <w:r>
+        <w:rPr>
+          <w:b/>
+        </w:rPr>
+        <w:t xml:space="preserve">Connections</w:t>
+      </w:r>
+      <w:r>
+        <w:rPr/>
+        <w:t xml:space="preserve">.</w:t>
+      </w:r>
+    </w:p>
+    <w:p>
+      <w:pPr>
+        <w:pStyle w:val="Normal"/>
+        <w:spacing w:before="0" w:after="120" w:line="276" w:lineRule="auto"/>
+        <w:ind w:left="540" w:hanging="360"/>
+      </w:pPr>
+      <w:r>
+        <w:rPr>
+          <w:b/>
+        </w:rPr>
+        <w:t xml:space="preserve">4. </w:t>
+      </w:r>
+      <w:r>
+        <w:rPr/>
+        <w:t xml:space="preserve">Select </w:t>
+      </w:r>
+      <w:r>
+        <w:rPr>
+          <w:b/>
+        </w:rPr>
+        <w:t xml:space="preserve">New connection</w:t>
+      </w:r>
+      <w:r>
+        <w:rPr/>
+        <w:t xml:space="preserve">.</w:t>
+      </w:r>
+    </w:p>
+    <w:p>
+      <w:pPr>
+        <w:pStyle w:val="Normal"/>
+        <w:spacing w:before="0" w:after="120" w:line="276" w:lineRule="auto"/>
+        <w:ind w:left="540" w:hanging="360"/>
+      </w:pPr>
+      <w:r>
+        <w:rPr>
+          <w:b/>
+        </w:rPr>
+        <w:t xml:space="preserve">5. </w:t>
+      </w:r>
+      <w:r>
+        <w:rPr/>
+        <w:t xml:space="preserve">Create </w:t>
+      </w:r>
+      <w:r>
+        <w:rPr>
+          <w:b/>
+        </w:rPr>
+        <w:t xml:space="preserve">Power Platform for Admins</w:t>
+      </w:r>
+      <w:r>
+        <w:rPr/>
+        <w:t xml:space="preserve">.</w:t>
+      </w:r>
+    </w:p>
+    <w:p>
+      <w:pPr>
+        <w:pStyle w:val="Normal"/>
+        <w:spacing w:before="0" w:after="120" w:line="276" w:lineRule="auto"/>
+        <w:ind w:left="540" w:hanging="360"/>
+      </w:pPr>
+      <w:r>
+        <w:rPr>
+          <w:b/>
+        </w:rPr>
+        <w:t xml:space="preserve">6. </w:t>
+      </w:r>
+      <w:r>
+        <w:rPr/>
+        <w:t xml:space="preserve">Confirm the connection shows </w:t>
+      </w:r>
+      <w:r>
+        <w:rPr>
+          <w:b/>
+        </w:rPr>
+        <w:t xml:space="preserve">Connected</w:t>
+      </w:r>
+      <w:r>
+        <w:rPr/>
+        <w:t xml:space="preserve">.</w:t>
+      </w:r>
+    </w:p>
+    <w:p>
+      <w:pPr>
+        <w:pStyle w:val="Heading2"/>
+        <w:spacing w:before="220" w:after="100" w:line="276" w:lineRule="auto"/>
+      </w:pPr>
+      <w:r>
+        <w:rPr/>
+        <w:t xml:space="preserve">6.2 HTTP with Microsoft Entra ID (preauthorized)</w:t>
+      </w:r>
+    </w:p>
+    <w:p>
+      <w:pPr>
+        <w:pStyle w:val="Normal"/>
+        <w:spacing w:before="0" w:after="120" w:line="276" w:lineRule="auto"/>
+        <w:ind w:left="540" w:hanging="360"/>
+      </w:pPr>
+      <w:r>
+        <w:rPr>
+          <w:b/>
+        </w:rPr>
+        <w:t xml:space="preserve">1. </w:t>
+      </w:r>
+      <w:r>
+        <w:rPr/>
+        <w:t xml:space="preserve">Create </w:t>
+      </w:r>
+      <w:r>
+        <w:rPr>
+          <w:b/>
+        </w:rPr>
+        <w:t xml:space="preserve">HTTP with Microsoft Entra ID (preauthorized)</w:t>
+      </w:r>
+      <w:r>
+        <w:rPr/>
+        <w:t xml:space="preserve">.</w:t>
+      </w:r>
+    </w:p>
+    <w:p>
+      <w:pPr>
+        <w:pStyle w:val="Normal"/>
+        <w:spacing w:before="0" w:after="120" w:line="276" w:lineRule="auto"/>
+        <w:ind w:left="540" w:hanging="360"/>
+      </w:pPr>
+      <w:r>
+        <w:rPr>
+          <w:b/>
+        </w:rPr>
+        <w:t xml:space="preserve">2. </w:t>
+      </w:r>
+      <w:r>
+        <w:rPr/>
+        <w:t xml:space="preserve">Select </w:t>
+      </w:r>
+      <w:r>
+        <w:rPr>
+          <w:b/>
+        </w:rPr>
+        <w:t xml:space="preserve">Log in with Microsoft Entra ID</w:t>
+      </w:r>
+      <w:r>
+        <w:rPr/>
+        <w:t xml:space="preserve">.</w:t>
+      </w:r>
+    </w:p>
+    <w:p>
+      <w:pPr>
+        <w:pStyle w:val="Normal"/>
+        <w:spacing w:before="0" w:after="120" w:line="276" w:lineRule="auto"/>
+        <w:ind w:left="540" w:hanging="360"/>
+      </w:pPr>
+      <w:r>
+        <w:rPr>
+          <w:b/>
+        </w:rPr>
+        <w:t xml:space="preserve">3. </w:t>
+      </w:r>
+      <w:r>
+        <w:rPr/>
+        <w:t xml:space="preserve">For GCC, set both connection fields to:</w:t>
+      </w:r>
+    </w:p>
+    <w:p>
+      <w:pPr>
+        <w:pStyle w:val="Normal"/>
+        <w:spacing w:before="0" w:after="120" w:line="276" w:lineRule="auto"/>
+      </w:pPr>
+      <w:r>
+        <w:rPr>
+          <w:rFonts w:ascii="Consolas" w:hAnsi="Consolas"/>
+          <w:sz w:val="18"/>
+          <w:szCs w:val="18"/>
+          <w:shd w:val="clear" w:color="auto" w:fill="F3F4F6"/>
+        </w:rPr>
+        <w:t xml:space="preserve">https://api.gov.powerplatform.microsoft.us</w:t>
+      </w:r>
+    </w:p>
+    <w:p>
+      <w:pPr>
+        <w:pStyle w:val="Normal"/>
+        <w:spacing w:before="0" w:after="120" w:line="276" w:lineRule="auto"/>
+        <w:ind w:left="540" w:hanging="360"/>
+      </w:pPr>
+      <w:r>
+        <w:rPr>
+          <w:b/>
+        </w:rPr>
+        <w:t xml:space="preserve">4. </w:t>
+      </w:r>
+      <w:r>
+        <w:rPr/>
+        <w:t xml:space="preserve">Complete sign-in.</w:t>
+      </w:r>
+    </w:p>
+    <w:p>
+      <w:pPr>
+        <w:pStyle w:val="Normal"/>
+        <w:spacing w:before="0" w:after="120" w:line="276" w:lineRule="auto"/>
+        <w:ind w:left="540" w:hanging="360"/>
+      </w:pPr>
+      <w:r>
+        <w:rPr>
+          <w:b/>
+        </w:rPr>
+        <w:t xml:space="preserve">5. </w:t>
+      </w:r>
+      <w:r>
+        <w:rPr/>
+        <w:t xml:space="preserve">Confirm the connection shows </w:t>
+      </w:r>
+      <w:r>
+        <w:rPr>
+          <w:b/>
+        </w:rPr>
+        <w:t xml:space="preserve">Connected</w:t>
+      </w:r>
+      <w:r>
+        <w:rPr/>
+        <w:t xml:space="preserve">.</w:t>
+      </w:r>
+    </w:p>
+    <w:p>
+      <w:pPr>
+        <w:pStyle w:val="Normal"/>
+        <w:spacing w:before="0" w:after="120" w:line="276" w:lineRule="auto"/>
+      </w:pPr>
+      <w:r>
+        <w:rPr/>
+        <w:t xml:space="preserve">This is a Premium connector. If creation fails, confirm licensing, DLP policy, the exact GCC endpoint, and administrator permissions.</w:t>
+      </w:r>
+    </w:p>
+    <w:p>
+      <w:pPr>
+        <w:pStyle w:val="Heading2"/>
+        <w:spacing w:before="220" w:after="100" w:line="276" w:lineRule="auto"/>
+      </w:pPr>
+      <w:r>
+        <w:rPr/>
+        <w:t xml:space="preserve">6.3 Office 365 Users</w:t>
+      </w:r>
+    </w:p>
+    <w:p>
+      <w:pPr>
+        <w:pStyle w:val="Normal"/>
+        <w:spacing w:before="0" w:after="120" w:line="276" w:lineRule="auto"/>
+        <w:ind w:left="540" w:hanging="360"/>
+      </w:pPr>
+      <w:r>
+        <w:rPr>
+          <w:b/>
+        </w:rPr>
+        <w:t xml:space="preserve">1. </w:t>
+      </w:r>
+      <w:r>
+        <w:rPr/>
+        <w:t xml:space="preserve">Create </w:t>
+      </w:r>
+      <w:r>
+        <w:rPr>
+          <w:b/>
+        </w:rPr>
+        <w:t xml:space="preserve">Office 365 Users</w:t>
+      </w:r>
+      <w:r>
+        <w:rPr/>
+        <w:t xml:space="preserve">.</w:t>
+      </w:r>
+    </w:p>
+    <w:p>
+      <w:pPr>
+        <w:pStyle w:val="Normal"/>
+        <w:spacing w:before="0" w:after="120" w:line="276" w:lineRule="auto"/>
+        <w:ind w:left="540" w:hanging="360"/>
+      </w:pPr>
+      <w:r>
+        <w:rPr>
+          <w:b/>
+        </w:rPr>
+        <w:t xml:space="preserve">2. </w:t>
+      </w:r>
+      <w:r>
+        <w:rPr/>
+        <w:t xml:space="preserve">Sign in with the target-tenant administrator.</w:t>
+      </w:r>
+    </w:p>
+    <w:p>
+      <w:pPr>
+        <w:pStyle w:val="Normal"/>
+        <w:spacing w:before="0" w:after="120" w:line="276" w:lineRule="auto"/>
+        <w:ind w:left="540" w:hanging="360"/>
+      </w:pPr>
+      <w:r>
+        <w:rPr>
+          <w:b/>
+        </w:rPr>
+        <w:t xml:space="preserve">3. </w:t>
+      </w:r>
+      <w:r>
+        <w:rPr/>
+        <w:t xml:space="preserve">Confirm the connection shows </w:t>
+      </w:r>
+      <w:r>
+        <w:rPr>
+          <w:b/>
+        </w:rPr>
+        <w:t xml:space="preserve">Connected</w:t>
+      </w:r>
+      <w:r>
+        <w:rPr/>
+        <w:t xml:space="preserve">.</w:t>
+      </w:r>
+    </w:p>
+    <w:p>
+      <w:pPr>
+        <w:pStyle w:val="Heading2"/>
+        <w:spacing w:before="220" w:after="100" w:line="276" w:lineRule="auto"/>
+      </w:pPr>
+      <w:r>
+        <w:rPr/>
         <w:t xml:space="preserve">6.4 Power Automate Management</w:t>
       </w:r>
     </w:p>
@@ -3861,7 +4141,30 @@
       </w:r>
       <w:r>
         <w:rPr/>
-        <w:t xml:space="preserve">Upload the exported ZIP.</w:t>
+        <w:t xml:space="preserve">Upload </w:t>
+      </w:r>
+      <w:r>
+        <w:rPr>
+          <w:rFonts w:ascii="Consolas" w:hAnsi="Consolas"/>
+          <w:sz w:val="18"/>
+          <w:szCs w:val="18"/>
+          <w:shd w:val="clear" w:color="auto" w:fill="F3F4F6"/>
+        </w:rPr>
+        <w:t xml:space="preserve">OrphanedFlowFinder_1_0_0_0_managed.zip</w:t>
+      </w:r>
+      <w:r>
+        <w:rPr/>
+        <w:t xml:space="preserve"> for the standard</w:t>
+      </w:r>
+    </w:p>
+    <w:p>
+      <w:pPr>
+        <w:pStyle w:val="Normal"/>
+        <w:spacing w:before="0" w:after="120" w:line="276" w:lineRule="auto"/>
+      </w:pPr>
+      <w:r>
+        <w:rPr/>
+        <w:t xml:space="preserve">installation, or the unmanaged ZIP only when the target team will own future development.</w:t>
       </w:r>
     </w:p>
     <w:p>

</xml_diff>

<commit_message>
Release Orphaned Flow Finder v1.1.0
Co-authored-by: Copilot <223556219+Copilot@users.noreply.github.com>
</commit_message>
<xml_diff>
--- a/Orphaned Flow Finder - Deployment and Tenant Onboarding Guide.docx
+++ b/Orphaned Flow Finder - Deployment and Tenant Onboarding Guide.docx
@@ -276,7 +276,7 @@
           <w:szCs w:val="18"/>
           <w:shd w:val="clear" w:color="auto" w:fill="F3F4F6"/>
         </w:rPr>
-        <w:t xml:space="preserve">solutions/OrphanedFlowFinder_1_0_0_0_managed.zip</w:t>
+        <w:t xml:space="preserve">solutions/OrphanedFlowFinder_1_1_0_0_managed.zip</w:t>
       </w:r>
       <w:r>
         <w:rPr/>
@@ -472,7 +472,17 @@
       </w:r>
       <w:r>
         <w:rPr/>
-        <w:t xml:space="preserve">Reads the tenant's Power Platform environments.</w:t>
+        <w:t xml:space="preserve">Merges environments from Power Platform for Admins and Power Platform</w:t>
+      </w:r>
+    </w:p>
+    <w:p>
+      <w:pPr>
+        <w:pStyle w:val="Normal"/>
+        <w:spacing w:before="0" w:after="120" w:line="276" w:lineRule="auto"/>
+      </w:pPr>
+      <w:r>
+        <w:rPr/>
+        <w:t xml:space="preserve">Inventory so Dataverse-backed and non-Dataverse environments are covered.</w:t>
       </w:r>
     </w:p>
     <w:p>
@@ -489,7 +499,17 @@
       </w:r>
       <w:r>
         <w:rPr/>
-        <w:t xml:space="preserve">Queries Power Platform Inventory for tenant-wide cloud flow inventory.</w:t>
+        <w:t xml:space="preserve">Loads active environments before scanning so the operator can scan all</w:t>
+      </w:r>
+    </w:p>
+    <w:p>
+      <w:pPr>
+        <w:pStyle w:val="Normal"/>
+        <w:spacing w:before="0" w:after="120" w:line="276" w:lineRule="auto"/>
+      </w:pPr>
+      <w:r>
+        <w:rPr/>
+        <w:t xml:space="preserve">environments, only the Default environment, or one selected environment.</w:t>
       </w:r>
     </w:p>
     <w:p>
@@ -506,6 +526,23 @@
       </w:r>
       <w:r>
         <w:rPr/>
+        <w:t xml:space="preserve">Applies a selected environment to the Power Platform Inventory query.</w:t>
+      </w:r>
+    </w:p>
+    <w:p>
+      <w:pPr>
+        <w:pStyle w:val="Normal"/>
+        <w:spacing w:before="0" w:after="120" w:line="276" w:lineRule="auto"/>
+        <w:ind w:left="540" w:hanging="360"/>
+      </w:pPr>
+      <w:r>
+        <w:rPr>
+          <w:b/>
+        </w:rPr>
+        <w:t xml:space="preserve">4. </w:t>
+      </w:r>
+      <w:r>
+        <w:rPr/>
         <w:t xml:space="preserve">Validates unique owner object IDs against Microsoft Entra ID.</w:t>
       </w:r>
     </w:p>
@@ -519,7 +556,7 @@
         <w:rPr>
           <w:b/>
         </w:rPr>
-        <w:t xml:space="preserve">4. </w:t>
+        <w:t xml:space="preserve">5. </w:t>
       </w:r>
       <w:r>
         <w:rPr/>
@@ -536,7 +573,34 @@
         <w:rPr>
           <w:b/>
         </w:rPr>
-        <w:t xml:space="preserve">5. </w:t>
+        <w:t xml:space="preserve">6. </w:t>
+      </w:r>
+      <w:r>
+        <w:rPr/>
+        <w:t xml:space="preserve">Identifies Dataverse database status and solution-aware flows when the</w:t>
+      </w:r>
+    </w:p>
+    <w:p>
+      <w:pPr>
+        <w:pStyle w:val="Normal"/>
+        <w:spacing w:before="0" w:after="120" w:line="276" w:lineRule="auto"/>
+      </w:pPr>
+      <w:r>
+        <w:rPr/>
+        <w:t xml:space="preserve">platform returns that metadata.</w:t>
+      </w:r>
+    </w:p>
+    <w:p>
+      <w:pPr>
+        <w:pStyle w:val="Normal"/>
+        <w:spacing w:before="0" w:after="120" w:line="276" w:lineRule="auto"/>
+        <w:ind w:left="540" w:hanging="360"/>
+      </w:pPr>
+      <w:r>
+        <w:rPr>
+          <w:b/>
+        </w:rPr>
+        <w:t xml:space="preserve">7. </w:t>
       </w:r>
       <w:r>
         <w:rPr/>
@@ -553,21 +617,68 @@
         <w:rPr>
           <w:b/>
         </w:rPr>
-        <w:t xml:space="preserve">6. </w:t>
-      </w:r>
-      <w:r>
-        <w:rPr/>
-        <w:t xml:space="preserve">Allows a confirmed deleted-owner flow to receive a valid recovery co-owner.</w:t>
-      </w:r>
-    </w:p>
-    <w:p>
-      <w:pPr>
-        <w:pStyle w:val="Normal"/>
-        <w:spacing w:before="0" w:after="120" w:line="276" w:lineRule="auto"/>
-      </w:pPr>
-      <w:r>
-        <w:rPr/>
-        <w:t xml:space="preserve">Tenant scanning and directory validation are read-only. The only write operation adds a recovery co-owner after the operator reviews the affected flows and selects an explicit confirmation check box.</w:t>
+        <w:t xml:space="preserve">8. </w:t>
+      </w:r>
+      <w:r>
+        <w:rPr/>
+        <w:t xml:space="preserve">Adds an active Microsoft Entra user as a co-owner to explicitly selected</w:t>
+      </w:r>
+    </w:p>
+    <w:p>
+      <w:pPr>
+        <w:pStyle w:val="Normal"/>
+        <w:spacing w:before="0" w:after="120" w:line="276" w:lineRule="auto"/>
+      </w:pPr>
+      <w:r>
+        <w:rPr/>
+        <w:t xml:space="preserve">flows after preview and confirmation.</w:t>
+      </w:r>
+    </w:p>
+    <w:p>
+      <w:pPr>
+        <w:pStyle w:val="Normal"/>
+        <w:spacing w:before="0" w:after="120" w:line="276" w:lineRule="auto"/>
+        <w:ind w:left="540" w:hanging="360"/>
+      </w:pPr>
+      <w:r>
+        <w:rPr>
+          <w:b/>
+        </w:rPr>
+        <w:t xml:space="preserve">9. </w:t>
+      </w:r>
+      <w:r>
+        <w:rPr/>
+        <w:t xml:space="preserve">Opens a single selected non-solution flow in the GCC Power Automate maker</w:t>
+      </w:r>
+    </w:p>
+    <w:p>
+      <w:pPr>
+        <w:pStyle w:val="Normal"/>
+        <w:spacing w:before="0" w:after="120" w:line="276" w:lineRule="auto"/>
+      </w:pPr>
+      <w:r>
+        <w:rPr/>
+        <w:t xml:space="preserve">portal so an existing owner or co-owner can use the supported </w:t>
+      </w:r>
+      <w:r>
+        <w:rPr>
+          <w:b/>
+        </w:rPr>
+        <w:t xml:space="preserve">Send a copy</w:t>
+      </w:r>
+      <w:r>
+        <w:rPr/>
+        <w:t xml:space="preserve"> panel.</w:t>
+      </w:r>
+    </w:p>
+    <w:p>
+      <w:pPr>
+        <w:pStyle w:val="Normal"/>
+        <w:spacing w:before="0" w:after="120" w:line="276" w:lineRule="auto"/>
+      </w:pPr>
+      <w:r>
+        <w:rPr/>
+        <w:t xml:space="preserve">Tenant scanning and directory validation are read-only. The only write operation adds a co-owner after the operator reviews the affected flows and selects an explicit confirmation check box. The Send a copy handoff performs no write in this app.</w:t>
       </w:r>
     </w:p>
     <w:p>
@@ -725,7 +836,7 @@
             </w:pPr>
             <w:r>
               <w:rPr/>
-              <w:t xml:space="preserve">Lists environments, including Default</w:t>
+              <w:t xml:space="preserve">Lists environments and expands Dataverse metadata</w:t>
             </w:r>
           </w:p>
         </w:tc>
@@ -796,7 +907,7 @@
             </w:pPr>
             <w:r>
               <w:rPr/>
-              <w:t xml:space="preserve">Calls the GCC Power Platform Inventory API</w:t>
+              <w:t xml:space="preserve">Queries GCC environment and cloud flow inventory</w:t>
             </w:r>
           </w:p>
         </w:tc>
@@ -867,7 +978,7 @@
             </w:pPr>
             <w:r>
               <w:rPr/>
-              <w:t xml:space="preserve">Validates owner IDs and searches recovery users</w:t>
+              <w:t xml:space="preserve">Validates owner IDs and searches active co-owners</w:t>
             </w:r>
           </w:p>
         </w:tc>
@@ -938,7 +1049,7 @@
             </w:pPr>
             <w:r>
               <w:rPr/>
-              <w:t xml:space="preserve">Adds a confirmed recovery co-owner</w:t>
+              <w:t xml:space="preserve">Adds a confirmed flow co-owner as admin</w:t>
             </w:r>
           </w:p>
         </w:tc>
@@ -3231,7 +3342,7 @@
           <w:szCs w:val="18"/>
           <w:shd w:val="clear" w:color="auto" w:fill="F3F4F6"/>
         </w:rPr>
-        <w:t xml:space="preserve">solutions/OrphanedFlowFinder_1_0_0_0_managed.zip</w:t>
+        <w:t xml:space="preserve">solutions/OrphanedFlowFinder_1_1_0_0_managed.zip</w:t>
       </w:r>
     </w:p>
     <w:p>
@@ -3253,7 +3364,7 @@
           <w:szCs w:val="18"/>
           <w:shd w:val="clear" w:color="auto" w:fill="F3F4F6"/>
         </w:rPr>
-        <w:t xml:space="preserve">solutions/OrphanedFlowFinder_1_0_0_0_unmanaged.zip</w:t>
+        <w:t xml:space="preserve">solutions/OrphanedFlowFinder_1_1_0_0_unmanaged.zip</w:t>
       </w:r>
     </w:p>
     <w:p>
@@ -4150,7 +4261,7 @@
           <w:szCs w:val="18"/>
           <w:shd w:val="clear" w:color="auto" w:fill="F3F4F6"/>
         </w:rPr>
-        <w:t xml:space="preserve">OrphanedFlowFinder_1_0_0_0_managed.zip</w:t>
+        <w:t xml:space="preserve">OrphanedFlowFinder_1_1_0_0_managed.zip</w:t>
       </w:r>
       <w:r>
         <w:rPr/>
@@ -4465,17 +4576,7 @@
       </w:r>
       <w:r>
         <w:rPr/>
-        <w:t xml:space="preserve">Select </w:t>
-      </w:r>
-      <w:r>
-        <w:rPr>
-          <w:b/>
-        </w:rPr>
-        <w:t xml:space="preserve">Scan tenant</w:t>
-      </w:r>
-      <w:r>
-        <w:rPr/>
-        <w:t xml:space="preserve">.</w:t>
+        <w:t xml:space="preserve">Wait for the pre-scan environment list to load.</w:t>
       </w:r>
     </w:p>
     <w:p>
@@ -4489,6 +4590,70 @@
           <w:b/>
         </w:rPr>
         <w:t xml:space="preserve">5. </w:t>
+      </w:r>
+      <w:r>
+        <w:rPr/>
+        <w:t xml:space="preserve">Choose one scan scope:</w:t>
+      </w:r>
+    </w:p>
+    <w:p>
+      <w:pPr>
+        <w:pStyle w:val="Normal"/>
+        <w:spacing w:before="0" w:after="120" w:line="276" w:lineRule="auto"/>
+      </w:pPr>
+      <w:r>
+        <w:rPr/>
+        <w:t xml:space="preserve">- Leave </w:t>
+      </w:r>
+      <w:r>
+        <w:rPr>
+          <w:b/>
+        </w:rPr>
+        <w:t xml:space="preserve">All environments</w:t>
+      </w:r>
+      <w:r>
+        <w:rPr/>
+        <w:t xml:space="preserve"> selected. - Check </w:t>
+      </w:r>
+      <w:r>
+        <w:rPr>
+          <w:b/>
+        </w:rPr>
+        <w:t xml:space="preserve">Scan only the Default environment</w:t>
+      </w:r>
+      <w:r>
+        <w:rPr/>
+        <w:t xml:space="preserve">. - Select one Power Platform environment from the list.</w:t>
+      </w:r>
+    </w:p>
+    <w:p>
+      <w:pPr>
+        <w:pStyle w:val="Normal"/>
+        <w:spacing w:before="0" w:after="120" w:line="276" w:lineRule="auto"/>
+        <w:ind w:left="540" w:hanging="360"/>
+      </w:pPr>
+      <w:r>
+        <w:rPr>
+          <w:b/>
+        </w:rPr>
+        <w:t xml:space="preserve">6. </w:t>
+      </w:r>
+      <w:r>
+        <w:rPr/>
+        <w:t xml:space="preserve">Select the applicable scan button.</w:t>
+      </w:r>
+    </w:p>
+    <w:p>
+      <w:pPr>
+        <w:pStyle w:val="Normal"/>
+        <w:spacing w:before="0" w:after="120" w:line="276" w:lineRule="auto"/>
+        <w:ind w:left="540" w:hanging="360"/>
+      </w:pPr>
+      <w:r>
+        <w:rPr>
+          <w:b/>
+        </w:rPr>
+        <w:t xml:space="preserve">7. </w:t>
       </w:r>
       <w:r>
         <w:rPr/>
@@ -4549,6 +4714,110 @@
       </w:r>
       <w:r>
         <w:rPr/>
+        <w:t xml:space="preserve">The pre-scan selector lists the active environments available to the</w:t>
+      </w:r>
+    </w:p>
+    <w:p>
+      <w:pPr>
+        <w:pStyle w:val="Normal"/>
+        <w:spacing w:before="0" w:after="120" w:line="276" w:lineRule="auto"/>
+      </w:pPr>
+      <w:r>
+        <w:rPr/>
+        <w:t xml:space="preserve">administrator.</w:t>
+      </w:r>
+    </w:p>
+    <w:p>
+      <w:pPr>
+        <w:pStyle w:val="Normal"/>
+        <w:spacing w:before="0" w:after="120" w:line="276" w:lineRule="auto"/>
+        <w:ind w:left="540" w:hanging="360"/>
+      </w:pPr>
+      <w:r>
+        <w:rPr>
+          <w:b/>
+        </w:rPr>
+        <w:t xml:space="preserve">• </w:t>
+      </w:r>
+      <w:r>
+        <w:rPr>
+          <w:b/>
+        </w:rPr>
+        <w:t xml:space="preserve">Scan only the Default environment</w:t>
+      </w:r>
+      <w:r>
+        <w:rPr/>
+        <w:t xml:space="preserve"> overrides and disables the environment</w:t>
+      </w:r>
+    </w:p>
+    <w:p>
+      <w:pPr>
+        <w:pStyle w:val="Normal"/>
+        <w:spacing w:before="0" w:after="120" w:line="276" w:lineRule="auto"/>
+      </w:pPr>
+      <w:r>
+        <w:rPr/>
+        <w:t xml:space="preserve">selector.</w:t>
+      </w:r>
+    </w:p>
+    <w:p>
+      <w:pPr>
+        <w:pStyle w:val="Normal"/>
+        <w:spacing w:before="0" w:after="120" w:line="276" w:lineRule="auto"/>
+        <w:ind w:left="540" w:hanging="360"/>
+      </w:pPr>
+      <w:r>
+        <w:rPr>
+          <w:b/>
+        </w:rPr>
+        <w:t xml:space="preserve">• </w:t>
+      </w:r>
+      <w:r>
+        <w:rPr/>
+        <w:t xml:space="preserve">An all-environments scan returns flows across the tenant.</w:t>
+      </w:r>
+    </w:p>
+    <w:p>
+      <w:pPr>
+        <w:pStyle w:val="Normal"/>
+        <w:spacing w:before="0" w:after="120" w:line="276" w:lineRule="auto"/>
+        <w:ind w:left="540" w:hanging="360"/>
+      </w:pPr>
+      <w:r>
+        <w:rPr>
+          <w:b/>
+        </w:rPr>
+        <w:t xml:space="preserve">• </w:t>
+      </w:r>
+      <w:r>
+        <w:rPr/>
+        <w:t xml:space="preserve">A selected-environment scan returns flows and owner validation only for that</w:t>
+      </w:r>
+    </w:p>
+    <w:p>
+      <w:pPr>
+        <w:pStyle w:val="Normal"/>
+        <w:spacing w:before="0" w:after="120" w:line="276" w:lineRule="auto"/>
+      </w:pPr>
+      <w:r>
+        <w:rPr/>
+        <w:t xml:space="preserve">environment.</w:t>
+      </w:r>
+    </w:p>
+    <w:p>
+      <w:pPr>
+        <w:pStyle w:val="Normal"/>
+        <w:spacing w:before="0" w:after="120" w:line="276" w:lineRule="auto"/>
+        <w:ind w:left="540" w:hanging="360"/>
+      </w:pPr>
+      <w:r>
+        <w:rPr>
+          <w:b/>
+        </w:rPr>
+        <w:t xml:space="preserve">• </w:t>
+      </w:r>
+      <w:r>
+        <w:rPr/>
         <w:t xml:space="preserve">The environment count is nonzero.</w:t>
       </w:r>
     </w:p>
@@ -4567,6 +4836,87 @@
       <w:r>
         <w:rPr/>
         <w:t xml:space="preserve">The Default environment appears in the Environment filter.</w:t>
+      </w:r>
+    </w:p>
+    <w:p>
+      <w:pPr>
+        <w:pStyle w:val="Normal"/>
+        <w:spacing w:before="0" w:after="120" w:line="276" w:lineRule="auto"/>
+        <w:ind w:left="540" w:hanging="360"/>
+      </w:pPr>
+      <w:r>
+        <w:rPr>
+          <w:b/>
+        </w:rPr>
+        <w:t xml:space="preserve">• </w:t>
+      </w:r>
+      <w:r>
+        <w:rPr/>
+        <w:t xml:space="preserve">Known Dataverse environments show the </w:t>
+      </w:r>
+      <w:r>
+        <w:rPr>
+          <w:b/>
+        </w:rPr>
+        <w:t xml:space="preserve">Dataverse</w:t>
+      </w:r>
+      <w:r>
+        <w:rPr/>
+        <w:t xml:space="preserve"> badge and non-Dataverse</w:t>
+      </w:r>
+    </w:p>
+    <w:p>
+      <w:pPr>
+        <w:pStyle w:val="Normal"/>
+        <w:spacing w:before="0" w:after="120" w:line="276" w:lineRule="auto"/>
+      </w:pPr>
+      <w:r>
+        <w:rPr/>
+        <w:t xml:space="preserve">environments show </w:t>
+      </w:r>
+      <w:r>
+        <w:rPr>
+          <w:b/>
+        </w:rPr>
+        <w:t xml:space="preserve">No Dataverse</w:t>
+      </w:r>
+      <w:r>
+        <w:rPr/>
+        <w:t xml:space="preserve">.</w:t>
+      </w:r>
+    </w:p>
+    <w:p>
+      <w:pPr>
+        <w:pStyle w:val="Normal"/>
+        <w:spacing w:before="0" w:after="120" w:line="276" w:lineRule="auto"/>
+        <w:ind w:left="540" w:hanging="360"/>
+      </w:pPr>
+      <w:r>
+        <w:rPr>
+          <w:b/>
+        </w:rPr>
+        <w:t xml:space="preserve">• </w:t>
+      </w:r>
+      <w:r>
+        <w:rPr/>
+        <w:t xml:space="preserve">Flow-level metadata never changes the environment database badge.</w:t>
+      </w:r>
+    </w:p>
+    <w:p>
+      <w:pPr>
+        <w:pStyle w:val="Normal"/>
+        <w:spacing w:before="0" w:after="120" w:line="276" w:lineRule="auto"/>
+        <w:ind w:left="540" w:hanging="360"/>
+      </w:pPr>
+      <w:r>
+        <w:rPr>
+          <w:b/>
+        </w:rPr>
+        <w:t xml:space="preserve">• </w:t>
+      </w:r>
+      <w:r>
+        <w:rPr/>
+        <w:t xml:space="preserve">An environment returned by only one discovery source still appears.</w:t>
       </w:r>
     </w:p>
     <w:p>
@@ -4661,17 +5011,17 @@
       </w:r>
       <w:r>
         <w:rPr/>
-        <w:t xml:space="preserve">Environment, owner status, owner, environment type, region, modified date,</w:t>
-      </w:r>
-    </w:p>
-    <w:p>
-      <w:pPr>
-        <w:pStyle w:val="Normal"/>
-        <w:spacing w:before="0" w:after="120" w:line="276" w:lineRule="auto"/>
-      </w:pPr>
-      <w:r>
-        <w:rPr/>
-        <w:t xml:space="preserve">and Default-only filters work.</w:t>
+        <w:t xml:space="preserve">Environment, owner status, owner, environment type, region, Dataverse,</w:t>
+      </w:r>
+    </w:p>
+    <w:p>
+      <w:pPr>
+        <w:pStyle w:val="Normal"/>
+        <w:spacing w:before="0" w:after="120" w:line="276" w:lineRule="auto"/>
+      </w:pPr>
+      <w:r>
+        <w:rPr/>
+        <w:t xml:space="preserve">modified date, and Default-only filters work.</w:t>
       </w:r>
     </w:p>
     <w:p>
@@ -4738,24 +5088,34 @@
       </w:pPr>
       <w:r>
         <w:rPr/>
-        <w:t xml:space="preserve">Recovery safety</w:t>
-      </w:r>
-    </w:p>
-    <w:p>
-      <w:pPr>
-        <w:pStyle w:val="Normal"/>
-        <w:spacing w:before="0" w:after="120" w:line="276" w:lineRule="auto"/>
-        <w:ind w:left="540" w:hanging="360"/>
-      </w:pPr>
-      <w:r>
-        <w:rPr>
-          <w:b/>
-        </w:rPr>
-        <w:t xml:space="preserve">• </w:t>
-      </w:r>
-      <w:r>
-        <w:rPr/>
-        <w:t xml:space="preserve">Only flows with a directory-confirmed deleted owner can be selected.</w:t>
+        <w:t xml:space="preserve">Co-owner assignment safety</w:t>
+      </w:r>
+    </w:p>
+    <w:p>
+      <w:pPr>
+        <w:pStyle w:val="Normal"/>
+        <w:spacing w:before="0" w:after="120" w:line="276" w:lineRule="auto"/>
+        <w:ind w:left="540" w:hanging="360"/>
+      </w:pPr>
+      <w:r>
+        <w:rPr>
+          <w:b/>
+        </w:rPr>
+        <w:t xml:space="preserve">• </w:t>
+      </w:r>
+      <w:r>
+        <w:rPr/>
+        <w:t xml:space="preserve">Flows with active, disabled, deleted, missing, or unknown primary-owner</w:t>
+      </w:r>
+    </w:p>
+    <w:p>
+      <w:pPr>
+        <w:pStyle w:val="Normal"/>
+        <w:spacing w:before="0" w:after="120" w:line="276" w:lineRule="auto"/>
+      </w:pPr>
+      <w:r>
+        <w:rPr/>
+        <w:t xml:space="preserve">status can be selected when the flow and environment IDs are available.</w:t>
       </w:r>
     </w:p>
     <w:p>
@@ -4789,67 +5149,67 @@
       </w:r>
       <w:r>
         <w:rPr/>
-        <w:t xml:space="preserve">Recovery-user search returns active target-tenant users.</w:t>
-      </w:r>
-    </w:p>
-    <w:p>
-      <w:pPr>
-        <w:pStyle w:val="Normal"/>
-        <w:spacing w:before="0" w:after="120" w:line="276" w:lineRule="auto"/>
-        <w:ind w:left="540" w:hanging="360"/>
-      </w:pPr>
-      <w:r>
-        <w:rPr>
-          <w:b/>
-        </w:rPr>
-        <w:t xml:space="preserve">• </w:t>
-      </w:r>
-      <w:r>
-        <w:rPr/>
-        <w:t xml:space="preserve">The preview lists every selected flow and recovery co-owner.</w:t>
-      </w:r>
-    </w:p>
-    <w:p>
-      <w:pPr>
-        <w:pStyle w:val="Normal"/>
-        <w:spacing w:before="0" w:after="120" w:line="276" w:lineRule="auto"/>
-        <w:ind w:left="540" w:hanging="360"/>
-      </w:pPr>
-      <w:r>
-        <w:rPr>
-          <w:b/>
-        </w:rPr>
-        <w:t xml:space="preserve">• </w:t>
-      </w:r>
-      <w:r>
-        <w:rPr>
-          <w:b/>
-        </w:rPr>
-        <w:t xml:space="preserve">Confirm and add co-owner</w:t>
-      </w:r>
-      <w:r>
-        <w:rPr/>
-        <w:t xml:space="preserve"> remains disabled until the confirmation box is</w:t>
-      </w:r>
-    </w:p>
-    <w:p>
-      <w:pPr>
-        <w:pStyle w:val="Normal"/>
-        <w:spacing w:before="0" w:after="120" w:line="276" w:lineRule="auto"/>
-      </w:pPr>
-      <w:r>
-        <w:rPr/>
-        <w:t xml:space="preserve">selected.</w:t>
-      </w:r>
-    </w:p>
-    <w:p>
-      <w:pPr>
-        <w:pStyle w:val="Normal"/>
-        <w:spacing w:before="0" w:after="120" w:line="276" w:lineRule="auto"/>
-      </w:pPr>
-      <w:r>
-        <w:rPr/>
-        <w:t xml:space="preserve">Use a dedicated test flow for the first recovery test.</w:t>
+        <w:t xml:space="preserve">Co-owner search returns active target-tenant users.</w:t>
+      </w:r>
+    </w:p>
+    <w:p>
+      <w:pPr>
+        <w:pStyle w:val="Normal"/>
+        <w:spacing w:before="0" w:after="120" w:line="276" w:lineRule="auto"/>
+        <w:ind w:left="540" w:hanging="360"/>
+      </w:pPr>
+      <w:r>
+        <w:rPr>
+          <w:b/>
+        </w:rPr>
+        <w:t xml:space="preserve">• </w:t>
+      </w:r>
+      <w:r>
+        <w:rPr/>
+        <w:t xml:space="preserve">The preview lists every selected flow and proposed co-owner.</w:t>
+      </w:r>
+    </w:p>
+    <w:p>
+      <w:pPr>
+        <w:pStyle w:val="Normal"/>
+        <w:spacing w:before="0" w:after="120" w:line="276" w:lineRule="auto"/>
+        <w:ind w:left="540" w:hanging="360"/>
+      </w:pPr>
+      <w:r>
+        <w:rPr>
+          <w:b/>
+        </w:rPr>
+        <w:t xml:space="preserve">• </w:t>
+      </w:r>
+      <w:r>
+        <w:rPr>
+          <w:b/>
+        </w:rPr>
+        <w:t xml:space="preserve">Confirm and grant co-owner access</w:t>
+      </w:r>
+      <w:r>
+        <w:rPr/>
+        <w:t xml:space="preserve"> remains disabled until the confirmation</w:t>
+      </w:r>
+    </w:p>
+    <w:p>
+      <w:pPr>
+        <w:pStyle w:val="Normal"/>
+        <w:spacing w:before="0" w:after="120" w:line="276" w:lineRule="auto"/>
+      </w:pPr>
+      <w:r>
+        <w:rPr/>
+        <w:t xml:space="preserve">box is selected.</w:t>
+      </w:r>
+    </w:p>
+    <w:p>
+      <w:pPr>
+        <w:pStyle w:val="Normal"/>
+        <w:spacing w:before="0" w:after="120" w:line="276" w:lineRule="auto"/>
+      </w:pPr>
+      <w:r>
+        <w:rPr/>
+        <w:t xml:space="preserve">Use a dedicated test flow for the first co-owner assignment test.</w:t>
       </w:r>
     </w:p>
     <w:p>
@@ -4876,41 +5236,51 @@
       </w:r>
       <w:r>
         <w:rPr/>
-        <w:t xml:space="preserve">Recovery adds the selected user as a co-owner with edit access.</w:t>
-      </w:r>
-    </w:p>
-    <w:p>
-      <w:pPr>
-        <w:pStyle w:val="Normal"/>
-        <w:spacing w:before="0" w:after="120" w:line="276" w:lineRule="auto"/>
-        <w:ind w:left="540" w:hanging="360"/>
-      </w:pPr>
-      <w:r>
-        <w:rPr>
-          <w:b/>
-        </w:rPr>
-        <w:t xml:space="preserve">• </w:t>
-      </w:r>
-      <w:r>
-        <w:rPr/>
-        <w:t xml:space="preserve">The immutable deleted primary-owner permission can remain listed.</w:t>
-      </w:r>
-    </w:p>
-    <w:p>
-      <w:pPr>
-        <w:pStyle w:val="Normal"/>
-        <w:spacing w:before="0" w:after="120" w:line="276" w:lineRule="auto"/>
-        <w:ind w:left="540" w:hanging="360"/>
-      </w:pPr>
-      <w:r>
-        <w:rPr>
-          <w:b/>
-        </w:rPr>
-        <w:t xml:space="preserve">• </w:t>
-      </w:r>
-      <w:r>
-        <w:rPr/>
-        <w:t xml:space="preserve">Connections owned by the deleted user might still need repair.</w:t>
+        <w:t xml:space="preserve">Assignment adds the selected user as a co-owner with edit access.</w:t>
+      </w:r>
+    </w:p>
+    <w:p>
+      <w:pPr>
+        <w:pStyle w:val="Normal"/>
+        <w:spacing w:before="0" w:after="120" w:line="276" w:lineRule="auto"/>
+        <w:ind w:left="540" w:hanging="360"/>
+      </w:pPr>
+      <w:r>
+        <w:rPr>
+          <w:b/>
+        </w:rPr>
+        <w:t xml:space="preserve">• </w:t>
+      </w:r>
+      <w:r>
+        <w:rPr/>
+        <w:t xml:space="preserve">Existing owners remain; the immutable deleted primary-owner permission can</w:t>
+      </w:r>
+    </w:p>
+    <w:p>
+      <w:pPr>
+        <w:pStyle w:val="Normal"/>
+        <w:spacing w:before="0" w:after="120" w:line="276" w:lineRule="auto"/>
+      </w:pPr>
+      <w:r>
+        <w:rPr/>
+        <w:t xml:space="preserve">remain listed.</w:t>
+      </w:r>
+    </w:p>
+    <w:p>
+      <w:pPr>
+        <w:pStyle w:val="Normal"/>
+        <w:spacing w:before="0" w:after="120" w:line="276" w:lineRule="auto"/>
+        <w:ind w:left="540" w:hanging="360"/>
+      </w:pPr>
+      <w:r>
+        <w:rPr>
+          <w:b/>
+        </w:rPr>
+        <w:t xml:space="preserve">• </w:t>
+      </w:r>
+      <w:r>
+        <w:rPr/>
+        <w:t xml:space="preserve">Existing connections aren't transferred and might still need repair.</w:t>
       </w:r>
     </w:p>
     <w:p>
@@ -4938,6 +5308,278 @@
       <w:r>
         <w:rPr/>
         <w:t xml:space="preserve">the flow details experience.</w:t>
+      </w:r>
+    </w:p>
+    <w:p>
+      <w:pPr>
+        <w:pStyle w:val="Heading2"/>
+        <w:spacing w:before="220" w:after="100" w:line="276" w:lineRule="auto"/>
+      </w:pPr>
+      <w:r>
+        <w:rPr/>
+        <w:t xml:space="preserve">Send a copy guidance</w:t>
+      </w:r>
+    </w:p>
+    <w:p>
+      <w:pPr>
+        <w:pStyle w:val="Normal"/>
+        <w:spacing w:before="0" w:after="120" w:line="276" w:lineRule="auto"/>
+        <w:ind w:left="540" w:hanging="360"/>
+      </w:pPr>
+      <w:r>
+        <w:rPr>
+          <w:b/>
+        </w:rPr>
+        <w:t xml:space="preserve">• </w:t>
+      </w:r>
+      <w:r>
+        <w:rPr/>
+        <w:t xml:space="preserve">Selecting exactly one non-solution flow enables </w:t>
+      </w:r>
+      <w:r>
+        <w:rPr>
+          <w:b/>
+        </w:rPr>
+        <w:t xml:space="preserve">Send a copy</w:t>
+      </w:r>
+      <w:r>
+        <w:rPr/>
+        <w:t xml:space="preserve">.</w:t>
+      </w:r>
+    </w:p>
+    <w:p>
+      <w:pPr>
+        <w:pStyle w:val="Normal"/>
+        <w:spacing w:before="0" w:after="120" w:line="276" w:lineRule="auto"/>
+        <w:ind w:left="540" w:hanging="360"/>
+      </w:pPr>
+      <w:r>
+        <w:rPr>
+          <w:b/>
+        </w:rPr>
+        <w:t xml:space="preserve">• </w:t>
+      </w:r>
+      <w:r>
+        <w:rPr/>
+        <w:t xml:space="preserve">Selecting zero or multiple flows disables </w:t>
+      </w:r>
+      <w:r>
+        <w:rPr>
+          <w:b/>
+        </w:rPr>
+        <w:t xml:space="preserve">Send a copy</w:t>
+      </w:r>
+      <w:r>
+        <w:rPr/>
+        <w:t xml:space="preserve">.</w:t>
+      </w:r>
+    </w:p>
+    <w:p>
+      <w:pPr>
+        <w:pStyle w:val="Normal"/>
+        <w:spacing w:before="0" w:after="120" w:line="276" w:lineRule="auto"/>
+        <w:ind w:left="540" w:hanging="360"/>
+      </w:pPr>
+      <w:r>
+        <w:rPr>
+          <w:b/>
+        </w:rPr>
+        <w:t xml:space="preserve">• </w:t>
+      </w:r>
+      <w:r>
+        <w:rPr/>
+        <w:t xml:space="preserve">Selecting a solution-aware flow disables </w:t>
+      </w:r>
+      <w:r>
+        <w:rPr>
+          <w:b/>
+        </w:rPr>
+        <w:t xml:space="preserve">Send a copy</w:t>
+      </w:r>
+      <w:r>
+        <w:rPr/>
+        <w:t xml:space="preserve">; use </w:t>
+      </w:r>
+      <w:r>
+        <w:rPr>
+          <w:b/>
+        </w:rPr>
+        <w:t xml:space="preserve">Save As</w:t>
+      </w:r>
+      <w:r>
+        <w:rPr/>
+        <w:t xml:space="preserve"> or</w:t>
+      </w:r>
+    </w:p>
+    <w:p>
+      <w:pPr>
+        <w:pStyle w:val="Normal"/>
+        <w:spacing w:before="0" w:after="120" w:line="276" w:lineRule="auto"/>
+      </w:pPr>
+      <w:r>
+        <w:rPr/>
+        <w:t xml:space="preserve">solution export/import for that flow.</w:t>
+      </w:r>
+    </w:p>
+    <w:p>
+      <w:pPr>
+        <w:pStyle w:val="Normal"/>
+        <w:spacing w:before="0" w:after="120" w:line="276" w:lineRule="auto"/>
+        <w:ind w:left="540" w:hanging="360"/>
+      </w:pPr>
+      <w:r>
+        <w:rPr>
+          <w:b/>
+        </w:rPr>
+        <w:t xml:space="preserve">• </w:t>
+      </w:r>
+      <w:r>
+        <w:rPr/>
+        <w:t xml:space="preserve">The confirmation dialog identifies the selected flow and explains that the</w:t>
+      </w:r>
+    </w:p>
+    <w:p>
+      <w:pPr>
+        <w:pStyle w:val="Normal"/>
+        <w:spacing w:before="0" w:after="120" w:line="276" w:lineRule="auto"/>
+      </w:pPr>
+      <w:r>
+        <w:rPr/>
+        <w:t xml:space="preserve">recipient receives an independent copy without the original connections.</w:t>
+      </w:r>
+    </w:p>
+    <w:p>
+      <w:pPr>
+        <w:pStyle w:val="Normal"/>
+        <w:spacing w:before="0" w:after="120" w:line="276" w:lineRule="auto"/>
+        <w:ind w:left="540" w:hanging="360"/>
+      </w:pPr>
+      <w:r>
+        <w:rPr>
+          <w:b/>
+        </w:rPr>
+        <w:t xml:space="preserve">• </w:t>
+      </w:r>
+      <w:r>
+        <w:rPr/>
+        <w:t xml:space="preserve">The operator reviews the flow for personal information, secrets, and</w:t>
+      </w:r>
+    </w:p>
+    <w:p>
+      <w:pPr>
+        <w:pStyle w:val="Normal"/>
+        <w:spacing w:before="0" w:after="120" w:line="276" w:lineRule="auto"/>
+      </w:pPr>
+      <w:r>
+        <w:rPr/>
+        <w:t xml:space="preserve">hard-coded environment values before sending it.</w:t>
+      </w:r>
+    </w:p>
+    <w:p>
+      <w:pPr>
+        <w:pStyle w:val="Normal"/>
+        <w:spacing w:before="0" w:after="120" w:line="276" w:lineRule="auto"/>
+        <w:ind w:left="540" w:hanging="360"/>
+      </w:pPr>
+      <w:r>
+        <w:rPr>
+          <w:b/>
+        </w:rPr>
+        <w:t xml:space="preserve">• </w:t>
+      </w:r>
+      <w:r>
+        <w:rPr>
+          <w:b/>
+        </w:rPr>
+        <w:t xml:space="preserve">Open flow in Power Automate</w:t>
+      </w:r>
+      <w:r>
+        <w:rPr/>
+        <w:t xml:space="preserve"> opens the GCC maker URL for the correct</w:t>
+      </w:r>
+    </w:p>
+    <w:p>
+      <w:pPr>
+        <w:pStyle w:val="Normal"/>
+        <w:spacing w:before="0" w:after="120" w:line="276" w:lineRule="auto"/>
+      </w:pPr>
+      <w:r>
+        <w:rPr/>
+        <w:t xml:space="preserve">environment and flow ID.</w:t>
+      </w:r>
+    </w:p>
+    <w:p>
+      <w:pPr>
+        <w:pStyle w:val="Normal"/>
+        <w:spacing w:before="0" w:after="120" w:line="276" w:lineRule="auto"/>
+        <w:ind w:left="540" w:hanging="360"/>
+      </w:pPr>
+      <w:r>
+        <w:rPr>
+          <w:b/>
+        </w:rPr>
+        <w:t xml:space="preserve">• </w:t>
+      </w:r>
+      <w:r>
+        <w:rPr/>
+        <w:t xml:space="preserve">An existing owner or co-owner can select </w:t>
+      </w:r>
+      <w:r>
+        <w:rPr>
+          <w:b/>
+        </w:rPr>
+        <w:t xml:space="preserve">Send a copy</w:t>
+      </w:r>
+      <w:r>
+        <w:rPr/>
+        <w:t xml:space="preserve"> on the flow details</w:t>
+      </w:r>
+    </w:p>
+    <w:p>
+      <w:pPr>
+        <w:pStyle w:val="Normal"/>
+        <w:spacing w:before="0" w:after="120" w:line="276" w:lineRule="auto"/>
+      </w:pPr>
+      <w:r>
+        <w:rPr/>
+        <w:t xml:space="preserve">command bar, choose recipients, and send the template.</w:t>
+      </w:r>
+    </w:p>
+    <w:p>
+      <w:pPr>
+        <w:pStyle w:val="Normal"/>
+        <w:spacing w:before="0" w:after="120" w:line="276" w:lineRule="auto"/>
+        <w:ind w:left="540" w:hanging="360"/>
+      </w:pPr>
+      <w:r>
+        <w:rPr>
+          <w:b/>
+        </w:rPr>
+        <w:t xml:space="preserve">• </w:t>
+      </w:r>
+      <w:r>
+        <w:rPr/>
+        <w:t xml:space="preserve">If the command isn't present, inventory or environment-admin access alone</w:t>
+      </w:r>
+    </w:p>
+    <w:p>
+      <w:pPr>
+        <w:pStyle w:val="Normal"/>
+        <w:spacing w:before="0" w:after="120" w:line="276" w:lineRule="auto"/>
+      </w:pPr>
+      <w:r>
+        <w:rPr/>
+        <w:t xml:space="preserve">wasn't sufficient; use an existing owner/co-owner or explicitly grant the operator co-owner access first.</w:t>
+      </w:r>
+    </w:p>
+    <w:p>
+      <w:pPr>
+        <w:pStyle w:val="Normal"/>
+        <w:spacing w:before="0" w:after="120" w:line="276" w:lineRule="auto"/>
+      </w:pPr>
+      <w:r>
+        <w:rPr/>
+        <w:t xml:space="preserve">Power Automate doesn't expose its portal Send a copy operation through the supported Power Automate Management connector. The app deliberately uses the documented portal workflow instead of an undocumented API or an administrator-owned clone.</w:t>
       </w:r>
     </w:p>
     <w:p>
@@ -5153,7 +5795,7 @@
       </w:r>
       <w:r>
         <w:rPr/>
-        <w:t xml:space="preserve">Review recovery results after each batch.</w:t>
+        <w:t xml:space="preserve">Review co-owner assignment results after each batch.</w:t>
       </w:r>
     </w:p>
     <w:p>
@@ -5692,6 +6334,325 @@
               <w:spacing w:after="40"/>
             </w:pPr>
             <w:r>
+              <w:rPr/>
+              <w:t xml:space="preserve">Dataverse environment is missing</w:t>
+            </w:r>
+          </w:p>
+        </w:tc>
+        <w:tc>
+          <w:tcPr>
+            <w:tcW w:w="3000" w:type="dxa"/>
+            <w:vAlign w:val="center"/>
+          </w:tcPr>
+          <w:p>
+            <w:pPr>
+              <w:pStyle w:val="TableText"/>
+              <w:spacing w:after="40"/>
+            </w:pPr>
+            <w:r>
+              <w:rPr/>
+              <w:t xml:space="preserve">One environment-discovery source failed or inventory hasn't propagated</w:t>
+            </w:r>
+          </w:p>
+        </w:tc>
+        <w:tc>
+          <w:tcPr>
+            <w:tcW w:w="3000" w:type="dxa"/>
+            <w:vAlign w:val="center"/>
+          </w:tcPr>
+          <w:p>
+            <w:pPr>
+              <w:pStyle w:val="TableText"/>
+              <w:spacing w:after="40"/>
+            </w:pPr>
+            <w:r>
+              <w:rPr/>
+              <w:t xml:space="preserve">Review </w:t>
+            </w:r>
+            <w:r>
+              <w:rPr>
+                <w:b/>
+              </w:rPr>
+              <w:t xml:space="preserve">Scan notes and exceptions</w:t>
+            </w:r>
+            <w:r>
+              <w:rPr/>
+              <w:t xml:space="preserve">, verify both admin connections, wait 15 minutes, and scan again; flow-referenced environments are added with an ID-based fallback</w:t>
+            </w:r>
+          </w:p>
+        </w:tc>
+      </w:tr>
+      <w:tr>
+        <w:tc>
+          <w:tcPr>
+            <w:tcW w:w="3000" w:type="dxa"/>
+            <w:vAlign w:val="center"/>
+          </w:tcPr>
+          <w:p>
+            <w:pPr>
+              <w:pStyle w:val="TableText"/>
+              <w:spacing w:after="40"/>
+            </w:pPr>
+            <w:r>
+              <w:rPr/>
+              <w:t xml:space="preserve">A non-Dataverse environment shows Dataverse</w:t>
+            </w:r>
+          </w:p>
+        </w:tc>
+        <w:tc>
+          <w:tcPr>
+            <w:tcW w:w="3000" w:type="dxa"/>
+            <w:vAlign w:val="center"/>
+          </w:tcPr>
+          <w:p>
+            <w:pPr>
+              <w:pStyle w:val="TableText"/>
+              <w:spacing w:after="40"/>
+            </w:pPr>
+            <w:r>
+              <w:rPr/>
+              <w:t xml:space="preserve">An older build inferred environment state from flow-level </w:t>
+            </w:r>
+            <w:r>
+              <w:rPr>
+                <w:rFonts w:ascii="Consolas" w:hAnsi="Consolas"/>
+                <w:sz w:val="18"/>
+                <w:szCs w:val="18"/>
+                <w:shd w:val="clear" w:color="auto" w:fill="F3F4F6"/>
+              </w:rPr>
+              <w:t xml:space="preserve">workflowEntityId</w:t>
+            </w:r>
+          </w:p>
+        </w:tc>
+        <w:tc>
+          <w:tcPr>
+            <w:tcW w:w="3000" w:type="dxa"/>
+            <w:vAlign w:val="center"/>
+          </w:tcPr>
+          <w:p>
+            <w:pPr>
+              <w:pStyle w:val="TableText"/>
+              <w:spacing w:after="40"/>
+            </w:pPr>
+            <w:r>
+              <w:rPr/>
+              <w:t xml:space="preserve">Upgrade to the current build and scan again; only expanded linked-environment metadata now determines the badge</w:t>
+            </w:r>
+          </w:p>
+        </w:tc>
+      </w:tr>
+      <w:tr>
+        <w:tc>
+          <w:tcPr>
+            <w:tcW w:w="3000" w:type="dxa"/>
+            <w:vAlign w:val="center"/>
+          </w:tcPr>
+          <w:p>
+            <w:pPr>
+              <w:pStyle w:val="TableText"/>
+              <w:spacing w:after="40"/>
+            </w:pPr>
+            <w:r>
+              <w:rPr/>
+              <w:t xml:space="preserve">Database status shows Unknown</w:t>
+            </w:r>
+          </w:p>
+        </w:tc>
+        <w:tc>
+          <w:tcPr>
+            <w:tcW w:w="3000" w:type="dxa"/>
+            <w:vAlign w:val="center"/>
+          </w:tcPr>
+          <w:p>
+            <w:pPr>
+              <w:pStyle w:val="TableText"/>
+              <w:spacing w:after="40"/>
+            </w:pPr>
+            <w:r>
+              <w:rPr/>
+              <w:t xml:space="preserve">Expanded admin environment metadata wasn't available</w:t>
+            </w:r>
+          </w:p>
+        </w:tc>
+        <w:tc>
+          <w:tcPr>
+            <w:tcW w:w="3000" w:type="dxa"/>
+            <w:vAlign w:val="center"/>
+          </w:tcPr>
+          <w:p>
+            <w:pPr>
+              <w:pStyle w:val="TableText"/>
+              <w:spacing w:after="40"/>
+            </w:pPr>
+            <w:r>
+              <w:rPr/>
+              <w:t xml:space="preserve">Repair the Power Platform for Admins connection and scan again</w:t>
+            </w:r>
+          </w:p>
+        </w:tc>
+      </w:tr>
+      <w:tr>
+        <w:tc>
+          <w:tcPr>
+            <w:tcW w:w="3000" w:type="dxa"/>
+            <w:vAlign w:val="center"/>
+          </w:tcPr>
+          <w:p>
+            <w:pPr>
+              <w:pStyle w:val="TableText"/>
+              <w:spacing w:after="40"/>
+            </w:pPr>
+            <w:r>
+              <w:rPr/>
+              <w:t xml:space="preserve">Send a copy is disabled</w:t>
+            </w:r>
+          </w:p>
+        </w:tc>
+        <w:tc>
+          <w:tcPr>
+            <w:tcW w:w="3000" w:type="dxa"/>
+            <w:vAlign w:val="center"/>
+          </w:tcPr>
+          <w:p>
+            <w:pPr>
+              <w:pStyle w:val="TableText"/>
+              <w:spacing w:after="40"/>
+            </w:pPr>
+            <w:r>
+              <w:rPr/>
+              <w:t xml:space="preserve">Zero or multiple flows are selected, or the selected flow is solution-aware</w:t>
+            </w:r>
+          </w:p>
+        </w:tc>
+        <w:tc>
+          <w:tcPr>
+            <w:tcW w:w="3000" w:type="dxa"/>
+            <w:vAlign w:val="center"/>
+          </w:tcPr>
+          <w:p>
+            <w:pPr>
+              <w:pStyle w:val="TableText"/>
+              <w:spacing w:after="40"/>
+            </w:pPr>
+            <w:r>
+              <w:rPr/>
+              <w:t xml:space="preserve">Select exactly one non-solution flow; use Save As or solution export/import for a solution-aware flow</w:t>
+            </w:r>
+          </w:p>
+        </w:tc>
+      </w:tr>
+      <w:tr>
+        <w:tc>
+          <w:tcPr>
+            <w:tcW w:w="3000" w:type="dxa"/>
+            <w:vAlign w:val="center"/>
+          </w:tcPr>
+          <w:p>
+            <w:pPr>
+              <w:pStyle w:val="TableText"/>
+              <w:spacing w:after="40"/>
+            </w:pPr>
+            <w:r>
+              <w:rPr/>
+              <w:t xml:space="preserve">Flow opens but Send a copy isn't shown</w:t>
+            </w:r>
+          </w:p>
+        </w:tc>
+        <w:tc>
+          <w:tcPr>
+            <w:tcW w:w="3000" w:type="dxa"/>
+            <w:vAlign w:val="center"/>
+          </w:tcPr>
+          <w:p>
+            <w:pPr>
+              <w:pStyle w:val="TableText"/>
+              <w:spacing w:after="40"/>
+            </w:pPr>
+            <w:r>
+              <w:rPr/>
+              <w:t xml:space="preserve">The signed-in operator isn't an owner or co-owner of the flow</w:t>
+            </w:r>
+          </w:p>
+        </w:tc>
+        <w:tc>
+          <w:tcPr>
+            <w:tcW w:w="3000" w:type="dxa"/>
+            <w:vAlign w:val="center"/>
+          </w:tcPr>
+          <w:p>
+            <w:pPr>
+              <w:pStyle w:val="TableText"/>
+              <w:spacing w:after="40"/>
+            </w:pPr>
+            <w:r>
+              <w:rPr/>
+              <w:t xml:space="preserve">Have an existing owner/co-owner send the copy, or grant the operator co-owner access first</w:t>
+            </w:r>
+          </w:p>
+        </w:tc>
+      </w:tr>
+      <w:tr>
+        <w:tc>
+          <w:tcPr>
+            <w:tcW w:w="3000" w:type="dxa"/>
+            <w:vAlign w:val="center"/>
+          </w:tcPr>
+          <w:p>
+            <w:pPr>
+              <w:pStyle w:val="TableText"/>
+              <w:spacing w:after="40"/>
+            </w:pPr>
+            <w:r>
+              <w:rPr/>
+              <w:t xml:space="preserve">Recipient can't use the copied flow</w:t>
+            </w:r>
+          </w:p>
+        </w:tc>
+        <w:tc>
+          <w:tcPr>
+            <w:tcW w:w="3000" w:type="dxa"/>
+            <w:vAlign w:val="center"/>
+          </w:tcPr>
+          <w:p>
+            <w:pPr>
+              <w:pStyle w:val="TableText"/>
+              <w:spacing w:after="40"/>
+            </w:pPr>
+            <w:r>
+              <w:rPr/>
+              <w:t xml:space="preserve">The independent copy needs recipient-owned connections or contains environment-specific values</w:t>
+            </w:r>
+          </w:p>
+        </w:tc>
+        <w:tc>
+          <w:tcPr>
+            <w:tcW w:w="3000" w:type="dxa"/>
+            <w:vAlign w:val="center"/>
+          </w:tcPr>
+          <w:p>
+            <w:pPr>
+              <w:pStyle w:val="TableText"/>
+              <w:spacing w:after="40"/>
+            </w:pPr>
+            <w:r>
+              <w:rPr/>
+              <w:t xml:space="preserve">Have the recipient create/select their connections and review hard-coded IDs, URLs, email addresses, and other environment-specific configuration</w:t>
+            </w:r>
+          </w:p>
+        </w:tc>
+      </w:tr>
+      <w:tr>
+        <w:tc>
+          <w:tcPr>
+            <w:tcW w:w="3000" w:type="dxa"/>
+            <w:vAlign w:val="center"/>
+          </w:tcPr>
+          <w:p>
+            <w:pPr>
+              <w:pStyle w:val="TableText"/>
+              <w:spacing w:after="40"/>
+            </w:pPr>
+            <w:r>
               <w:rPr>
                 <w:rFonts w:ascii="Consolas" w:hAnsi="Consolas"/>
                 <w:sz w:val="18"/>
@@ -5748,7 +6709,7 @@
             </w:pPr>
             <w:r>
               <w:rPr/>
-              <w:t xml:space="preserve">Recovery succeeds but deleted owner remains listed</w:t>
+              <w:t xml:space="preserve">Co-owner assignment succeeds but deleted owner remains listed</w:t>
             </w:r>
           </w:p>
         </w:tc>
@@ -5780,7 +6741,7 @@
             </w:pPr>
             <w:r>
               <w:rPr/>
-              <w:t xml:space="preserve">Verify the recovery co-owner was added; change solution-aware primary ownership separately if required</w:t>
+              <w:t xml:space="preserve">Verify the co-owner was added; change solution-aware primary ownership separately if required</w:t>
             </w:r>
           </w:p>
         </w:tc>
@@ -6153,7 +7114,7 @@
       </w:r>
       <w:r>
         <w:rPr/>
-        <w:t xml:space="preserve">To reverse a recovery co-owner, use the supported Power Automate sharing or</w:t>
+        <w:t xml:space="preserve">To remove an assigned co-owner, use the supported Power Automate sharing or</w:t>
       </w:r>
     </w:p>
     <w:p>
@@ -6499,7 +7460,24 @@
       </w:r>
       <w:r>
         <w:rPr/>
-        <w:t xml:space="preserve">Recovery preview is validated with a test flow</w:t>
+        <w:t xml:space="preserve">Co-owner assignment preview is validated with a test flow</w:t>
+      </w:r>
+    </w:p>
+    <w:p>
+      <w:pPr>
+        <w:pStyle w:val="Normal"/>
+        <w:spacing w:before="0" w:after="120" w:line="276" w:lineRule="auto"/>
+        <w:ind w:left="540" w:hanging="360"/>
+      </w:pPr>
+      <w:r>
+        <w:rPr>
+          <w:b/>
+        </w:rPr>
+        <w:t xml:space="preserve">[ ] </w:t>
+      </w:r>
+      <w:r>
+        <w:rPr/>
+        <w:t xml:space="preserve">Send a copy opens the selected test flow in the GCC maker portal</w:t>
       </w:r>
     </w:p>
     <w:p>
@@ -6671,6 +7649,111 @@
           <w:rPr>
             <w:rStyle w:val="Hyperlink"/>
           </w:rPr>
+          <w:t xml:space="preserve">Power Platform inventory schema</w:t>
+        </w:r>
+      </w:hyperlink>
+    </w:p>
+    <w:p>
+      <w:pPr>
+        <w:pStyle w:val="Normal"/>
+        <w:spacing w:before="0" w:after="120" w:line="276" w:lineRule="auto"/>
+        <w:ind w:left="540" w:hanging="360"/>
+      </w:pPr>
+      <w:r>
+        <w:rPr>
+          <w:b/>
+        </w:rPr>
+        <w:t xml:space="preserve">• </w:t>
+      </w:r>
+      <w:hyperlink r:id="rId16">
+        <w:r>
+          <w:rPr>
+            <w:rStyle w:val="Hyperlink"/>
+          </w:rPr>
+          <w:t xml:space="preserve">Power Platform inventory API</w:t>
+        </w:r>
+      </w:hyperlink>
+    </w:p>
+    <w:p>
+      <w:pPr>
+        <w:pStyle w:val="Normal"/>
+        <w:spacing w:before="0" w:after="120" w:line="276" w:lineRule="auto"/>
+        <w:ind w:left="540" w:hanging="360"/>
+      </w:pPr>
+      <w:r>
+        <w:rPr>
+          <w:b/>
+        </w:rPr>
+        <w:t xml:space="preserve">• </w:t>
+      </w:r>
+      <w:hyperlink r:id="rId17">
+        <w:r>
+          <w:rPr>
+            <w:rStyle w:val="Hyperlink"/>
+          </w:rPr>
+          <w:t xml:space="preserve">Share a cloud flow</w:t>
+        </w:r>
+      </w:hyperlink>
+    </w:p>
+    <w:p>
+      <w:pPr>
+        <w:pStyle w:val="Normal"/>
+        <w:spacing w:before="0" w:after="120" w:line="276" w:lineRule="auto"/>
+        <w:ind w:left="540" w:hanging="360"/>
+      </w:pPr>
+      <w:r>
+        <w:rPr>
+          <w:b/>
+        </w:rPr>
+        <w:t xml:space="preserve">• </w:t>
+      </w:r>
+      <w:hyperlink r:id="rId18">
+        <w:r>
+          <w:rPr>
+            <w:rStyle w:val="Hyperlink"/>
+          </w:rPr>
+          <w:t xml:space="preserve">Duplicate a solution-aware cloud flow using Save As</w:t>
+        </w:r>
+      </w:hyperlink>
+    </w:p>
+    <w:p>
+      <w:pPr>
+        <w:pStyle w:val="Normal"/>
+        <w:spacing w:before="0" w:after="120" w:line="276" w:lineRule="auto"/>
+        <w:ind w:left="540" w:hanging="360"/>
+      </w:pPr>
+      <w:r>
+        <w:rPr>
+          <w:b/>
+        </w:rPr>
+        <w:t xml:space="preserve">• </w:t>
+      </w:r>
+      <w:hyperlink r:id="rId19">
+        <w:r>
+          <w:rPr>
+            <w:rStyle w:val="Hyperlink"/>
+          </w:rPr>
+          <w:t xml:space="preserve">Power Automate US Government service URLs</w:t>
+        </w:r>
+      </w:hyperlink>
+    </w:p>
+    <w:p>
+      <w:pPr>
+        <w:pStyle w:val="Normal"/>
+        <w:spacing w:before="0" w:after="120" w:line="276" w:lineRule="auto"/>
+        <w:ind w:left="540" w:hanging="360"/>
+      </w:pPr>
+      <w:r>
+        <w:rPr>
+          <w:b/>
+        </w:rPr>
+        <w:t xml:space="preserve">• </w:t>
+      </w:r>
+      <w:hyperlink r:id="rId20">
+        <w:r>
+          <w:rPr>
+            <w:rStyle w:val="Hyperlink"/>
+          </w:rPr>
           <w:t xml:space="preserve">Manage orphaned flows when the owner leaves</w:t>
         </w:r>
       </w:hyperlink>
@@ -6687,7 +7770,7 @@
         </w:rPr>
         <w:t xml:space="preserve">• </w:t>
       </w:r>
-      <w:hyperlink r:id="rId16">
+      <w:hyperlink r:id="rId21">
         <w:r>
           <w:rPr>
             <w:rStyle w:val="Hyperlink"/>

</xml_diff>

<commit_message>
Release v1.1.1 flow inventory enhancements
Add scanned additional co-owners and latest available flow run dates, refresh deployment guidance, and package solution version 1.1.1.0.

Co-authored-by: Copilot <223556219+Copilot@users.noreply.github.com>
</commit_message>
<xml_diff>
--- a/Orphaned Flow Finder - Deployment and Tenant Onboarding Guide.docx
+++ b/Orphaned Flow Finder - Deployment and Tenant Onboarding Guide.docx
@@ -276,7 +276,7 @@
           <w:szCs w:val="18"/>
           <w:shd w:val="clear" w:color="auto" w:fill="F3F4F6"/>
         </w:rPr>
-        <w:t xml:space="preserve">solutions/OrphanedFlowFinder_1_1_0_0_managed.zip</w:t>
+        <w:t xml:space="preserve">solutions/OrphanedFlowFinder_1_1_1_0_managed.zip</w:t>
       </w:r>
       <w:r>
         <w:rPr/>
@@ -577,6 +577,40 @@
       </w:r>
       <w:r>
         <w:rPr/>
+        <w:t xml:space="preserve">Lists additional flow co-owners from current owner permissions.</w:t>
+      </w:r>
+    </w:p>
+    <w:p>
+      <w:pPr>
+        <w:pStyle w:val="Normal"/>
+        <w:spacing w:before="0" w:after="120" w:line="276" w:lineRule="auto"/>
+        <w:ind w:left="540" w:hanging="360"/>
+      </w:pPr>
+      <w:r>
+        <w:rPr>
+          <w:b/>
+        </w:rPr>
+        <w:t xml:space="preserve">7. </w:t>
+      </w:r>
+      <w:r>
+        <w:rPr/>
+        <w:t xml:space="preserve">Loads the latest available flow run start time for supported flows.</w:t>
+      </w:r>
+    </w:p>
+    <w:p>
+      <w:pPr>
+        <w:pStyle w:val="Normal"/>
+        <w:spacing w:before="0" w:after="120" w:line="276" w:lineRule="auto"/>
+        <w:ind w:left="540" w:hanging="360"/>
+      </w:pPr>
+      <w:r>
+        <w:rPr>
+          <w:b/>
+        </w:rPr>
+        <w:t xml:space="preserve">8. </w:t>
+      </w:r>
+      <w:r>
+        <w:rPr/>
         <w:t xml:space="preserve">Identifies Dataverse database status and solution-aware flows when the</w:t>
       </w:r>
     </w:p>
@@ -600,7 +634,7 @@
         <w:rPr>
           <w:b/>
         </w:rPr>
-        <w:t xml:space="preserve">7. </w:t>
+        <w:t xml:space="preserve">9. </w:t>
       </w:r>
       <w:r>
         <w:rPr/>
@@ -617,7 +651,7 @@
         <w:rPr>
           <w:b/>
         </w:rPr>
-        <w:t xml:space="preserve">8. </w:t>
+        <w:t xml:space="preserve">10. </w:t>
       </w:r>
       <w:r>
         <w:rPr/>
@@ -644,7 +678,7 @@
         <w:rPr>
           <w:b/>
         </w:rPr>
-        <w:t xml:space="preserve">9. </w:t>
+        <w:t xml:space="preserve">11. </w:t>
       </w:r>
       <w:r>
         <w:rPr/>
@@ -678,7 +712,7 @@
       </w:pPr>
       <w:r>
         <w:rPr/>
-        <w:t xml:space="preserve">Tenant scanning and directory validation are read-only. The only write operation adds a co-owner after the operator reviews the affected flows and selects an explicit confirmation check box. The Send a copy handoff performs no write in this app.</w:t>
+        <w:t xml:space="preserve">Tenant scanning, owner-permission inventory, flow run lookup, and directory validation are read-only. The only write operation adds a co-owner after the operator reviews the affected flows and selects an explicit confirmation check box. The Send a copy handoff performs no write in this app.</w:t>
       </w:r>
     </w:p>
     <w:p>
@@ -907,7 +941,7 @@
             </w:pPr>
             <w:r>
               <w:rPr/>
-              <w:t xml:space="preserve">Queries GCC environment and cloud flow inventory</w:t>
+              <w:t xml:space="preserve">Queries GCC environment/flow inventory and supported flow run history</w:t>
             </w:r>
           </w:p>
         </w:tc>
@@ -1049,7 +1083,7 @@
             </w:pPr>
             <w:r>
               <w:rPr/>
-              <w:t xml:space="preserve">Adds a confirmed flow co-owner as admin</w:t>
+              <w:t xml:space="preserve">Reads owner permissions and adds a confirmed flow co-owner as admin</w:t>
             </w:r>
           </w:p>
         </w:tc>
@@ -3342,7 +3376,7 @@
           <w:szCs w:val="18"/>
           <w:shd w:val="clear" w:color="auto" w:fill="F3F4F6"/>
         </w:rPr>
-        <w:t xml:space="preserve">solutions/OrphanedFlowFinder_1_1_0_0_managed.zip</w:t>
+        <w:t xml:space="preserve">solutions/OrphanedFlowFinder_1_1_1_0_managed.zip</w:t>
       </w:r>
     </w:p>
     <w:p>
@@ -3364,7 +3398,7 @@
           <w:szCs w:val="18"/>
           <w:shd w:val="clear" w:color="auto" w:fill="F3F4F6"/>
         </w:rPr>
-        <w:t xml:space="preserve">solutions/OrphanedFlowFinder_1_1_0_0_unmanaged.zip</w:t>
+        <w:t xml:space="preserve">solutions/OrphanedFlowFinder_1_1_1_0_unmanaged.zip</w:t>
       </w:r>
     </w:p>
     <w:p>
@@ -4261,7 +4295,7 @@
           <w:szCs w:val="18"/>
           <w:shd w:val="clear" w:color="auto" w:fill="F3F4F6"/>
         </w:rPr>
-        <w:t xml:space="preserve">OrphanedFlowFinder_1_1_0_0_managed.zip</w:t>
+        <w:t xml:space="preserve">OrphanedFlowFinder_1_1_1_0_managed.zip</w:t>
       </w:r>
       <w:r>
         <w:rPr/>
@@ -5078,6 +5112,33 @@
       </w:r>
       <w:r>
         <w:rPr/>
+        <w:t xml:space="preserve">The result table and CSV include additional co-owners and the latest</w:t>
+      </w:r>
+    </w:p>
+    <w:p>
+      <w:pPr>
+        <w:pStyle w:val="Normal"/>
+        <w:spacing w:before="0" w:after="120" w:line="276" w:lineRule="auto"/>
+      </w:pPr>
+      <w:r>
+        <w:rPr/>
+        <w:t xml:space="preserve">available flow run time.</w:t>
+      </w:r>
+    </w:p>
+    <w:p>
+      <w:pPr>
+        <w:pStyle w:val="Normal"/>
+        <w:spacing w:before="0" w:after="120" w:line="276" w:lineRule="auto"/>
+        <w:ind w:left="540" w:hanging="360"/>
+      </w:pPr>
+      <w:r>
+        <w:rPr>
+          <w:b/>
+        </w:rPr>
+        <w:t xml:space="preserve">• </w:t>
+      </w:r>
+      <w:r>
+        <w:rPr/>
         <w:t xml:space="preserve">CSV export contains only the filtered rows.</w:t>
       </w:r>
     </w:p>
@@ -5718,6 +5779,23 @@
       <w:r>
         <w:rPr/>
         <w:t xml:space="preserve">administrative data.</w:t>
+      </w:r>
+    </w:p>
+    <w:p>
+      <w:pPr>
+        <w:pStyle w:val="Normal"/>
+        <w:spacing w:before="0" w:after="120" w:line="276" w:lineRule="auto"/>
+        <w:ind w:left="540" w:hanging="360"/>
+      </w:pPr>
+      <w:r>
+        <w:rPr>
+          <w:b/>
+        </w:rPr>
+        <w:t xml:space="preserve">• </w:t>
+      </w:r>
+      <w:r>
+        <w:rPr/>
+        <w:t xml:space="preserve">Treat co-owner identities and flow run timestamps as administrative data.</w:t>
       </w:r>
     </w:p>
     <w:p>
@@ -6268,6 +6346,185 @@
             <w:r>
               <w:rPr/>
               <w:t xml:space="preserve">Repair the Office 365 Users connection and scan again</w:t>
+            </w:r>
+          </w:p>
+        </w:tc>
+      </w:tr>
+      <w:tr>
+        <w:tc>
+          <w:tcPr>
+            <w:tcW w:w="3000" w:type="dxa"/>
+            <w:vAlign w:val="center"/>
+          </w:tcPr>
+          <w:p>
+            <w:pPr>
+              <w:pStyle w:val="TableText"/>
+              <w:spacing w:after="40"/>
+            </w:pPr>
+            <w:r>
+              <w:rPr/>
+              <w:t xml:space="preserve">Additional co-owners show Lookup failed</w:t>
+            </w:r>
+          </w:p>
+        </w:tc>
+        <w:tc>
+          <w:tcPr>
+            <w:tcW w:w="3000" w:type="dxa"/>
+            <w:vAlign w:val="center"/>
+          </w:tcPr>
+          <w:p>
+            <w:pPr>
+              <w:pStyle w:val="TableText"/>
+              <w:spacing w:after="40"/>
+            </w:pPr>
+            <w:r>
+              <w:rPr/>
+              <w:t xml:space="preserve">Power Automate Management couldn't read that flow's owner permissions</w:t>
+            </w:r>
+          </w:p>
+        </w:tc>
+        <w:tc>
+          <w:tcPr>
+            <w:tcW w:w="3000" w:type="dxa"/>
+            <w:vAlign w:val="center"/>
+          </w:tcPr>
+          <w:p>
+            <w:pPr>
+              <w:pStyle w:val="TableText"/>
+              <w:spacing w:after="40"/>
+            </w:pPr>
+            <w:r>
+              <w:rPr/>
+              <w:t xml:space="preserve">Review </w:t>
+            </w:r>
+            <w:r>
+              <w:rPr>
+                <w:b/>
+              </w:rPr>
+              <w:t xml:space="preserve">Scan notes and exceptions</w:t>
+            </w:r>
+            <w:r>
+              <w:rPr/>
+              <w:t xml:space="preserve">, repair the Power Automate Management connection, verify admin access, and scan again</w:t>
+            </w:r>
+          </w:p>
+        </w:tc>
+      </w:tr>
+      <w:tr>
+        <w:tc>
+          <w:tcPr>
+            <w:tcW w:w="3000" w:type="dxa"/>
+            <w:vAlign w:val="center"/>
+          </w:tcPr>
+          <w:p>
+            <w:pPr>
+              <w:pStyle w:val="TableText"/>
+              <w:spacing w:after="40"/>
+            </w:pPr>
+            <w:r>
+              <w:rPr/>
+              <w:t xml:space="preserve">Last flow run shows Not available</w:t>
+            </w:r>
+          </w:p>
+        </w:tc>
+        <w:tc>
+          <w:tcPr>
+            <w:tcW w:w="3000" w:type="dxa"/>
+            <w:vAlign w:val="center"/>
+          </w:tcPr>
+          <w:p>
+            <w:pPr>
+              <w:pStyle w:val="TableText"/>
+              <w:spacing w:after="40"/>
+            </w:pPr>
+            <w:r>
+              <w:rPr/>
+              <w:t xml:space="preserve">The environment has no confirmed Dataverse database or the flow has no </w:t>
+            </w:r>
+            <w:r>
+              <w:rPr>
+                <w:rFonts w:ascii="Consolas" w:hAnsi="Consolas"/>
+                <w:sz w:val="18"/>
+                <w:szCs w:val="18"/>
+                <w:shd w:val="clear" w:color="auto" w:fill="F3F4F6"/>
+              </w:rPr>
+              <w:t xml:space="preserve">workflowEntityId</w:t>
+            </w:r>
+          </w:p>
+        </w:tc>
+        <w:tc>
+          <w:tcPr>
+            <w:tcW w:w="3000" w:type="dxa"/>
+            <w:vAlign w:val="center"/>
+          </w:tcPr>
+          <w:p>
+            <w:pPr>
+              <w:pStyle w:val="TableText"/>
+              <w:spacing w:after="40"/>
+            </w:pPr>
+            <w:r>
+              <w:rPr/>
+              <w:t xml:space="preserve">Expected for unsupported rows; use the flow details experience if run history is required</w:t>
+            </w:r>
+          </w:p>
+        </w:tc>
+      </w:tr>
+      <w:tr>
+        <w:tc>
+          <w:tcPr>
+            <w:tcW w:w="3000" w:type="dxa"/>
+            <w:vAlign w:val="center"/>
+          </w:tcPr>
+          <w:p>
+            <w:pPr>
+              <w:pStyle w:val="TableText"/>
+              <w:spacing w:after="40"/>
+            </w:pPr>
+            <w:r>
+              <w:rPr/>
+              <w:t xml:space="preserve">Last flow run shows Lookup failed</w:t>
+            </w:r>
+          </w:p>
+        </w:tc>
+        <w:tc>
+          <w:tcPr>
+            <w:tcW w:w="3000" w:type="dxa"/>
+            <w:vAlign w:val="center"/>
+          </w:tcPr>
+          <w:p>
+            <w:pPr>
+              <w:pStyle w:val="TableText"/>
+              <w:spacing w:after="40"/>
+            </w:pPr>
+            <w:r>
+              <w:rPr/>
+              <w:t xml:space="preserve">The supported Power Platform flow-runs request failed or returned an unreadable response</w:t>
+            </w:r>
+          </w:p>
+        </w:tc>
+        <w:tc>
+          <w:tcPr>
+            <w:tcW w:w="3000" w:type="dxa"/>
+            <w:vAlign w:val="center"/>
+          </w:tcPr>
+          <w:p>
+            <w:pPr>
+              <w:pStyle w:val="TableText"/>
+              <w:spacing w:after="40"/>
+            </w:pPr>
+            <w:r>
+              <w:rPr/>
+              <w:t xml:space="preserve">Review </w:t>
+            </w:r>
+            <w:r>
+              <w:rPr>
+                <w:b/>
+              </w:rPr>
+              <w:t xml:space="preserve">Scan notes and exceptions</w:t>
+            </w:r>
+            <w:r>
+              <w:rPr/>
+              <w:t xml:space="preserve">, verify the GCC HTTP connection, and scan again</w:t>
             </w:r>
           </w:p>
         </w:tc>

</xml_diff>

<commit_message>
Release v1.1.2 GCC lookup fixes
Resolve co-owner names, retrieve last-run timestamps through the GCC Flow admin API, and keep tenant scans fast with page-scoped details.

Co-authored-by: Copilot <223556219+Copilot@users.noreply.github.com>
</commit_message>
<xml_diff>
--- a/Orphaned Flow Finder - Deployment and Tenant Onboarding Guide.docx
+++ b/Orphaned Flow Finder - Deployment and Tenant Onboarding Guide.docx
@@ -276,7 +276,7 @@
           <w:szCs w:val="18"/>
           <w:shd w:val="clear" w:color="auto" w:fill="F3F4F6"/>
         </w:rPr>
-        <w:t xml:space="preserve">solutions/OrphanedFlowFinder_1_1_1_0_managed.zip</w:t>
+        <w:t xml:space="preserve">solutions/OrphanedFlowFinder_1_1_2_0_managed.zip</w:t>
       </w:r>
       <w:r>
         <w:rPr/>
@@ -344,7 +344,7 @@
       </w:r>
       <w:r>
         <w:rPr/>
-        <w:t xml:space="preserve">Create the four target connections in section 6.</w:t>
+        <w:t xml:space="preserve">Create the six target connections in section 6.</w:t>
       </w:r>
     </w:p>
     <w:p>
@@ -361,7 +361,7 @@
       </w:r>
       <w:r>
         <w:rPr/>
-        <w:t xml:space="preserve">Import the managed ZIP and map the four connection references as described</w:t>
+        <w:t xml:space="preserve">Import the managed ZIP and map the six connection references as described</w:t>
       </w:r>
     </w:p>
     <w:p>
@@ -577,7 +577,17 @@
       </w:r>
       <w:r>
         <w:rPr/>
-        <w:t xml:space="preserve">Lists additional flow co-owners from current owner permissions.</w:t>
+        <w:t xml:space="preserve">Loads additional flow co-owners for the current result page and resolves</w:t>
+      </w:r>
+    </w:p>
+    <w:p>
+      <w:pPr>
+        <w:pStyle w:val="Normal"/>
+        <w:spacing w:before="0" w:after="120" w:line="276" w:lineRule="auto"/>
+      </w:pPr>
+      <w:r>
+        <w:rPr/>
+        <w:t xml:space="preserve">user object IDs to names through Microsoft Entra ID.</w:t>
       </w:r>
     </w:p>
     <w:p>
@@ -594,7 +604,7 @@
       </w:r>
       <w:r>
         <w:rPr/>
-        <w:t xml:space="preserve">Loads the latest available flow run start time for supported flows.</w:t>
+        <w:t xml:space="preserve">Loads the latest available flow run start time for the current result page.</w:t>
       </w:r>
     </w:p>
     <w:p>
@@ -732,7 +742,7 @@
       </w:pPr>
       <w:r>
         <w:rPr/>
-        <w:t xml:space="preserve">The app requires four connectors.</w:t>
+        <w:t xml:space="preserve">The app requires six connection references across five connectors.</w:t>
       </w:r>
     </w:p>
     <w:tbl>
@@ -904,7 +914,7 @@
             </w:pPr>
             <w:r>
               <w:rPr/>
-              <w:t xml:space="preserve">HTTP with Microsoft Entra ID (preauthorized)</w:t>
+              <w:t xml:space="preserve">HTTP with Microsoft Entra ID (preauthorized) - Inventory API</w:t>
             </w:r>
           </w:p>
         </w:tc>
@@ -941,7 +951,78 @@
             </w:pPr>
             <w:r>
               <w:rPr/>
-              <w:t xml:space="preserve">Queries GCC environment/flow inventory and supported flow run history</w:t>
+              <w:t xml:space="preserve">Queries GCC environment and cloud flow inventory</w:t>
+            </w:r>
+          </w:p>
+        </w:tc>
+        <w:tc>
+          <w:tcPr>
+            <w:tcW w:w="2250" w:type="dxa"/>
+            <w:vAlign w:val="center"/>
+          </w:tcPr>
+          <w:p>
+            <w:pPr>
+              <w:pStyle w:val="TableText"/>
+              <w:spacing w:after="40"/>
+            </w:pPr>
+            <w:r>
+              <w:rPr/>
+              <w:t xml:space="preserve">Shareable connection</w:t>
+            </w:r>
+          </w:p>
+        </w:tc>
+      </w:tr>
+      <w:tr>
+        <w:tc>
+          <w:tcPr>
+            <w:tcW w:w="2250" w:type="dxa"/>
+            <w:vAlign w:val="center"/>
+          </w:tcPr>
+          <w:p>
+            <w:pPr>
+              <w:pStyle w:val="TableText"/>
+              <w:spacing w:after="40"/>
+            </w:pPr>
+            <w:r>
+              <w:rPr/>
+              <w:t xml:space="preserve">HTTP with Microsoft Entra ID (preauthorized) - Flow Admin API</w:t>
+            </w:r>
+          </w:p>
+        </w:tc>
+        <w:tc>
+          <w:tcPr>
+            <w:tcW w:w="2250" w:type="dxa"/>
+            <w:vAlign w:val="center"/>
+          </w:tcPr>
+          <w:p>
+            <w:pPr>
+              <w:pStyle w:val="TableText"/>
+              <w:spacing w:after="40"/>
+            </w:pPr>
+            <w:r>
+              <w:rPr>
+                <w:rFonts w:ascii="Consolas" w:hAnsi="Consolas"/>
+                <w:sz w:val="18"/>
+                <w:szCs w:val="18"/>
+                <w:shd w:val="clear" w:color="auto" w:fill="F3F4F6"/>
+              </w:rPr>
+              <w:t xml:space="preserve">shared_webcontents</w:t>
+            </w:r>
+          </w:p>
+        </w:tc>
+        <w:tc>
+          <w:tcPr>
+            <w:tcW w:w="2250" w:type="dxa"/>
+            <w:vAlign w:val="center"/>
+          </w:tcPr>
+          <w:p>
+            <w:pPr>
+              <w:pStyle w:val="TableText"/>
+              <w:spacing w:after="40"/>
+            </w:pPr>
+            <w:r>
+              <w:rPr/>
+              <w:t xml:space="preserve">Reads the latest run through the GCC Flow admin API</w:t>
             </w:r>
           </w:p>
         </w:tc>
@@ -1012,7 +1093,78 @@
             </w:pPr>
             <w:r>
               <w:rPr/>
-              <w:t xml:space="preserve">Validates owner IDs and searches active co-owners</w:t>
+              <w:t xml:space="preserve">Validates owner IDs, resolves co-owner names, and searches recovery users</w:t>
+            </w:r>
+          </w:p>
+        </w:tc>
+        <w:tc>
+          <w:tcPr>
+            <w:tcW w:w="2250" w:type="dxa"/>
+            <w:vAlign w:val="center"/>
+          </w:tcPr>
+          <w:p>
+            <w:pPr>
+              <w:pStyle w:val="TableText"/>
+              <w:spacing w:after="40"/>
+            </w:pPr>
+            <w:r>
+              <w:rPr/>
+              <w:t xml:space="preserve">Per-user/nonshareable</w:t>
+            </w:r>
+          </w:p>
+        </w:tc>
+      </w:tr>
+      <w:tr>
+        <w:tc>
+          <w:tcPr>
+            <w:tcW w:w="2250" w:type="dxa"/>
+            <w:vAlign w:val="center"/>
+          </w:tcPr>
+          <w:p>
+            <w:pPr>
+              <w:pStyle w:val="TableText"/>
+              <w:spacing w:after="40"/>
+            </w:pPr>
+            <w:r>
+              <w:rPr/>
+              <w:t xml:space="preserve">Power Automate for Admins</w:t>
+            </w:r>
+          </w:p>
+        </w:tc>
+        <w:tc>
+          <w:tcPr>
+            <w:tcW w:w="2250" w:type="dxa"/>
+            <w:vAlign w:val="center"/>
+          </w:tcPr>
+          <w:p>
+            <w:pPr>
+              <w:pStyle w:val="TableText"/>
+              <w:spacing w:after="40"/>
+            </w:pPr>
+            <w:r>
+              <w:rPr>
+                <w:rFonts w:ascii="Consolas" w:hAnsi="Consolas"/>
+                <w:sz w:val="18"/>
+                <w:szCs w:val="18"/>
+                <w:shd w:val="clear" w:color="auto" w:fill="F3F4F6"/>
+              </w:rPr>
+              <w:t xml:space="preserve">shared_microsoftflowforadmins</w:t>
+            </w:r>
+          </w:p>
+        </w:tc>
+        <w:tc>
+          <w:tcPr>
+            <w:tcW w:w="2250" w:type="dxa"/>
+            <w:vAlign w:val="center"/>
+          </w:tcPr>
+          <w:p>
+            <w:pPr>
+              <w:pStyle w:val="TableText"/>
+              <w:spacing w:after="40"/>
+            </w:pPr>
+            <w:r>
+              <w:rPr/>
+              <w:t xml:space="preserve">Reads flow owner permissions for the current page</w:t>
             </w:r>
           </w:p>
         </w:tc>
@@ -1083,7 +1235,7 @@
             </w:pPr>
             <w:r>
               <w:rPr/>
-              <w:t xml:space="preserve">Reads owner permissions and adds a confirmed flow co-owner as admin</w:t>
+              <w:t xml:space="preserve">Adds a confirmed flow co-owner as admin</w:t>
             </w:r>
           </w:p>
         </w:tc>
@@ -1122,17 +1274,17 @@
       </w:pPr>
       <w:r>
         <w:rPr/>
-        <w:t xml:space="preserve">GCC Power Platform API connection</w:t>
-      </w:r>
-    </w:p>
-    <w:p>
-      <w:pPr>
-        <w:pStyle w:val="Normal"/>
-        <w:spacing w:before="0" w:after="120" w:line="276" w:lineRule="auto"/>
-      </w:pPr>
-      <w:r>
-        <w:rPr/>
-        <w:t xml:space="preserve">For the HTTP with Microsoft Entra ID (preauthorized) connection, configure both fields with this exact GCC value:</w:t>
+        <w:t xml:space="preserve">GCC HTTP connection endpoints</w:t>
+      </w:r>
+    </w:p>
+    <w:p>
+      <w:pPr>
+        <w:pStyle w:val="Normal"/>
+        <w:spacing w:before="0" w:after="120" w:line="276" w:lineRule="auto"/>
+      </w:pPr>
+      <w:r>
+        <w:rPr/>
+        <w:t xml:space="preserve">Create two separate HTTP with Microsoft Entra ID (preauthorized) connections:</w:t>
       </w:r>
     </w:p>
     <w:tbl>
@@ -1145,7 +1297,7 @@
       <w:tr>
         <w:tc>
           <w:tcPr>
-            <w:tcW w:w="4500" w:type="dxa"/>
+            <w:tcW w:w="3000" w:type="dxa"/>
             <w:shd w:val="clear" w:color="auto" w:fill="D9EAF7"/>
             <w:vAlign w:val="center"/>
           </w:tcPr>
@@ -1158,13 +1310,13 @@
               <w:rPr>
                 <w:b/>
               </w:rPr>
-              <w:t xml:space="preserve">Field</w:t>
-            </w:r>
-          </w:p>
-        </w:tc>
-        <w:tc>
-          <w:tcPr>
-            <w:tcW w:w="4500" w:type="dxa"/>
+              <w:t xml:space="preserve">Connection</w:t>
+            </w:r>
+          </w:p>
+        </w:tc>
+        <w:tc>
+          <w:tcPr>
+            <w:tcW w:w="3000" w:type="dxa"/>
             <w:shd w:val="clear" w:color="auto" w:fill="D9EAF7"/>
             <w:vAlign w:val="center"/>
           </w:tcPr>
@@ -1177,7 +1329,26 @@
               <w:rPr>
                 <w:b/>
               </w:rPr>
-              <w:t xml:space="preserve">GCC value</w:t>
+              <w:t xml:space="preserve">Base Resource URL</w:t>
+            </w:r>
+          </w:p>
+        </w:tc>
+        <w:tc>
+          <w:tcPr>
+            <w:tcW w:w="3000" w:type="dxa"/>
+            <w:shd w:val="clear" w:color="auto" w:fill="D9EAF7"/>
+            <w:vAlign w:val="center"/>
+          </w:tcPr>
+          <w:p>
+            <w:pPr>
+              <w:pStyle w:val="TableText"/>
+              <w:spacing w:after="40"/>
+            </w:pPr>
+            <w:r>
+              <w:rPr>
+                <w:b/>
+              </w:rPr>
+              <w:t xml:space="preserve">Microsoft Entra ID Resource URI</w:t>
             </w:r>
           </w:p>
         </w:tc>
@@ -1185,23 +1356,23 @@
       <w:tr>
         <w:tc>
           <w:tcPr>
-            <w:tcW w:w="4500" w:type="dxa"/>
-            <w:vAlign w:val="center"/>
-          </w:tcPr>
-          <w:p>
-            <w:pPr>
-              <w:pStyle w:val="TableText"/>
-              <w:spacing w:after="40"/>
-            </w:pPr>
-            <w:r>
-              <w:rPr/>
-              <w:t xml:space="preserve">Base Resource URL</w:t>
-            </w:r>
-          </w:p>
-        </w:tc>
-        <w:tc>
-          <w:tcPr>
-            <w:tcW w:w="4500" w:type="dxa"/>
+            <w:tcW w:w="3000" w:type="dxa"/>
+            <w:vAlign w:val="center"/>
+          </w:tcPr>
+          <w:p>
+            <w:pPr>
+              <w:pStyle w:val="TableText"/>
+              <w:spacing w:after="40"/>
+            </w:pPr>
+            <w:r>
+              <w:rPr/>
+              <w:t xml:space="preserve">Inventory API</w:t>
+            </w:r>
+          </w:p>
+        </w:tc>
+        <w:tc>
+          <w:tcPr>
+            <w:tcW w:w="3000" w:type="dxa"/>
             <w:vAlign w:val="center"/>
           </w:tcPr>
           <w:p>
@@ -1220,27 +1391,9 @@
             </w:r>
           </w:p>
         </w:tc>
-      </w:tr>
-      <w:tr>
-        <w:tc>
-          <w:tcPr>
-            <w:tcW w:w="4500" w:type="dxa"/>
-            <w:vAlign w:val="center"/>
-          </w:tcPr>
-          <w:p>
-            <w:pPr>
-              <w:pStyle w:val="TableText"/>
-              <w:spacing w:after="40"/>
-            </w:pPr>
-            <w:r>
-              <w:rPr/>
-              <w:t xml:space="preserve">Microsoft Entra ID Resource URI</w:t>
-            </w:r>
-          </w:p>
-        </w:tc>
-        <w:tc>
-          <w:tcPr>
-            <w:tcW w:w="4500" w:type="dxa"/>
+        <w:tc>
+          <w:tcPr>
+            <w:tcW w:w="3000" w:type="dxa"/>
             <w:vAlign w:val="center"/>
           </w:tcPr>
           <w:p>
@@ -1260,6 +1413,66 @@
           </w:p>
         </w:tc>
       </w:tr>
+      <w:tr>
+        <w:tc>
+          <w:tcPr>
+            <w:tcW w:w="3000" w:type="dxa"/>
+            <w:vAlign w:val="center"/>
+          </w:tcPr>
+          <w:p>
+            <w:pPr>
+              <w:pStyle w:val="TableText"/>
+              <w:spacing w:after="40"/>
+            </w:pPr>
+            <w:r>
+              <w:rPr/>
+              <w:t xml:space="preserve">Flow Admin API</w:t>
+            </w:r>
+          </w:p>
+        </w:tc>
+        <w:tc>
+          <w:tcPr>
+            <w:tcW w:w="3000" w:type="dxa"/>
+            <w:vAlign w:val="center"/>
+          </w:tcPr>
+          <w:p>
+            <w:pPr>
+              <w:pStyle w:val="TableText"/>
+              <w:spacing w:after="40"/>
+            </w:pPr>
+            <w:r>
+              <w:rPr>
+                <w:rFonts w:ascii="Consolas" w:hAnsi="Consolas"/>
+                <w:sz w:val="18"/>
+                <w:szCs w:val="18"/>
+                <w:shd w:val="clear" w:color="auto" w:fill="F3F4F6"/>
+              </w:rPr>
+              <w:t xml:space="preserve">https://gov.api.flow.microsoft.us</w:t>
+            </w:r>
+          </w:p>
+        </w:tc>
+        <w:tc>
+          <w:tcPr>
+            <w:tcW w:w="3000" w:type="dxa"/>
+            <w:vAlign w:val="center"/>
+          </w:tcPr>
+          <w:p>
+            <w:pPr>
+              <w:pStyle w:val="TableText"/>
+              <w:spacing w:after="40"/>
+            </w:pPr>
+            <w:r>
+              <w:rPr>
+                <w:rFonts w:ascii="Consolas" w:hAnsi="Consolas"/>
+                <w:sz w:val="18"/>
+                <w:szCs w:val="18"/>
+                <w:shd w:val="clear" w:color="auto" w:fill="F3F4F6"/>
+              </w:rPr>
+              <w:t xml:space="preserve">https://gov.service.flow.microsoft.us/</w:t>
+            </w:r>
+          </w:p>
+        </w:tc>
+      </w:tr>
     </w:tbl>
     <w:p>
       <w:pPr>
@@ -1278,7 +1491,7 @@
       </w:pPr>
       <w:r>
         <w:rPr/>
-        <w:t xml:space="preserve">Do not use this GCC endpoint in another cloud.</w:t>
+        <w:t xml:space="preserve">Do not interchange the endpoints or use these GCC values in another cloud.</w:t>
       </w:r>
     </w:p>
     <w:p>
@@ -1351,7 +1564,7 @@
       </w:pPr>
       <w:r>
         <w:rPr/>
-        <w:t xml:space="preserve">Do not distribute an export until the solution contains all four connection references and the Code App has been republished against them.</w:t>
+        <w:t xml:space="preserve">Do not distribute an export until the solution contains all six connection references and the Code App has been republished against them.</w:t>
       </w:r>
     </w:p>
     <w:p>
@@ -1466,7 +1679,7 @@
       </w:r>
       <w:r>
         <w:rPr/>
-        <w:t xml:space="preserve">All four source connections are in Connected status.</w:t>
+        <w:t xml:space="preserve">All six source connections are in Connected status.</w:t>
       </w:r>
     </w:p>
     <w:p>
@@ -1540,7 +1753,7 @@
       </w:pPr>
       <w:r>
         <w:rPr/>
-        <w:t xml:space="preserve">3.2 Create four connection references</w:t>
+        <w:t xml:space="preserve">3.2 Create six connection references</w:t>
       </w:r>
     </w:p>
     <w:p>
@@ -1867,6 +2080,56 @@
             </w:pPr>
             <w:r>
               <w:rPr/>
+              <w:t xml:space="preserve">Orphaned Flow Finder - Flow Admin API</w:t>
+            </w:r>
+          </w:p>
+        </w:tc>
+        <w:tc>
+          <w:tcPr>
+            <w:tcW w:w="3000" w:type="dxa"/>
+            <w:vAlign w:val="center"/>
+          </w:tcPr>
+          <w:p>
+            <w:pPr>
+              <w:pStyle w:val="TableText"/>
+              <w:spacing w:after="40"/>
+            </w:pPr>
+            <w:r>
+              <w:rPr/>
+              <w:t xml:space="preserve">HTTP with Microsoft Entra ID (preauthorized)</w:t>
+            </w:r>
+          </w:p>
+        </w:tc>
+        <w:tc>
+          <w:tcPr>
+            <w:tcW w:w="3000" w:type="dxa"/>
+            <w:vAlign w:val="center"/>
+          </w:tcPr>
+          <w:p>
+            <w:pPr>
+              <w:pStyle w:val="TableText"/>
+              <w:spacing w:after="40"/>
+            </w:pPr>
+            <w:r>
+              <w:rPr/>
+              <w:t xml:space="preserve">The connection configured with the GCC Flow admin URL and resource URI</w:t>
+            </w:r>
+          </w:p>
+        </w:tc>
+      </w:tr>
+      <w:tr>
+        <w:tc>
+          <w:tcPr>
+            <w:tcW w:w="3000" w:type="dxa"/>
+            <w:vAlign w:val="center"/>
+          </w:tcPr>
+          <w:p>
+            <w:pPr>
+              <w:pStyle w:val="TableText"/>
+              <w:spacing w:after="40"/>
+            </w:pPr>
+            <w:r>
+              <w:rPr/>
               <w:t xml:space="preserve">Orphaned Flow Finder - Directory Users</w:t>
             </w:r>
           </w:p>
@@ -1900,6 +2163,56 @@
             <w:r>
               <w:rPr/>
               <w:t xml:space="preserve">A connected directory connection</w:t>
+            </w:r>
+          </w:p>
+        </w:tc>
+      </w:tr>
+      <w:tr>
+        <w:tc>
+          <w:tcPr>
+            <w:tcW w:w="3000" w:type="dxa"/>
+            <w:vAlign w:val="center"/>
+          </w:tcPr>
+          <w:p>
+            <w:pPr>
+              <w:pStyle w:val="TableText"/>
+              <w:spacing w:after="40"/>
+            </w:pPr>
+            <w:r>
+              <w:rPr/>
+              <w:t xml:space="preserve">Orphaned Flow Finder - Power Automate Admins</w:t>
+            </w:r>
+          </w:p>
+        </w:tc>
+        <w:tc>
+          <w:tcPr>
+            <w:tcW w:w="3000" w:type="dxa"/>
+            <w:vAlign w:val="center"/>
+          </w:tcPr>
+          <w:p>
+            <w:pPr>
+              <w:pStyle w:val="TableText"/>
+              <w:spacing w:after="40"/>
+            </w:pPr>
+            <w:r>
+              <w:rPr/>
+              <w:t xml:space="preserve">Power Automate for Admins</w:t>
+            </w:r>
+          </w:p>
+        </w:tc>
+        <w:tc>
+          <w:tcPr>
+            <w:tcW w:w="3000" w:type="dxa"/>
+            <w:vAlign w:val="center"/>
+          </w:tcPr>
+          <w:p>
+            <w:pPr>
+              <w:pStyle w:val="TableText"/>
+              <w:spacing w:after="40"/>
+            </w:pPr>
+            <w:r>
+              <w:rPr/>
+              <w:t xml:space="preserve">A connected admin connection</w:t>
             </w:r>
           </w:p>
         </w:tc>
@@ -2118,7 +2431,7 @@
       </w:pPr>
       <w:r>
         <w:rPr/>
-        <w:t xml:space="preserve">The output must list four references. If it reports </w:t>
+        <w:t xml:space="preserve">The output must list six references. If it reports </w:t>
       </w:r>
       <w:r>
         <w:rPr>
@@ -2353,7 +2666,7 @@
           <w:sz w:val="18"/>
           <w:szCs w:val="18"/>
         </w:rPr>
-        <w:t xml:space="preserve">  --connector shared_office365users `</w:t>
+        <w:t xml:space="preserve">  --connector shared_webcontents `</w:t>
       </w:r>
     </w:p>
     <w:p>
@@ -2369,7 +2682,7 @@
           <w:sz w:val="18"/>
           <w:szCs w:val="18"/>
         </w:rPr>
-        <w:t xml:space="preserve">  --name office365users `</w:t>
+        <w:t xml:space="preserve">  --name webcontents_1 `</w:t>
       </w:r>
     </w:p>
     <w:p>
@@ -2433,7 +2746,7 @@
           <w:sz w:val="18"/>
           <w:szCs w:val="18"/>
         </w:rPr>
-        <w:t xml:space="preserve">  --connector shared_flowmanagement `</w:t>
+        <w:t xml:space="preserve">  --connector shared_office365users `</w:t>
       </w:r>
     </w:p>
     <w:p>
@@ -2449,7 +2762,7 @@
           <w:sz w:val="18"/>
           <w:szCs w:val="18"/>
         </w:rPr>
-        <w:t xml:space="preserve">  --name flowmanagement `</w:t>
+        <w:t xml:space="preserve">  --name office365users `</w:t>
       </w:r>
     </w:p>
     <w:p>
@@ -2470,36 +2783,6 @@
     </w:p>
     <w:p>
       <w:pPr>
-        <w:pStyle w:val="Normal"/>
-        <w:spacing w:before="0" w:after="100" w:line="276" w:lineRule="auto"/>
-      </w:pPr>
-      <w:r>
-        <w:rPr/>
-        <w:t xml:space="preserve"/>
-      </w:r>
-    </w:p>
-    <w:p>
-      <w:pPr>
-        <w:pStyle w:val="Normal"/>
-        <w:spacing w:before="0" w:after="120" w:line="276" w:lineRule="auto"/>
-      </w:pPr>
-      <w:r>
-        <w:rPr/>
-        <w:t xml:space="preserve">Add the data sources back using their solution connection references:</w:t>
-      </w:r>
-    </w:p>
-    <w:p>
-      <w:pPr>
-        <w:pStyle w:val="Normal"/>
-        <w:spacing w:before="0" w:after="20" w:line="276" w:lineRule="auto"/>
-      </w:pPr>
-      <w:r>
-        <w:rPr/>
-        <w:t xml:space="preserve"/>
-      </w:r>
-    </w:p>
-    <w:p>
-      <w:pPr>
         <w:pStyle w:val="CodeBlock"/>
         <w:spacing w:before="0" w:after="0" w:line="240" w:lineRule="auto"/>
         <w:shd w:val="clear" w:color="auto" w:fill="F3F4F6"/>
@@ -2511,7 +2794,7 @@
           <w:sz w:val="18"/>
           <w:szCs w:val="18"/>
         </w:rPr>
-        <w:t xml:space="preserve">npx pa app add data-source `</w:t>
+        <w:t xml:space="preserve"/>
       </w:r>
     </w:p>
     <w:p>
@@ -2527,7 +2810,7 @@
           <w:sz w:val="18"/>
           <w:szCs w:val="18"/>
         </w:rPr>
-        <w:t xml:space="preserve">  --connector shared_powerplatformforadmins `</w:t>
+        <w:t xml:space="preserve">npx pa app remove data-source `</w:t>
       </w:r>
     </w:p>
     <w:p>
@@ -2543,7 +2826,7 @@
           <w:sz w:val="18"/>
           <w:szCs w:val="18"/>
         </w:rPr>
-        <w:t xml:space="preserve">  --connection-ref &lt;POWER-PLATFORM-ADMINS-LOGICAL-NAME&gt; `</w:t>
+        <w:t xml:space="preserve">  --connector shared_microsoftflowforadmins `</w:t>
       </w:r>
     </w:p>
     <w:p>
@@ -2559,7 +2842,7 @@
           <w:sz w:val="18"/>
           <w:szCs w:val="18"/>
         </w:rPr>
-        <w:t xml:space="preserve">  --solution-id &lt;SOURCE-SOLUTION-ID&gt;</w:t>
+        <w:t xml:space="preserve">  --name microsoftflowforadmins `</w:t>
       </w:r>
     </w:p>
     <w:p>
@@ -2575,7 +2858,7 @@
           <w:sz w:val="18"/>
           <w:szCs w:val="18"/>
         </w:rPr>
-        <w:t xml:space="preserve"/>
+        <w:t xml:space="preserve">  --force</w:t>
       </w:r>
     </w:p>
     <w:p>
@@ -2591,7 +2874,7 @@
           <w:sz w:val="18"/>
           <w:szCs w:val="18"/>
         </w:rPr>
-        <w:t xml:space="preserve">npx pa app add data-source `</w:t>
+        <w:t xml:space="preserve"/>
       </w:r>
     </w:p>
     <w:p>
@@ -2607,7 +2890,7 @@
           <w:sz w:val="18"/>
           <w:szCs w:val="18"/>
         </w:rPr>
-        <w:t xml:space="preserve">  --connector shared_webcontents `</w:t>
+        <w:t xml:space="preserve">npx pa app remove data-source `</w:t>
       </w:r>
     </w:p>
     <w:p>
@@ -2623,7 +2906,7 @@
           <w:sz w:val="18"/>
           <w:szCs w:val="18"/>
         </w:rPr>
-        <w:t xml:space="preserve">  --connection-ref &lt;INVENTORY-API-LOGICAL-NAME&gt; `</w:t>
+        <w:t xml:space="preserve">  --connector shared_flowmanagement `</w:t>
       </w:r>
     </w:p>
     <w:p>
@@ -2639,7 +2922,7 @@
           <w:sz w:val="18"/>
           <w:szCs w:val="18"/>
         </w:rPr>
-        <w:t xml:space="preserve">  --solution-id &lt;SOURCE-SOLUTION-ID&gt;</w:t>
+        <w:t xml:space="preserve">  --name flowmanagement `</w:t>
       </w:r>
     </w:p>
     <w:p>
@@ -2655,6 +2938,36 @@
           <w:sz w:val="18"/>
           <w:szCs w:val="18"/>
         </w:rPr>
+        <w:t xml:space="preserve">  --force</w:t>
+      </w:r>
+    </w:p>
+    <w:p>
+      <w:pPr>
+        <w:pStyle w:val="Normal"/>
+        <w:spacing w:before="0" w:after="100" w:line="276" w:lineRule="auto"/>
+      </w:pPr>
+      <w:r>
+        <w:rPr/>
+        <w:t xml:space="preserve"/>
+      </w:r>
+    </w:p>
+    <w:p>
+      <w:pPr>
+        <w:pStyle w:val="Normal"/>
+        <w:spacing w:before="0" w:after="120" w:line="276" w:lineRule="auto"/>
+      </w:pPr>
+      <w:r>
+        <w:rPr/>
+        <w:t xml:space="preserve">Add the data sources back using their solution connection references:</w:t>
+      </w:r>
+    </w:p>
+    <w:p>
+      <w:pPr>
+        <w:pStyle w:val="Normal"/>
+        <w:spacing w:before="0" w:after="20" w:line="276" w:lineRule="auto"/>
+      </w:pPr>
+      <w:r>
+        <w:rPr/>
         <w:t xml:space="preserve"/>
       </w:r>
     </w:p>
@@ -2687,7 +3000,7 @@
           <w:sz w:val="18"/>
           <w:szCs w:val="18"/>
         </w:rPr>
-        <w:t xml:space="preserve">  --connector shared_office365users `</w:t>
+        <w:t xml:space="preserve">  --connector shared_powerplatformforadmins `</w:t>
       </w:r>
     </w:p>
     <w:p>
@@ -2703,7 +3016,7 @@
           <w:sz w:val="18"/>
           <w:szCs w:val="18"/>
         </w:rPr>
-        <w:t xml:space="preserve">  --connection-ref &lt;DIRECTORY-USERS-LOGICAL-NAME&gt; `</w:t>
+        <w:t xml:space="preserve">  --connection-ref &lt;POWER-PLATFORM-ADMINS-LOGICAL-NAME&gt; `</w:t>
       </w:r>
     </w:p>
     <w:p>
@@ -2767,7 +3080,7 @@
           <w:sz w:val="18"/>
           <w:szCs w:val="18"/>
         </w:rPr>
-        <w:t xml:space="preserve">  --connector shared_flowmanagement `</w:t>
+        <w:t xml:space="preserve">  --connector shared_webcontents `</w:t>
       </w:r>
     </w:p>
     <w:p>
@@ -2783,7 +3096,7 @@
           <w:sz w:val="18"/>
           <w:szCs w:val="18"/>
         </w:rPr>
-        <w:t xml:space="preserve">  --connection-ref &lt;FLOW-MANAGEMENT-LOGICAL-NAME&gt; `</w:t>
+        <w:t xml:space="preserve">  --connection-ref &lt;INVENTORY-API-LOGICAL-NAME&gt; `</w:t>
       </w:r>
     </w:p>
     <w:p>
@@ -2804,6 +3117,326 @@
     </w:p>
     <w:p>
       <w:pPr>
+        <w:pStyle w:val="CodeBlock"/>
+        <w:spacing w:before="0" w:after="0" w:line="240" w:lineRule="auto"/>
+        <w:shd w:val="clear" w:color="auto" w:fill="F3F4F6"/>
+        <w:ind w:left="240" w:right="240"/>
+      </w:pPr>
+      <w:r>
+        <w:rPr>
+          <w:rFonts w:ascii="Consolas" w:hAnsi="Consolas"/>
+          <w:sz w:val="18"/>
+          <w:szCs w:val="18"/>
+        </w:rPr>
+        <w:t xml:space="preserve"/>
+      </w:r>
+    </w:p>
+    <w:p>
+      <w:pPr>
+        <w:pStyle w:val="CodeBlock"/>
+        <w:spacing w:before="0" w:after="0" w:line="240" w:lineRule="auto"/>
+        <w:shd w:val="clear" w:color="auto" w:fill="F3F4F6"/>
+        <w:ind w:left="240" w:right="240"/>
+      </w:pPr>
+      <w:r>
+        <w:rPr>
+          <w:rFonts w:ascii="Consolas" w:hAnsi="Consolas"/>
+          <w:sz w:val="18"/>
+          <w:szCs w:val="18"/>
+        </w:rPr>
+        <w:t xml:space="preserve">npx pa app add data-source `</w:t>
+      </w:r>
+    </w:p>
+    <w:p>
+      <w:pPr>
+        <w:pStyle w:val="CodeBlock"/>
+        <w:spacing w:before="0" w:after="0" w:line="240" w:lineRule="auto"/>
+        <w:shd w:val="clear" w:color="auto" w:fill="F3F4F6"/>
+        <w:ind w:left="240" w:right="240"/>
+      </w:pPr>
+      <w:r>
+        <w:rPr>
+          <w:rFonts w:ascii="Consolas" w:hAnsi="Consolas"/>
+          <w:sz w:val="18"/>
+          <w:szCs w:val="18"/>
+        </w:rPr>
+        <w:t xml:space="preserve">  --connector shared_webcontents `</w:t>
+      </w:r>
+    </w:p>
+    <w:p>
+      <w:pPr>
+        <w:pStyle w:val="CodeBlock"/>
+        <w:spacing w:before="0" w:after="0" w:line="240" w:lineRule="auto"/>
+        <w:shd w:val="clear" w:color="auto" w:fill="F3F4F6"/>
+        <w:ind w:left="240" w:right="240"/>
+      </w:pPr>
+      <w:r>
+        <w:rPr>
+          <w:rFonts w:ascii="Consolas" w:hAnsi="Consolas"/>
+          <w:sz w:val="18"/>
+          <w:szCs w:val="18"/>
+        </w:rPr>
+        <w:t xml:space="preserve">  --connection-ref &lt;FLOW-ADMIN-API-LOGICAL-NAME&gt; `</w:t>
+      </w:r>
+    </w:p>
+    <w:p>
+      <w:pPr>
+        <w:pStyle w:val="CodeBlock"/>
+        <w:spacing w:before="0" w:after="0" w:line="240" w:lineRule="auto"/>
+        <w:shd w:val="clear" w:color="auto" w:fill="F3F4F6"/>
+        <w:ind w:left="240" w:right="240"/>
+      </w:pPr>
+      <w:r>
+        <w:rPr>
+          <w:rFonts w:ascii="Consolas" w:hAnsi="Consolas"/>
+          <w:sz w:val="18"/>
+          <w:szCs w:val="18"/>
+        </w:rPr>
+        <w:t xml:space="preserve">  --solution-id &lt;SOURCE-SOLUTION-ID&gt;</w:t>
+      </w:r>
+    </w:p>
+    <w:p>
+      <w:pPr>
+        <w:pStyle w:val="CodeBlock"/>
+        <w:spacing w:before="0" w:after="0" w:line="240" w:lineRule="auto"/>
+        <w:shd w:val="clear" w:color="auto" w:fill="F3F4F6"/>
+        <w:ind w:left="240" w:right="240"/>
+      </w:pPr>
+      <w:r>
+        <w:rPr>
+          <w:rFonts w:ascii="Consolas" w:hAnsi="Consolas"/>
+          <w:sz w:val="18"/>
+          <w:szCs w:val="18"/>
+        </w:rPr>
+        <w:t xml:space="preserve"/>
+      </w:r>
+    </w:p>
+    <w:p>
+      <w:pPr>
+        <w:pStyle w:val="CodeBlock"/>
+        <w:spacing w:before="0" w:after="0" w:line="240" w:lineRule="auto"/>
+        <w:shd w:val="clear" w:color="auto" w:fill="F3F4F6"/>
+        <w:ind w:left="240" w:right="240"/>
+      </w:pPr>
+      <w:r>
+        <w:rPr>
+          <w:rFonts w:ascii="Consolas" w:hAnsi="Consolas"/>
+          <w:sz w:val="18"/>
+          <w:szCs w:val="18"/>
+        </w:rPr>
+        <w:t xml:space="preserve">npx pa app add data-source `</w:t>
+      </w:r>
+    </w:p>
+    <w:p>
+      <w:pPr>
+        <w:pStyle w:val="CodeBlock"/>
+        <w:spacing w:before="0" w:after="0" w:line="240" w:lineRule="auto"/>
+        <w:shd w:val="clear" w:color="auto" w:fill="F3F4F6"/>
+        <w:ind w:left="240" w:right="240"/>
+      </w:pPr>
+      <w:r>
+        <w:rPr>
+          <w:rFonts w:ascii="Consolas" w:hAnsi="Consolas"/>
+          <w:sz w:val="18"/>
+          <w:szCs w:val="18"/>
+        </w:rPr>
+        <w:t xml:space="preserve">  --connector shared_office365users `</w:t>
+      </w:r>
+    </w:p>
+    <w:p>
+      <w:pPr>
+        <w:pStyle w:val="CodeBlock"/>
+        <w:spacing w:before="0" w:after="0" w:line="240" w:lineRule="auto"/>
+        <w:shd w:val="clear" w:color="auto" w:fill="F3F4F6"/>
+        <w:ind w:left="240" w:right="240"/>
+      </w:pPr>
+      <w:r>
+        <w:rPr>
+          <w:rFonts w:ascii="Consolas" w:hAnsi="Consolas"/>
+          <w:sz w:val="18"/>
+          <w:szCs w:val="18"/>
+        </w:rPr>
+        <w:t xml:space="preserve">  --connection-ref &lt;DIRECTORY-USERS-LOGICAL-NAME&gt; `</w:t>
+      </w:r>
+    </w:p>
+    <w:p>
+      <w:pPr>
+        <w:pStyle w:val="CodeBlock"/>
+        <w:spacing w:before="0" w:after="0" w:line="240" w:lineRule="auto"/>
+        <w:shd w:val="clear" w:color="auto" w:fill="F3F4F6"/>
+        <w:ind w:left="240" w:right="240"/>
+      </w:pPr>
+      <w:r>
+        <w:rPr>
+          <w:rFonts w:ascii="Consolas" w:hAnsi="Consolas"/>
+          <w:sz w:val="18"/>
+          <w:szCs w:val="18"/>
+        </w:rPr>
+        <w:t xml:space="preserve">  --solution-id &lt;SOURCE-SOLUTION-ID&gt;</w:t>
+      </w:r>
+    </w:p>
+    <w:p>
+      <w:pPr>
+        <w:pStyle w:val="CodeBlock"/>
+        <w:spacing w:before="0" w:after="0" w:line="240" w:lineRule="auto"/>
+        <w:shd w:val="clear" w:color="auto" w:fill="F3F4F6"/>
+        <w:ind w:left="240" w:right="240"/>
+      </w:pPr>
+      <w:r>
+        <w:rPr>
+          <w:rFonts w:ascii="Consolas" w:hAnsi="Consolas"/>
+          <w:sz w:val="18"/>
+          <w:szCs w:val="18"/>
+        </w:rPr>
+        <w:t xml:space="preserve"/>
+      </w:r>
+    </w:p>
+    <w:p>
+      <w:pPr>
+        <w:pStyle w:val="CodeBlock"/>
+        <w:spacing w:before="0" w:after="0" w:line="240" w:lineRule="auto"/>
+        <w:shd w:val="clear" w:color="auto" w:fill="F3F4F6"/>
+        <w:ind w:left="240" w:right="240"/>
+      </w:pPr>
+      <w:r>
+        <w:rPr>
+          <w:rFonts w:ascii="Consolas" w:hAnsi="Consolas"/>
+          <w:sz w:val="18"/>
+          <w:szCs w:val="18"/>
+        </w:rPr>
+        <w:t xml:space="preserve">npx pa app add data-source `</w:t>
+      </w:r>
+    </w:p>
+    <w:p>
+      <w:pPr>
+        <w:pStyle w:val="CodeBlock"/>
+        <w:spacing w:before="0" w:after="0" w:line="240" w:lineRule="auto"/>
+        <w:shd w:val="clear" w:color="auto" w:fill="F3F4F6"/>
+        <w:ind w:left="240" w:right="240"/>
+      </w:pPr>
+      <w:r>
+        <w:rPr>
+          <w:rFonts w:ascii="Consolas" w:hAnsi="Consolas"/>
+          <w:sz w:val="18"/>
+          <w:szCs w:val="18"/>
+        </w:rPr>
+        <w:t xml:space="preserve">  --connector shared_microsoftflowforadmins `</w:t>
+      </w:r>
+    </w:p>
+    <w:p>
+      <w:pPr>
+        <w:pStyle w:val="CodeBlock"/>
+        <w:spacing w:before="0" w:after="0" w:line="240" w:lineRule="auto"/>
+        <w:shd w:val="clear" w:color="auto" w:fill="F3F4F6"/>
+        <w:ind w:left="240" w:right="240"/>
+      </w:pPr>
+      <w:r>
+        <w:rPr>
+          <w:rFonts w:ascii="Consolas" w:hAnsi="Consolas"/>
+          <w:sz w:val="18"/>
+          <w:szCs w:val="18"/>
+        </w:rPr>
+        <w:t xml:space="preserve">  --connection-ref &lt;POWER-AUTOMATE-ADMINS-LOGICAL-NAME&gt; `</w:t>
+      </w:r>
+    </w:p>
+    <w:p>
+      <w:pPr>
+        <w:pStyle w:val="CodeBlock"/>
+        <w:spacing w:before="0" w:after="0" w:line="240" w:lineRule="auto"/>
+        <w:shd w:val="clear" w:color="auto" w:fill="F3F4F6"/>
+        <w:ind w:left="240" w:right="240"/>
+      </w:pPr>
+      <w:r>
+        <w:rPr>
+          <w:rFonts w:ascii="Consolas" w:hAnsi="Consolas"/>
+          <w:sz w:val="18"/>
+          <w:szCs w:val="18"/>
+        </w:rPr>
+        <w:t xml:space="preserve">  --solution-id &lt;SOURCE-SOLUTION-ID&gt;</w:t>
+      </w:r>
+    </w:p>
+    <w:p>
+      <w:pPr>
+        <w:pStyle w:val="CodeBlock"/>
+        <w:spacing w:before="0" w:after="0" w:line="240" w:lineRule="auto"/>
+        <w:shd w:val="clear" w:color="auto" w:fill="F3F4F6"/>
+        <w:ind w:left="240" w:right="240"/>
+      </w:pPr>
+      <w:r>
+        <w:rPr>
+          <w:rFonts w:ascii="Consolas" w:hAnsi="Consolas"/>
+          <w:sz w:val="18"/>
+          <w:szCs w:val="18"/>
+        </w:rPr>
+        <w:t xml:space="preserve"/>
+      </w:r>
+    </w:p>
+    <w:p>
+      <w:pPr>
+        <w:pStyle w:val="CodeBlock"/>
+        <w:spacing w:before="0" w:after="0" w:line="240" w:lineRule="auto"/>
+        <w:shd w:val="clear" w:color="auto" w:fill="F3F4F6"/>
+        <w:ind w:left="240" w:right="240"/>
+      </w:pPr>
+      <w:r>
+        <w:rPr>
+          <w:rFonts w:ascii="Consolas" w:hAnsi="Consolas"/>
+          <w:sz w:val="18"/>
+          <w:szCs w:val="18"/>
+        </w:rPr>
+        <w:t xml:space="preserve">npx pa app add data-source `</w:t>
+      </w:r>
+    </w:p>
+    <w:p>
+      <w:pPr>
+        <w:pStyle w:val="CodeBlock"/>
+        <w:spacing w:before="0" w:after="0" w:line="240" w:lineRule="auto"/>
+        <w:shd w:val="clear" w:color="auto" w:fill="F3F4F6"/>
+        <w:ind w:left="240" w:right="240"/>
+      </w:pPr>
+      <w:r>
+        <w:rPr>
+          <w:rFonts w:ascii="Consolas" w:hAnsi="Consolas"/>
+          <w:sz w:val="18"/>
+          <w:szCs w:val="18"/>
+        </w:rPr>
+        <w:t xml:space="preserve">  --connector shared_flowmanagement `</w:t>
+      </w:r>
+    </w:p>
+    <w:p>
+      <w:pPr>
+        <w:pStyle w:val="CodeBlock"/>
+        <w:spacing w:before="0" w:after="0" w:line="240" w:lineRule="auto"/>
+        <w:shd w:val="clear" w:color="auto" w:fill="F3F4F6"/>
+        <w:ind w:left="240" w:right="240"/>
+      </w:pPr>
+      <w:r>
+        <w:rPr>
+          <w:rFonts w:ascii="Consolas" w:hAnsi="Consolas"/>
+          <w:sz w:val="18"/>
+          <w:szCs w:val="18"/>
+        </w:rPr>
+        <w:t xml:space="preserve">  --connection-ref &lt;FLOW-MANAGEMENT-LOGICAL-NAME&gt; `</w:t>
+      </w:r>
+    </w:p>
+    <w:p>
+      <w:pPr>
+        <w:pStyle w:val="CodeBlock"/>
+        <w:spacing w:before="0" w:after="0" w:line="240" w:lineRule="auto"/>
+        <w:shd w:val="clear" w:color="auto" w:fill="F3F4F6"/>
+        <w:ind w:left="240" w:right="240"/>
+      </w:pPr>
+      <w:r>
+        <w:rPr>
+          <w:rFonts w:ascii="Consolas" w:hAnsi="Consolas"/>
+          <w:sz w:val="18"/>
+          <w:szCs w:val="18"/>
+        </w:rPr>
+        <w:t xml:space="preserve">  --solution-id &lt;SOURCE-SOLUTION-ID&gt;</w:t>
+      </w:r>
+    </w:p>
+    <w:p>
+      <w:pPr>
         <w:pStyle w:val="Normal"/>
         <w:spacing w:before="0" w:after="100" w:line="276" w:lineRule="auto"/>
       </w:pPr>
@@ -2954,7 +3587,7 @@
       </w:r>
       <w:r>
         <w:rPr/>
-        <w:t xml:space="preserve">Four connection references</w:t>
+        <w:t xml:space="preserve">Six connection references</w:t>
       </w:r>
     </w:p>
     <w:p>
@@ -3376,7 +4009,7 @@
           <w:szCs w:val="18"/>
           <w:shd w:val="clear" w:color="auto" w:fill="F3F4F6"/>
         </w:rPr>
-        <w:t xml:space="preserve">solutions/OrphanedFlowFinder_1_1_1_0_managed.zip</w:t>
+        <w:t xml:space="preserve">solutions/OrphanedFlowFinder_1_1_2_0_managed.zip</w:t>
       </w:r>
     </w:p>
     <w:p>
@@ -3398,7 +4031,7 @@
           <w:szCs w:val="18"/>
           <w:shd w:val="clear" w:color="auto" w:fill="F3F4F6"/>
         </w:rPr>
-        <w:t xml:space="preserve">solutions/OrphanedFlowFinder_1_1_1_0_unmanaged.zip</w:t>
+        <w:t xml:space="preserve">solutions/OrphanedFlowFinder_1_1_2_0_unmanaged.zip</w:t>
       </w:r>
     </w:p>
     <w:p>
@@ -3508,7 +4141,7 @@
       </w:r>
       <w:r>
         <w:rPr/>
-        <w:t xml:space="preserve">All four required connectors allowed by Data Loss Prevention policy</w:t>
+        <w:t xml:space="preserve">All six required connection references allowed by Data Loss Prevention policy</w:t>
       </w:r>
     </w:p>
     <w:p>
@@ -3852,7 +4485,7 @@
       </w:pPr>
       <w:r>
         <w:rPr/>
-        <w:t xml:space="preserve">6.2 HTTP with Microsoft Entra ID (preauthorized)</w:t>
+        <w:t xml:space="preserve">6.2 Inventory API - HTTP with Microsoft Entra ID (preauthorized)</w:t>
       </w:r>
     </w:p>
     <w:p>
@@ -4002,7 +4635,7 @@
       </w:pPr>
       <w:r>
         <w:rPr/>
-        <w:t xml:space="preserve">6.3 Office 365 Users</w:t>
+        <w:t xml:space="preserve">6.3 Flow Admin API - HTTP with Microsoft Entra ID (preauthorized)</w:t>
       </w:r>
     </w:p>
     <w:p>
@@ -4019,13 +4652,40 @@
       </w:r>
       <w:r>
         <w:rPr/>
-        <w:t xml:space="preserve">Create </w:t>
-      </w:r>
-      <w:r>
-        <w:rPr>
-          <w:b/>
-        </w:rPr>
-        <w:t xml:space="preserve">Office 365 Users</w:t>
+        <w:t xml:space="preserve">Create another </w:t>
+      </w:r>
+      <w:r>
+        <w:rPr>
+          <w:b/>
+        </w:rPr>
+        <w:t xml:space="preserve">HTTP with Microsoft Entra ID (preauthorized)</w:t>
+      </w:r>
+      <w:r>
+        <w:rPr/>
+        <w:t xml:space="preserve"> connection.</w:t>
+      </w:r>
+    </w:p>
+    <w:p>
+      <w:pPr>
+        <w:pStyle w:val="Normal"/>
+        <w:spacing w:before="0" w:after="120" w:line="276" w:lineRule="auto"/>
+        <w:ind w:left="540" w:hanging="360"/>
+      </w:pPr>
+      <w:r>
+        <w:rPr>
+          <w:b/>
+        </w:rPr>
+        <w:t xml:space="preserve">2. </w:t>
+      </w:r>
+      <w:r>
+        <w:rPr/>
+        <w:t xml:space="preserve">Select </w:t>
+      </w:r>
+      <w:r>
+        <w:rPr>
+          <w:b/>
+        </w:rPr>
+        <w:t xml:space="preserve">Log in with Microsoft Entra ID</w:t>
       </w:r>
       <w:r>
         <w:rPr/>
@@ -4042,252 +4702,28 @@
         <w:rPr>
           <w:b/>
         </w:rPr>
-        <w:t xml:space="preserve">2. </w:t>
-      </w:r>
-      <w:r>
-        <w:rPr/>
-        <w:t xml:space="preserve">Sign in with the target-tenant administrator.</w:t>
-      </w:r>
-    </w:p>
-    <w:p>
-      <w:pPr>
-        <w:pStyle w:val="Normal"/>
-        <w:spacing w:before="0" w:after="120" w:line="276" w:lineRule="auto"/>
-        <w:ind w:left="540" w:hanging="360"/>
-      </w:pPr>
-      <w:r>
-        <w:rPr>
-          <w:b/>
-        </w:rPr>
         <w:t xml:space="preserve">3. </w:t>
       </w:r>
       <w:r>
         <w:rPr/>
-        <w:t xml:space="preserve">Confirm the connection shows </w:t>
-      </w:r>
-      <w:r>
-        <w:rPr>
-          <w:b/>
-        </w:rPr>
-        <w:t xml:space="preserve">Connected</w:t>
-      </w:r>
-      <w:r>
-        <w:rPr/>
-        <w:t xml:space="preserve">.</w:t>
-      </w:r>
-    </w:p>
-    <w:p>
-      <w:pPr>
-        <w:pStyle w:val="Heading2"/>
-        <w:spacing w:before="220" w:after="100" w:line="276" w:lineRule="auto"/>
-      </w:pPr>
-      <w:r>
-        <w:rPr/>
-        <w:t xml:space="preserve">6.4 Power Automate Management</w:t>
-      </w:r>
-    </w:p>
-    <w:p>
-      <w:pPr>
-        <w:pStyle w:val="Normal"/>
-        <w:spacing w:before="0" w:after="120" w:line="276" w:lineRule="auto"/>
-        <w:ind w:left="540" w:hanging="360"/>
-      </w:pPr>
-      <w:r>
-        <w:rPr>
-          <w:b/>
-        </w:rPr>
-        <w:t xml:space="preserve">1. </w:t>
-      </w:r>
-      <w:r>
-        <w:rPr/>
-        <w:t xml:space="preserve">Create </w:t>
-      </w:r>
-      <w:r>
-        <w:rPr>
-          <w:b/>
-        </w:rPr>
-        <w:t xml:space="preserve">Power Automate Management</w:t>
-      </w:r>
-      <w:r>
-        <w:rPr/>
-        <w:t xml:space="preserve">.</w:t>
-      </w:r>
-    </w:p>
-    <w:p>
-      <w:pPr>
-        <w:pStyle w:val="Normal"/>
-        <w:spacing w:before="0" w:after="120" w:line="276" w:lineRule="auto"/>
-        <w:ind w:left="540" w:hanging="360"/>
-      </w:pPr>
-      <w:r>
-        <w:rPr>
-          <w:b/>
-        </w:rPr>
-        <w:t xml:space="preserve">2. </w:t>
-      </w:r>
-      <w:r>
-        <w:rPr/>
-        <w:t xml:space="preserve">Use Microsoft Entra ID Integrated authentication.</w:t>
-      </w:r>
-    </w:p>
-    <w:p>
-      <w:pPr>
-        <w:pStyle w:val="Normal"/>
-        <w:spacing w:before="0" w:after="120" w:line="276" w:lineRule="auto"/>
-        <w:ind w:left="540" w:hanging="360"/>
-      </w:pPr>
-      <w:r>
-        <w:rPr>
-          <w:b/>
-        </w:rPr>
-        <w:t xml:space="preserve">3. </w:t>
-      </w:r>
-      <w:r>
-        <w:rPr/>
-        <w:t xml:space="preserve">Sign in with the target-tenant administrator.</w:t>
-      </w:r>
-    </w:p>
-    <w:p>
-      <w:pPr>
-        <w:pStyle w:val="Normal"/>
-        <w:spacing w:before="0" w:after="120" w:line="276" w:lineRule="auto"/>
-        <w:ind w:left="540" w:hanging="360"/>
-      </w:pPr>
-      <w:r>
-        <w:rPr>
-          <w:b/>
-        </w:rPr>
-        <w:t xml:space="preserve">4. </w:t>
-      </w:r>
-      <w:r>
-        <w:rPr/>
-        <w:t xml:space="preserve">Confirm the connection shows </w:t>
-      </w:r>
-      <w:r>
-        <w:rPr>
-          <w:b/>
-        </w:rPr>
-        <w:t xml:space="preserve">Connected</w:t>
-      </w:r>
-      <w:r>
-        <w:rPr/>
-        <w:t xml:space="preserve">.</w:t>
-      </w:r>
-    </w:p>
-    <w:p>
-      <w:pPr>
-        <w:pStyle w:val="Heading1"/>
-        <w:spacing w:before="280" w:after="120" w:line="276" w:lineRule="auto"/>
-      </w:pPr>
-      <w:r>
-        <w:rPr/>
-        <w:t xml:space="preserve">7. Import the solution</w:t>
-      </w:r>
-    </w:p>
-    <w:p>
-      <w:pPr>
-        <w:pStyle w:val="Normal"/>
-        <w:spacing w:before="0" w:after="120" w:line="276" w:lineRule="auto"/>
-        <w:ind w:left="540" w:hanging="360"/>
-      </w:pPr>
-      <w:r>
-        <w:rPr>
-          <w:b/>
-        </w:rPr>
-        <w:t xml:space="preserve">1. </w:t>
-      </w:r>
-      <w:r>
-        <w:rPr/>
-        <w:t xml:space="preserve">Sign in to the target maker portal.</w:t>
-      </w:r>
-    </w:p>
-    <w:p>
-      <w:pPr>
-        <w:pStyle w:val="Normal"/>
-        <w:spacing w:before="0" w:after="120" w:line="276" w:lineRule="auto"/>
-        <w:ind w:left="540" w:hanging="360"/>
-      </w:pPr>
-      <w:r>
-        <w:rPr>
-          <w:b/>
-        </w:rPr>
-        <w:t xml:space="preserve">2. </w:t>
-      </w:r>
-      <w:r>
-        <w:rPr/>
-        <w:t xml:space="preserve">Select the target environment.</w:t>
-      </w:r>
-    </w:p>
-    <w:p>
-      <w:pPr>
-        <w:pStyle w:val="Normal"/>
-        <w:spacing w:before="0" w:after="120" w:line="276" w:lineRule="auto"/>
-        <w:ind w:left="540" w:hanging="360"/>
-      </w:pPr>
-      <w:r>
-        <w:rPr>
-          <w:b/>
-        </w:rPr>
-        <w:t xml:space="preserve">3. </w:t>
-      </w:r>
-      <w:r>
-        <w:rPr/>
-        <w:t xml:space="preserve">Open </w:t>
-      </w:r>
-      <w:r>
-        <w:rPr>
-          <w:b/>
-        </w:rPr>
-        <w:t xml:space="preserve">Solutions</w:t>
-      </w:r>
-      <w:r>
-        <w:rPr/>
-        <w:t xml:space="preserve">.</w:t>
-      </w:r>
-    </w:p>
-    <w:p>
-      <w:pPr>
-        <w:pStyle w:val="Normal"/>
-        <w:spacing w:before="0" w:after="120" w:line="276" w:lineRule="auto"/>
-        <w:ind w:left="540" w:hanging="360"/>
-      </w:pPr>
-      <w:r>
-        <w:rPr>
-          <w:b/>
-        </w:rPr>
-        <w:t xml:space="preserve">4. </w:t>
-      </w:r>
-      <w:r>
-        <w:rPr/>
-        <w:t xml:space="preserve">Select </w:t>
-      </w:r>
-      <w:r>
-        <w:rPr>
-          <w:b/>
-        </w:rPr>
-        <w:t xml:space="preserve">Import solution</w:t>
-      </w:r>
-      <w:r>
-        <w:rPr/>
-        <w:t xml:space="preserve">.</w:t>
-      </w:r>
-    </w:p>
-    <w:p>
-      <w:pPr>
-        <w:pStyle w:val="Normal"/>
-        <w:spacing w:before="0" w:after="120" w:line="276" w:lineRule="auto"/>
-        <w:ind w:left="540" w:hanging="360"/>
-      </w:pPr>
-      <w:r>
-        <w:rPr>
-          <w:b/>
-        </w:rPr>
-        <w:t xml:space="preserve">5. </w:t>
-      </w:r>
-      <w:r>
-        <w:rPr/>
-        <w:t xml:space="preserve">Upload </w:t>
-      </w:r>
+        <w:t xml:space="preserve">Set </w:t>
+      </w:r>
+      <w:r>
+        <w:rPr>
+          <w:b/>
+        </w:rPr>
+        <w:t xml:space="preserve">Base Resource URL</w:t>
+      </w:r>
+      <w:r>
+        <w:rPr/>
+        <w:t xml:space="preserve"> to:</w:t>
+      </w:r>
+    </w:p>
+    <w:p>
+      <w:pPr>
+        <w:pStyle w:val="Normal"/>
+        <w:spacing w:before="0" w:after="120" w:line="276" w:lineRule="auto"/>
+      </w:pPr>
       <w:r>
         <w:rPr>
           <w:rFonts w:ascii="Consolas" w:hAnsi="Consolas"/>
@@ -4295,21 +4731,66 @@
           <w:szCs w:val="18"/>
           <w:shd w:val="clear" w:color="auto" w:fill="F3F4F6"/>
         </w:rPr>
-        <w:t xml:space="preserve">OrphanedFlowFinder_1_1_1_0_managed.zip</w:t>
-      </w:r>
-      <w:r>
-        <w:rPr/>
-        <w:t xml:space="preserve"> for the standard</w:t>
-      </w:r>
-    </w:p>
-    <w:p>
-      <w:pPr>
-        <w:pStyle w:val="Normal"/>
-        <w:spacing w:before="0" w:after="120" w:line="276" w:lineRule="auto"/>
-      </w:pPr>
-      <w:r>
-        <w:rPr/>
-        <w:t xml:space="preserve">installation, or the unmanaged ZIP only when the target team will own future development.</w:t>
+        <w:t xml:space="preserve">https://gov.api.flow.microsoft.us</w:t>
+      </w:r>
+    </w:p>
+    <w:p>
+      <w:pPr>
+        <w:pStyle w:val="Normal"/>
+        <w:spacing w:before="0" w:after="120" w:line="276" w:lineRule="auto"/>
+        <w:ind w:left="540" w:hanging="360"/>
+      </w:pPr>
+      <w:r>
+        <w:rPr>
+          <w:b/>
+        </w:rPr>
+        <w:t xml:space="preserve">4. </w:t>
+      </w:r>
+      <w:r>
+        <w:rPr/>
+        <w:t xml:space="preserve">Set </w:t>
+      </w:r>
+      <w:r>
+        <w:rPr>
+          <w:b/>
+        </w:rPr>
+        <w:t xml:space="preserve">Microsoft Entra ID Resource URI</w:t>
+      </w:r>
+      <w:r>
+        <w:rPr/>
+        <w:t xml:space="preserve"> to:</w:t>
+      </w:r>
+    </w:p>
+    <w:p>
+      <w:pPr>
+        <w:pStyle w:val="Normal"/>
+        <w:spacing w:before="0" w:after="120" w:line="276" w:lineRule="auto"/>
+      </w:pPr>
+      <w:r>
+        <w:rPr>
+          <w:rFonts w:ascii="Consolas" w:hAnsi="Consolas"/>
+          <w:sz w:val="18"/>
+          <w:szCs w:val="18"/>
+          <w:shd w:val="clear" w:color="auto" w:fill="F3F4F6"/>
+        </w:rPr>
+        <w:t xml:space="preserve">https://gov.service.flow.microsoft.us/</w:t>
+      </w:r>
+    </w:p>
+    <w:p>
+      <w:pPr>
+        <w:pStyle w:val="Normal"/>
+        <w:spacing w:before="0" w:after="120" w:line="276" w:lineRule="auto"/>
+        <w:ind w:left="540" w:hanging="360"/>
+      </w:pPr>
+      <w:r>
+        <w:rPr>
+          <w:b/>
+        </w:rPr>
+        <w:t xml:space="preserve">5. </w:t>
+      </w:r>
+      <w:r>
+        <w:rPr/>
+        <w:t xml:space="preserve">Complete sign-in.</w:t>
       </w:r>
     </w:p>
     <w:p>
@@ -4326,95 +4807,37 @@
       </w:r>
       <w:r>
         <w:rPr/>
-        <w:t xml:space="preserve">Review the package details and dependencies.</w:t>
-      </w:r>
-    </w:p>
-    <w:p>
-      <w:pPr>
-        <w:pStyle w:val="Normal"/>
-        <w:spacing w:before="0" w:after="120" w:line="276" w:lineRule="auto"/>
-        <w:ind w:left="540" w:hanging="360"/>
-      </w:pPr>
-      <w:r>
-        <w:rPr>
-          <w:b/>
-        </w:rPr>
-        <w:t xml:space="preserve">7. </w:t>
-      </w:r>
-      <w:r>
-        <w:rPr/>
-        <w:t xml:space="preserve">Map each connection reference to the matching target connection.</w:t>
-      </w:r>
-    </w:p>
-    <w:p>
-      <w:pPr>
-        <w:pStyle w:val="Normal"/>
-        <w:spacing w:before="0" w:after="120" w:line="276" w:lineRule="auto"/>
-        <w:ind w:left="540" w:hanging="360"/>
-      </w:pPr>
-      <w:r>
-        <w:rPr>
-          <w:b/>
-        </w:rPr>
-        <w:t xml:space="preserve">8. </w:t>
-      </w:r>
-      <w:r>
-        <w:rPr/>
-        <w:t xml:space="preserve">Complete the import.</w:t>
-      </w:r>
-    </w:p>
-    <w:p>
-      <w:pPr>
-        <w:pStyle w:val="Normal"/>
-        <w:spacing w:before="0" w:after="120" w:line="276" w:lineRule="auto"/>
-        <w:ind w:left="540" w:hanging="360"/>
-      </w:pPr>
-      <w:r>
-        <w:rPr>
-          <w:b/>
-        </w:rPr>
-        <w:t xml:space="preserve">9. </w:t>
-      </w:r>
-      <w:r>
-        <w:rPr/>
-        <w:t xml:space="preserve">Wait for the import to report Success.</w:t>
-      </w:r>
-    </w:p>
-    <w:p>
-      <w:pPr>
-        <w:pStyle w:val="Normal"/>
-        <w:spacing w:before="0" w:after="120" w:line="276" w:lineRule="auto"/>
-        <w:ind w:left="540" w:hanging="360"/>
-      </w:pPr>
-      <w:r>
-        <w:rPr>
-          <w:b/>
-        </w:rPr>
-        <w:t xml:space="preserve">10. </w:t>
-      </w:r>
-      <w:r>
-        <w:rPr/>
-        <w:t xml:space="preserve">Open the imported solution and verify the Code App and four connection</w:t>
-      </w:r>
-    </w:p>
-    <w:p>
-      <w:pPr>
-        <w:pStyle w:val="Normal"/>
-        <w:spacing w:before="0" w:after="120" w:line="276" w:lineRule="auto"/>
-      </w:pPr>
-      <w:r>
-        <w:rPr/>
-        <w:t xml:space="preserve">references are present.</w:t>
-      </w:r>
-    </w:p>
-    <w:p>
-      <w:pPr>
-        <w:pStyle w:val="Normal"/>
-        <w:spacing w:before="0" w:after="120" w:line="276" w:lineRule="auto"/>
-      </w:pPr>
-      <w:r>
-        <w:rPr/>
-        <w:t xml:space="preserve">If the import wizard doesn't request a connection mapping:</w:t>
+        <w:t xml:space="preserve">Confirm the connection shows </w:t>
+      </w:r>
+      <w:r>
+        <w:rPr>
+          <w:b/>
+        </w:rPr>
+        <w:t xml:space="preserve">Connected</w:t>
+      </w:r>
+      <w:r>
+        <w:rPr/>
+        <w:t xml:space="preserve">.</w:t>
+      </w:r>
+    </w:p>
+    <w:p>
+      <w:pPr>
+        <w:pStyle w:val="Normal"/>
+        <w:spacing w:before="0" w:after="120" w:line="276" w:lineRule="auto"/>
+      </w:pPr>
+      <w:r>
+        <w:rPr/>
+        <w:t xml:space="preserve">This connection is separate from the Inventory API connection. The app uses it only for page-scoped, read-only last-run lookups.</w:t>
+      </w:r>
+    </w:p>
+    <w:p>
+      <w:pPr>
+        <w:pStyle w:val="Heading2"/>
+        <w:spacing w:before="220" w:after="100" w:line="276" w:lineRule="auto"/>
+      </w:pPr>
+      <w:r>
+        <w:rPr/>
+        <w:t xml:space="preserve">6.4 Office 365 Users</w:t>
       </w:r>
     </w:p>
     <w:p>
@@ -4431,7 +4854,17 @@
       </w:r>
       <w:r>
         <w:rPr/>
-        <w:t xml:space="preserve">Open each connection reference in the imported solution.</w:t>
+        <w:t xml:space="preserve">Create </w:t>
+      </w:r>
+      <w:r>
+        <w:rPr>
+          <w:b/>
+        </w:rPr>
+        <w:t xml:space="preserve">Office 365 Users</w:t>
+      </w:r>
+      <w:r>
+        <w:rPr/>
+        <w:t xml:space="preserve">.</w:t>
       </w:r>
     </w:p>
     <w:p>
@@ -4448,17 +4881,7 @@
       </w:r>
       <w:r>
         <w:rPr/>
-        <w:t xml:space="preserve">Set </w:t>
-      </w:r>
-      <w:r>
-        <w:rPr>
-          <w:b/>
-        </w:rPr>
-        <w:t xml:space="preserve">Current connection</w:t>
-      </w:r>
-      <w:r>
-        <w:rPr/>
-        <w:t xml:space="preserve"> to the correct target connection.</w:t>
+        <w:t xml:space="preserve">Sign in with the target-tenant administrator.</w:t>
       </w:r>
     </w:p>
     <w:p>
@@ -4475,7 +4898,88 @@
       </w:r>
       <w:r>
         <w:rPr/>
-        <w:t xml:space="preserve">Save the reference.</w:t>
+        <w:t xml:space="preserve">Confirm the connection shows </w:t>
+      </w:r>
+      <w:r>
+        <w:rPr>
+          <w:b/>
+        </w:rPr>
+        <w:t xml:space="preserve">Connected</w:t>
+      </w:r>
+      <w:r>
+        <w:rPr/>
+        <w:t xml:space="preserve">.</w:t>
+      </w:r>
+    </w:p>
+    <w:p>
+      <w:pPr>
+        <w:pStyle w:val="Heading2"/>
+        <w:spacing w:before="220" w:after="100" w:line="276" w:lineRule="auto"/>
+      </w:pPr>
+      <w:r>
+        <w:rPr/>
+        <w:t xml:space="preserve">6.5 Power Automate for Admins</w:t>
+      </w:r>
+    </w:p>
+    <w:p>
+      <w:pPr>
+        <w:pStyle w:val="Normal"/>
+        <w:spacing w:before="0" w:after="120" w:line="276" w:lineRule="auto"/>
+        <w:ind w:left="540" w:hanging="360"/>
+      </w:pPr>
+      <w:r>
+        <w:rPr>
+          <w:b/>
+        </w:rPr>
+        <w:t xml:space="preserve">1. </w:t>
+      </w:r>
+      <w:r>
+        <w:rPr/>
+        <w:t xml:space="preserve">Create </w:t>
+      </w:r>
+      <w:r>
+        <w:rPr>
+          <w:b/>
+        </w:rPr>
+        <w:t xml:space="preserve">Power Automate for Admins</w:t>
+      </w:r>
+      <w:r>
+        <w:rPr/>
+        <w:t xml:space="preserve">.</w:t>
+      </w:r>
+    </w:p>
+    <w:p>
+      <w:pPr>
+        <w:pStyle w:val="Normal"/>
+        <w:spacing w:before="0" w:after="120" w:line="276" w:lineRule="auto"/>
+        <w:ind w:left="540" w:hanging="360"/>
+      </w:pPr>
+      <w:r>
+        <w:rPr>
+          <w:b/>
+        </w:rPr>
+        <w:t xml:space="preserve">2. </w:t>
+      </w:r>
+      <w:r>
+        <w:rPr/>
+        <w:t xml:space="preserve">Use Microsoft Entra ID Integrated authentication.</w:t>
+      </w:r>
+    </w:p>
+    <w:p>
+      <w:pPr>
+        <w:pStyle w:val="Normal"/>
+        <w:spacing w:before="0" w:after="120" w:line="276" w:lineRule="auto"/>
+        <w:ind w:left="540" w:hanging="360"/>
+      </w:pPr>
+      <w:r>
+        <w:rPr>
+          <w:b/>
+        </w:rPr>
+        <w:t xml:space="preserve">3. </w:t>
+      </w:r>
+      <w:r>
+        <w:rPr/>
+        <w:t xml:space="preserve">Sign in with the target-tenant administrator.</w:t>
       </w:r>
     </w:p>
     <w:p>
@@ -4492,17 +4996,115 @@
       </w:r>
       <w:r>
         <w:rPr/>
-        <w:t xml:space="preserve">Publish all customizations.</w:t>
-      </w:r>
-    </w:p>
-    <w:p>
-      <w:pPr>
-        <w:pStyle w:val="Normal"/>
-        <w:spacing w:before="0" w:after="120" w:line="276" w:lineRule="auto"/>
-      </w:pPr>
-      <w:r>
-        <w:rPr/>
-        <w:t xml:space="preserve">Never point a target reference to a source-tenant connection ID.</w:t>
+        <w:t xml:space="preserve">Confirm the connection shows </w:t>
+      </w:r>
+      <w:r>
+        <w:rPr>
+          <w:b/>
+        </w:rPr>
+        <w:t xml:space="preserve">Connected</w:t>
+      </w:r>
+      <w:r>
+        <w:rPr/>
+        <w:t xml:space="preserve">.</w:t>
+      </w:r>
+    </w:p>
+    <w:p>
+      <w:pPr>
+        <w:pStyle w:val="Heading2"/>
+        <w:spacing w:before="220" w:after="100" w:line="276" w:lineRule="auto"/>
+      </w:pPr>
+      <w:r>
+        <w:rPr/>
+        <w:t xml:space="preserve">6.6 Power Automate Management</w:t>
+      </w:r>
+    </w:p>
+    <w:p>
+      <w:pPr>
+        <w:pStyle w:val="Normal"/>
+        <w:spacing w:before="0" w:after="120" w:line="276" w:lineRule="auto"/>
+        <w:ind w:left="540" w:hanging="360"/>
+      </w:pPr>
+      <w:r>
+        <w:rPr>
+          <w:b/>
+        </w:rPr>
+        <w:t xml:space="preserve">1. </w:t>
+      </w:r>
+      <w:r>
+        <w:rPr/>
+        <w:t xml:space="preserve">Create </w:t>
+      </w:r>
+      <w:r>
+        <w:rPr>
+          <w:b/>
+        </w:rPr>
+        <w:t xml:space="preserve">Power Automate Management</w:t>
+      </w:r>
+      <w:r>
+        <w:rPr/>
+        <w:t xml:space="preserve">.</w:t>
+      </w:r>
+    </w:p>
+    <w:p>
+      <w:pPr>
+        <w:pStyle w:val="Normal"/>
+        <w:spacing w:before="0" w:after="120" w:line="276" w:lineRule="auto"/>
+        <w:ind w:left="540" w:hanging="360"/>
+      </w:pPr>
+      <w:r>
+        <w:rPr>
+          <w:b/>
+        </w:rPr>
+        <w:t xml:space="preserve">2. </w:t>
+      </w:r>
+      <w:r>
+        <w:rPr/>
+        <w:t xml:space="preserve">Use Microsoft Entra ID Integrated authentication.</w:t>
+      </w:r>
+    </w:p>
+    <w:p>
+      <w:pPr>
+        <w:pStyle w:val="Normal"/>
+        <w:spacing w:before="0" w:after="120" w:line="276" w:lineRule="auto"/>
+        <w:ind w:left="540" w:hanging="360"/>
+      </w:pPr>
+      <w:r>
+        <w:rPr>
+          <w:b/>
+        </w:rPr>
+        <w:t xml:space="preserve">3. </w:t>
+      </w:r>
+      <w:r>
+        <w:rPr/>
+        <w:t xml:space="preserve">Sign in with the target-tenant administrator.</w:t>
+      </w:r>
+    </w:p>
+    <w:p>
+      <w:pPr>
+        <w:pStyle w:val="Normal"/>
+        <w:spacing w:before="0" w:after="120" w:line="276" w:lineRule="auto"/>
+        <w:ind w:left="540" w:hanging="360"/>
+      </w:pPr>
+      <w:r>
+        <w:rPr>
+          <w:b/>
+        </w:rPr>
+        <w:t xml:space="preserve">4. </w:t>
+      </w:r>
+      <w:r>
+        <w:rPr/>
+        <w:t xml:space="preserve">Confirm the connection shows </w:t>
+      </w:r>
+      <w:r>
+        <w:rPr>
+          <w:b/>
+        </w:rPr>
+        <w:t xml:space="preserve">Connected</w:t>
+      </w:r>
+      <w:r>
+        <w:rPr/>
+        <w:t xml:space="preserve">.</w:t>
       </w:r>
     </w:p>
     <w:p>
@@ -4512,7 +5114,7 @@
       </w:pPr>
       <w:r>
         <w:rPr/>
-        <w:t xml:space="preserve">8. First-run configuration</w:t>
+        <w:t xml:space="preserve">7. Import the solution</w:t>
       </w:r>
     </w:p>
     <w:p>
@@ -4529,7 +5131,7 @@
       </w:r>
       <w:r>
         <w:rPr/>
-        <w:t xml:space="preserve">Open Orphaned Flow Finder from the target solution.</w:t>
+        <w:t xml:space="preserve">Sign in to the target maker portal.</w:t>
       </w:r>
     </w:p>
     <w:p>
@@ -4546,27 +5148,7 @@
       </w:r>
       <w:r>
         <w:rPr/>
-        <w:t xml:space="preserve">When Power Apps displays </w:t>
-      </w:r>
-      <w:r>
-        <w:rPr>
-          <w:b/>
-        </w:rPr>
-        <w:t xml:space="preserve">Allow this app to access your data</w:t>
-      </w:r>
-      <w:r>
-        <w:rPr/>
-        <w:t xml:space="preserve">, verify all</w:t>
-      </w:r>
-    </w:p>
-    <w:p>
-      <w:pPr>
-        <w:pStyle w:val="Normal"/>
-        <w:spacing w:before="0" w:after="120" w:line="276" w:lineRule="auto"/>
-      </w:pPr>
-      <w:r>
-        <w:rPr/>
-        <w:t xml:space="preserve">four connectors.</w:t>
+        <w:t xml:space="preserve">Select the target environment.</w:t>
       </w:r>
     </w:p>
     <w:p>
@@ -4583,13 +5165,40 @@
       </w:r>
       <w:r>
         <w:rPr/>
+        <w:t xml:space="preserve">Open </w:t>
+      </w:r>
+      <w:r>
+        <w:rPr>
+          <w:b/>
+        </w:rPr>
+        <w:t xml:space="preserve">Solutions</w:t>
+      </w:r>
+      <w:r>
+        <w:rPr/>
+        <w:t xml:space="preserve">.</w:t>
+      </w:r>
+    </w:p>
+    <w:p>
+      <w:pPr>
+        <w:pStyle w:val="Normal"/>
+        <w:spacing w:before="0" w:after="120" w:line="276" w:lineRule="auto"/>
+        <w:ind w:left="540" w:hanging="360"/>
+      </w:pPr>
+      <w:r>
+        <w:rPr>
+          <w:b/>
+        </w:rPr>
+        <w:t xml:space="preserve">4. </w:t>
+      </w:r>
+      <w:r>
+        <w:rPr/>
         <w:t xml:space="preserve">Select </w:t>
       </w:r>
       <w:r>
         <w:rPr>
           <w:b/>
         </w:rPr>
-        <w:t xml:space="preserve">Allow</w:t>
+        <w:t xml:space="preserve">Import solution</w:t>
       </w:r>
       <w:r>
         <w:rPr/>
@@ -4606,102 +5215,227 @@
         <w:rPr>
           <w:b/>
         </w:rPr>
+        <w:t xml:space="preserve">5. </w:t>
+      </w:r>
+      <w:r>
+        <w:rPr/>
+        <w:t xml:space="preserve">Upload </w:t>
+      </w:r>
+      <w:r>
+        <w:rPr>
+          <w:rFonts w:ascii="Consolas" w:hAnsi="Consolas"/>
+          <w:sz w:val="18"/>
+          <w:szCs w:val="18"/>
+          <w:shd w:val="clear" w:color="auto" w:fill="F3F4F6"/>
+        </w:rPr>
+        <w:t xml:space="preserve">OrphanedFlowFinder_1_1_2_0_managed.zip</w:t>
+      </w:r>
+      <w:r>
+        <w:rPr/>
+        <w:t xml:space="preserve"> for the standard</w:t>
+      </w:r>
+    </w:p>
+    <w:p>
+      <w:pPr>
+        <w:pStyle w:val="Normal"/>
+        <w:spacing w:before="0" w:after="120" w:line="276" w:lineRule="auto"/>
+      </w:pPr>
+      <w:r>
+        <w:rPr/>
+        <w:t xml:space="preserve">installation, or the unmanaged ZIP only when the target team will own future development.</w:t>
+      </w:r>
+    </w:p>
+    <w:p>
+      <w:pPr>
+        <w:pStyle w:val="Normal"/>
+        <w:spacing w:before="0" w:after="120" w:line="276" w:lineRule="auto"/>
+        <w:ind w:left="540" w:hanging="360"/>
+      </w:pPr>
+      <w:r>
+        <w:rPr>
+          <w:b/>
+        </w:rPr>
+        <w:t xml:space="preserve">6. </w:t>
+      </w:r>
+      <w:r>
+        <w:rPr/>
+        <w:t xml:space="preserve">Review the package details and dependencies.</w:t>
+      </w:r>
+    </w:p>
+    <w:p>
+      <w:pPr>
+        <w:pStyle w:val="Normal"/>
+        <w:spacing w:before="0" w:after="120" w:line="276" w:lineRule="auto"/>
+        <w:ind w:left="540" w:hanging="360"/>
+      </w:pPr>
+      <w:r>
+        <w:rPr>
+          <w:b/>
+        </w:rPr>
+        <w:t xml:space="preserve">7. </w:t>
+      </w:r>
+      <w:r>
+        <w:rPr/>
+        <w:t xml:space="preserve">Map each connection reference to the matching target connection.</w:t>
+      </w:r>
+    </w:p>
+    <w:p>
+      <w:pPr>
+        <w:pStyle w:val="Normal"/>
+        <w:spacing w:before="0" w:after="120" w:line="276" w:lineRule="auto"/>
+        <w:ind w:left="540" w:hanging="360"/>
+      </w:pPr>
+      <w:r>
+        <w:rPr>
+          <w:b/>
+        </w:rPr>
+        <w:t xml:space="preserve">8. </w:t>
+      </w:r>
+      <w:r>
+        <w:rPr/>
+        <w:t xml:space="preserve">Complete the import.</w:t>
+      </w:r>
+    </w:p>
+    <w:p>
+      <w:pPr>
+        <w:pStyle w:val="Normal"/>
+        <w:spacing w:before="0" w:after="120" w:line="276" w:lineRule="auto"/>
+        <w:ind w:left="540" w:hanging="360"/>
+      </w:pPr>
+      <w:r>
+        <w:rPr>
+          <w:b/>
+        </w:rPr>
+        <w:t xml:space="preserve">9. </w:t>
+      </w:r>
+      <w:r>
+        <w:rPr/>
+        <w:t xml:space="preserve">Wait for the import to report Success.</w:t>
+      </w:r>
+    </w:p>
+    <w:p>
+      <w:pPr>
+        <w:pStyle w:val="Normal"/>
+        <w:spacing w:before="0" w:after="120" w:line="276" w:lineRule="auto"/>
+        <w:ind w:left="540" w:hanging="360"/>
+      </w:pPr>
+      <w:r>
+        <w:rPr>
+          <w:b/>
+        </w:rPr>
+        <w:t xml:space="preserve">10. </w:t>
+      </w:r>
+      <w:r>
+        <w:rPr/>
+        <w:t xml:space="preserve">Open the imported solution and verify the Code App and six connection</w:t>
+      </w:r>
+    </w:p>
+    <w:p>
+      <w:pPr>
+        <w:pStyle w:val="Normal"/>
+        <w:spacing w:before="0" w:after="120" w:line="276" w:lineRule="auto"/>
+      </w:pPr>
+      <w:r>
+        <w:rPr/>
+        <w:t xml:space="preserve">references are present.</w:t>
+      </w:r>
+    </w:p>
+    <w:p>
+      <w:pPr>
+        <w:pStyle w:val="Normal"/>
+        <w:spacing w:before="0" w:after="120" w:line="276" w:lineRule="auto"/>
+      </w:pPr>
+      <w:r>
+        <w:rPr/>
+        <w:t xml:space="preserve">If the import wizard doesn't request a connection mapping:</w:t>
+      </w:r>
+    </w:p>
+    <w:p>
+      <w:pPr>
+        <w:pStyle w:val="Normal"/>
+        <w:spacing w:before="0" w:after="120" w:line="276" w:lineRule="auto"/>
+        <w:ind w:left="540" w:hanging="360"/>
+      </w:pPr>
+      <w:r>
+        <w:rPr>
+          <w:b/>
+        </w:rPr>
+        <w:t xml:space="preserve">1. </w:t>
+      </w:r>
+      <w:r>
+        <w:rPr/>
+        <w:t xml:space="preserve">Open each connection reference in the imported solution.</w:t>
+      </w:r>
+    </w:p>
+    <w:p>
+      <w:pPr>
+        <w:pStyle w:val="Normal"/>
+        <w:spacing w:before="0" w:after="120" w:line="276" w:lineRule="auto"/>
+        <w:ind w:left="540" w:hanging="360"/>
+      </w:pPr>
+      <w:r>
+        <w:rPr>
+          <w:b/>
+        </w:rPr>
+        <w:t xml:space="preserve">2. </w:t>
+      </w:r>
+      <w:r>
+        <w:rPr/>
+        <w:t xml:space="preserve">Set </w:t>
+      </w:r>
+      <w:r>
+        <w:rPr>
+          <w:b/>
+        </w:rPr>
+        <w:t xml:space="preserve">Current connection</w:t>
+      </w:r>
+      <w:r>
+        <w:rPr/>
+        <w:t xml:space="preserve"> to the correct target connection.</w:t>
+      </w:r>
+    </w:p>
+    <w:p>
+      <w:pPr>
+        <w:pStyle w:val="Normal"/>
+        <w:spacing w:before="0" w:after="120" w:line="276" w:lineRule="auto"/>
+        <w:ind w:left="540" w:hanging="360"/>
+      </w:pPr>
+      <w:r>
+        <w:rPr>
+          <w:b/>
+        </w:rPr>
+        <w:t xml:space="preserve">3. </w:t>
+      </w:r>
+      <w:r>
+        <w:rPr/>
+        <w:t xml:space="preserve">Save the reference.</w:t>
+      </w:r>
+    </w:p>
+    <w:p>
+      <w:pPr>
+        <w:pStyle w:val="Normal"/>
+        <w:spacing w:before="0" w:after="120" w:line="276" w:lineRule="auto"/>
+        <w:ind w:left="540" w:hanging="360"/>
+      </w:pPr>
+      <w:r>
+        <w:rPr>
+          <w:b/>
+        </w:rPr>
         <w:t xml:space="preserve">4. </w:t>
       </w:r>
       <w:r>
         <w:rPr/>
-        <w:t xml:space="preserve">Wait for the pre-scan environment list to load.</w:t>
-      </w:r>
-    </w:p>
-    <w:p>
-      <w:pPr>
-        <w:pStyle w:val="Normal"/>
-        <w:spacing w:before="0" w:after="120" w:line="276" w:lineRule="auto"/>
-        <w:ind w:left="540" w:hanging="360"/>
-      </w:pPr>
-      <w:r>
-        <w:rPr>
-          <w:b/>
-        </w:rPr>
-        <w:t xml:space="preserve">5. </w:t>
-      </w:r>
-      <w:r>
-        <w:rPr/>
-        <w:t xml:space="preserve">Choose one scan scope:</w:t>
-      </w:r>
-    </w:p>
-    <w:p>
-      <w:pPr>
-        <w:pStyle w:val="Normal"/>
-        <w:spacing w:before="0" w:after="120" w:line="276" w:lineRule="auto"/>
-      </w:pPr>
-      <w:r>
-        <w:rPr/>
-        <w:t xml:space="preserve">- Leave </w:t>
-      </w:r>
-      <w:r>
-        <w:rPr>
-          <w:b/>
-        </w:rPr>
-        <w:t xml:space="preserve">All environments</w:t>
-      </w:r>
-      <w:r>
-        <w:rPr/>
-        <w:t xml:space="preserve"> selected. - Check </w:t>
-      </w:r>
-      <w:r>
-        <w:rPr>
-          <w:b/>
-        </w:rPr>
-        <w:t xml:space="preserve">Scan only the Default environment</w:t>
-      </w:r>
-      <w:r>
-        <w:rPr/>
-        <w:t xml:space="preserve">. - Select one Power Platform environment from the list.</w:t>
-      </w:r>
-    </w:p>
-    <w:p>
-      <w:pPr>
-        <w:pStyle w:val="Normal"/>
-        <w:spacing w:before="0" w:after="120" w:line="276" w:lineRule="auto"/>
-        <w:ind w:left="540" w:hanging="360"/>
-      </w:pPr>
-      <w:r>
-        <w:rPr>
-          <w:b/>
-        </w:rPr>
-        <w:t xml:space="preserve">6. </w:t>
-      </w:r>
-      <w:r>
-        <w:rPr/>
-        <w:t xml:space="preserve">Select the applicable scan button.</w:t>
-      </w:r>
-    </w:p>
-    <w:p>
-      <w:pPr>
-        <w:pStyle w:val="Normal"/>
-        <w:spacing w:before="0" w:after="120" w:line="276" w:lineRule="auto"/>
-        <w:ind w:left="540" w:hanging="360"/>
-      </w:pPr>
-      <w:r>
-        <w:rPr>
-          <w:b/>
-        </w:rPr>
-        <w:t xml:space="preserve">7. </w:t>
-      </w:r>
-      <w:r>
-        <w:rPr/>
-        <w:t xml:space="preserve">Keep the player open until inventory and directory validation complete.</w:t>
-      </w:r>
-    </w:p>
-    <w:p>
-      <w:pPr>
-        <w:pStyle w:val="Normal"/>
-        <w:spacing w:before="0" w:after="120" w:line="276" w:lineRule="auto"/>
-      </w:pPr>
-      <w:r>
-        <w:rPr/>
-        <w:t xml:space="preserve">Power Platform Inventory can take up to 15 minutes to reflect recently created, modified, or deleted resources.</w:t>
+        <w:t xml:space="preserve">Publish all customizations.</w:t>
+      </w:r>
+    </w:p>
+    <w:p>
+      <w:pPr>
+        <w:pStyle w:val="Normal"/>
+        <w:spacing w:before="0" w:after="120" w:line="276" w:lineRule="auto"/>
+      </w:pPr>
+      <w:r>
+        <w:rPr/>
+        <w:t xml:space="preserve">Never point a target reference to a source-tenant connection ID.</w:t>
       </w:r>
     </w:p>
     <w:p>
@@ -4711,6 +5445,205 @@
       </w:pPr>
       <w:r>
         <w:rPr/>
+        <w:t xml:space="preserve">8. First-run configuration</w:t>
+      </w:r>
+    </w:p>
+    <w:p>
+      <w:pPr>
+        <w:pStyle w:val="Normal"/>
+        <w:spacing w:before="0" w:after="120" w:line="276" w:lineRule="auto"/>
+        <w:ind w:left="540" w:hanging="360"/>
+      </w:pPr>
+      <w:r>
+        <w:rPr>
+          <w:b/>
+        </w:rPr>
+        <w:t xml:space="preserve">1. </w:t>
+      </w:r>
+      <w:r>
+        <w:rPr/>
+        <w:t xml:space="preserve">Open Orphaned Flow Finder from the target solution.</w:t>
+      </w:r>
+    </w:p>
+    <w:p>
+      <w:pPr>
+        <w:pStyle w:val="Normal"/>
+        <w:spacing w:before="0" w:after="120" w:line="276" w:lineRule="auto"/>
+        <w:ind w:left="540" w:hanging="360"/>
+      </w:pPr>
+      <w:r>
+        <w:rPr>
+          <w:b/>
+        </w:rPr>
+        <w:t xml:space="preserve">2. </w:t>
+      </w:r>
+      <w:r>
+        <w:rPr/>
+        <w:t xml:space="preserve">When Power Apps displays </w:t>
+      </w:r>
+      <w:r>
+        <w:rPr>
+          <w:b/>
+        </w:rPr>
+        <w:t xml:space="preserve">Allow this app to access your data</w:t>
+      </w:r>
+      <w:r>
+        <w:rPr/>
+        <w:t xml:space="preserve">, verify all</w:t>
+      </w:r>
+    </w:p>
+    <w:p>
+      <w:pPr>
+        <w:pStyle w:val="Normal"/>
+        <w:spacing w:before="0" w:after="120" w:line="276" w:lineRule="auto"/>
+      </w:pPr>
+      <w:r>
+        <w:rPr/>
+        <w:t xml:space="preserve">six connection references.</w:t>
+      </w:r>
+    </w:p>
+    <w:p>
+      <w:pPr>
+        <w:pStyle w:val="Normal"/>
+        <w:spacing w:before="0" w:after="120" w:line="276" w:lineRule="auto"/>
+        <w:ind w:left="540" w:hanging="360"/>
+      </w:pPr>
+      <w:r>
+        <w:rPr>
+          <w:b/>
+        </w:rPr>
+        <w:t xml:space="preserve">3. </w:t>
+      </w:r>
+      <w:r>
+        <w:rPr/>
+        <w:t xml:space="preserve">Select </w:t>
+      </w:r>
+      <w:r>
+        <w:rPr>
+          <w:b/>
+        </w:rPr>
+        <w:t xml:space="preserve">Allow</w:t>
+      </w:r>
+      <w:r>
+        <w:rPr/>
+        <w:t xml:space="preserve">.</w:t>
+      </w:r>
+    </w:p>
+    <w:p>
+      <w:pPr>
+        <w:pStyle w:val="Normal"/>
+        <w:spacing w:before="0" w:after="120" w:line="276" w:lineRule="auto"/>
+        <w:ind w:left="540" w:hanging="360"/>
+      </w:pPr>
+      <w:r>
+        <w:rPr>
+          <w:b/>
+        </w:rPr>
+        <w:t xml:space="preserve">4. </w:t>
+      </w:r>
+      <w:r>
+        <w:rPr/>
+        <w:t xml:space="preserve">Wait for the pre-scan environment list to load.</w:t>
+      </w:r>
+    </w:p>
+    <w:p>
+      <w:pPr>
+        <w:pStyle w:val="Normal"/>
+        <w:spacing w:before="0" w:after="120" w:line="276" w:lineRule="auto"/>
+        <w:ind w:left="540" w:hanging="360"/>
+      </w:pPr>
+      <w:r>
+        <w:rPr>
+          <w:b/>
+        </w:rPr>
+        <w:t xml:space="preserve">5. </w:t>
+      </w:r>
+      <w:r>
+        <w:rPr/>
+        <w:t xml:space="preserve">Choose one scan scope:</w:t>
+      </w:r>
+    </w:p>
+    <w:p>
+      <w:pPr>
+        <w:pStyle w:val="Normal"/>
+        <w:spacing w:before="0" w:after="120" w:line="276" w:lineRule="auto"/>
+      </w:pPr>
+      <w:r>
+        <w:rPr/>
+        <w:t xml:space="preserve">- Leave </w:t>
+      </w:r>
+      <w:r>
+        <w:rPr>
+          <w:b/>
+        </w:rPr>
+        <w:t xml:space="preserve">All environments</w:t>
+      </w:r>
+      <w:r>
+        <w:rPr/>
+        <w:t xml:space="preserve"> selected. - Check </w:t>
+      </w:r>
+      <w:r>
+        <w:rPr>
+          <w:b/>
+        </w:rPr>
+        <w:t xml:space="preserve">Scan only the Default environment</w:t>
+      </w:r>
+      <w:r>
+        <w:rPr/>
+        <w:t xml:space="preserve">. - Select one Power Platform environment from the list.</w:t>
+      </w:r>
+    </w:p>
+    <w:p>
+      <w:pPr>
+        <w:pStyle w:val="Normal"/>
+        <w:spacing w:before="0" w:after="120" w:line="276" w:lineRule="auto"/>
+        <w:ind w:left="540" w:hanging="360"/>
+      </w:pPr>
+      <w:r>
+        <w:rPr>
+          <w:b/>
+        </w:rPr>
+        <w:t xml:space="preserve">6. </w:t>
+      </w:r>
+      <w:r>
+        <w:rPr/>
+        <w:t xml:space="preserve">Select the applicable scan button.</w:t>
+      </w:r>
+    </w:p>
+    <w:p>
+      <w:pPr>
+        <w:pStyle w:val="Normal"/>
+        <w:spacing w:before="0" w:after="120" w:line="276" w:lineRule="auto"/>
+        <w:ind w:left="540" w:hanging="360"/>
+      </w:pPr>
+      <w:r>
+        <w:rPr>
+          <w:b/>
+        </w:rPr>
+        <w:t xml:space="preserve">7. </w:t>
+      </w:r>
+      <w:r>
+        <w:rPr/>
+        <w:t xml:space="preserve">Keep the player open until inventory and directory validation complete.</w:t>
+      </w:r>
+    </w:p>
+    <w:p>
+      <w:pPr>
+        <w:pStyle w:val="Normal"/>
+        <w:spacing w:before="0" w:after="120" w:line="276" w:lineRule="auto"/>
+      </w:pPr>
+      <w:r>
+        <w:rPr/>
+        <w:t xml:space="preserve">Power Platform Inventory can take up to 15 minutes to reflect recently created, modified, or deleted resources.</w:t>
+      </w:r>
+    </w:p>
+    <w:p>
+      <w:pPr>
+        <w:pStyle w:val="Heading1"/>
+        <w:spacing w:before="280" w:after="120" w:line="276" w:lineRule="auto"/>
+      </w:pPr>
+      <w:r>
+        <w:rPr/>
         <w:t xml:space="preserve">9. Acceptance test</w:t>
       </w:r>
     </w:p>
@@ -5002,6 +5935,66 @@
       <w:r>
         <w:rPr/>
         <w:t xml:space="preserve">Active, Disabled, Deleted, Missing, and Unknown statuses behave as expected.</w:t>
+      </w:r>
+    </w:p>
+    <w:p>
+      <w:pPr>
+        <w:pStyle w:val="Normal"/>
+        <w:spacing w:before="0" w:after="120" w:line="276" w:lineRule="auto"/>
+        <w:ind w:left="540" w:hanging="360"/>
+      </w:pPr>
+      <w:r>
+        <w:rPr>
+          <w:b/>
+        </w:rPr>
+        <w:t xml:space="preserve">• </w:t>
+      </w:r>
+      <w:r>
+        <w:rPr/>
+        <w:t xml:space="preserve">The base scan completes without waiting for per-flow detail calls.</w:t>
+      </w:r>
+    </w:p>
+    <w:p>
+      <w:pPr>
+        <w:pStyle w:val="Normal"/>
+        <w:spacing w:before="0" w:after="120" w:line="276" w:lineRule="auto"/>
+        <w:ind w:left="540" w:hanging="360"/>
+      </w:pPr>
+      <w:r>
+        <w:rPr>
+          <w:b/>
+        </w:rPr>
+        <w:t xml:space="preserve">• </w:t>
+      </w:r>
+      <w:r>
+        <w:rPr>
+          <w:b/>
+        </w:rPr>
+        <w:t xml:space="preserve">Load page details</w:t>
+      </w:r>
+      <w:r>
+        <w:rPr/>
+        <w:t xml:space="preserve"> resolves user co-owner names and returns the latest run</w:t>
+      </w:r>
+    </w:p>
+    <w:p>
+      <w:pPr>
+        <w:pStyle w:val="Normal"/>
+        <w:spacing w:before="0" w:after="120" w:line="276" w:lineRule="auto"/>
+      </w:pPr>
+      <w:r>
+        <w:rPr/>
+        <w:t xml:space="preserve">or </w:t>
+      </w:r>
+      <w:r>
+        <w:rPr>
+          <w:b/>
+        </w:rPr>
+        <w:t xml:space="preserve">No runs found</w:t>
+      </w:r>
+      <w:r>
+        <w:rPr/>
+        <w:t xml:space="preserve"> for the current page.</w:t>
       </w:r>
     </w:p>
     <w:p>
@@ -6123,7 +7116,7 @@
             </w:pPr>
             <w:r>
               <w:rPr/>
-              <w:t xml:space="preserve">Create all four references in the source solution</w:t>
+              <w:t xml:space="preserve">Create all six references in the source solution</w:t>
             </w:r>
           </w:p>
         </w:tc>
@@ -6191,7 +7184,7 @@
             </w:pPr>
             <w:r>
               <w:rPr/>
-              <w:t xml:space="preserve">HTTP connector returns authorization errors</w:t>
+              <w:t xml:space="preserve">Inventory HTTP connector returns authorization errors</w:t>
             </w:r>
           </w:p>
         </w:tc>
@@ -6223,7 +7216,7 @@
             </w:pPr>
             <w:r>
               <w:rPr/>
-              <w:t xml:space="preserve">For GCC, set both fields to </w:t>
+              <w:t xml:space="preserve">Set both Inventory API fields to </w:t>
             </w:r>
             <w:r>
               <w:rPr>
@@ -6253,6 +7246,82 @@
               <w:spacing w:after="40"/>
             </w:pPr>
             <w:r>
+              <w:rPr/>
+              <w:t xml:space="preserve">Flow Admin HTTP connector returns authorization errors</w:t>
+            </w:r>
+          </w:p>
+        </w:tc>
+        <w:tc>
+          <w:tcPr>
+            <w:tcW w:w="3000" w:type="dxa"/>
+            <w:vAlign w:val="center"/>
+          </w:tcPr>
+          <w:p>
+            <w:pPr>
+              <w:pStyle w:val="TableText"/>
+              <w:spacing w:after="40"/>
+            </w:pPr>
+            <w:r>
+              <w:rPr/>
+              <w:t xml:space="preserve">The Flow API base URL or resource URI is wrong</w:t>
+            </w:r>
+          </w:p>
+        </w:tc>
+        <w:tc>
+          <w:tcPr>
+            <w:tcW w:w="3000" w:type="dxa"/>
+            <w:vAlign w:val="center"/>
+          </w:tcPr>
+          <w:p>
+            <w:pPr>
+              <w:pStyle w:val="TableText"/>
+              <w:spacing w:after="40"/>
+            </w:pPr>
+            <w:r>
+              <w:rPr/>
+              <w:t xml:space="preserve">Use base </w:t>
+            </w:r>
+            <w:r>
+              <w:rPr>
+                <w:rFonts w:ascii="Consolas" w:hAnsi="Consolas"/>
+                <w:sz w:val="18"/>
+                <w:szCs w:val="18"/>
+                <w:shd w:val="clear" w:color="auto" w:fill="F3F4F6"/>
+              </w:rPr>
+              <w:t xml:space="preserve">https://gov.api.flow.microsoft.us</w:t>
+            </w:r>
+            <w:r>
+              <w:rPr/>
+              <w:t xml:space="preserve"> and resource </w:t>
+            </w:r>
+            <w:r>
+              <w:rPr>
+                <w:rFonts w:ascii="Consolas" w:hAnsi="Consolas"/>
+                <w:sz w:val="18"/>
+                <w:szCs w:val="18"/>
+                <w:shd w:val="clear" w:color="auto" w:fill="F3F4F6"/>
+              </w:rPr>
+              <w:t xml:space="preserve">https://gov.service.flow.microsoft.us/</w:t>
+            </w:r>
+            <w:r>
+              <w:rPr/>
+              <w:t xml:space="preserve">, then repair consent</w:t>
+            </w:r>
+          </w:p>
+        </w:tc>
+      </w:tr>
+      <w:tr>
+        <w:tc>
+          <w:tcPr>
+            <w:tcW w:w="3000" w:type="dxa"/>
+            <w:vAlign w:val="center"/>
+          </w:tcPr>
+          <w:p>
+            <w:pPr>
+              <w:pStyle w:val="TableText"/>
+              <w:spacing w:after="40"/>
+            </w:pPr>
+            <w:r>
               <w:rPr>
                 <w:rFonts w:ascii="Consolas" w:hAnsi="Consolas"/>
                 <w:sz w:val="18"/>
@@ -6279,23 +7348,23 @@
             </w:pPr>
             <w:r>
               <w:rPr/>
-              <w:t xml:space="preserve">Cross-cloud certificate issue in the V2 connector path</w:t>
-            </w:r>
-          </w:p>
-        </w:tc>
-        <w:tc>
-          <w:tcPr>
-            <w:tcW w:w="3000" w:type="dxa"/>
-            <w:vAlign w:val="center"/>
-          </w:tcPr>
-          <w:p>
-            <w:pPr>
-              <w:pStyle w:val="TableText"/>
-              <w:spacing w:after="40"/>
-            </w:pPr>
-            <w:r>
-              <w:rPr/>
-              <w:t xml:space="preserve">This app must use the preauthorized HTTP connector; don't bind it to Power Platform for Admins V2</w:t>
+              <w:t xml:space="preserve">The unsupported V2 connector was added to an older build</w:t>
+            </w:r>
+          </w:p>
+        </w:tc>
+        <w:tc>
+          <w:tcPr>
+            <w:tcW w:w="3000" w:type="dxa"/>
+            <w:vAlign w:val="center"/>
+          </w:tcPr>
+          <w:p>
+            <w:pPr>
+              <w:pStyle w:val="TableText"/>
+              <w:spacing w:after="40"/>
+            </w:pPr>
+            <w:r>
+              <w:rPr/>
+              <w:t xml:space="preserve">Upgrade to v1.1.2 or later; the app must use the Flow-scoped preauthorized HTTP connection instead</w:t>
             </w:r>
           </w:p>
         </w:tc>
@@ -6379,7 +7448,273 @@
             </w:pPr>
             <w:r>
               <w:rPr/>
-              <w:t xml:space="preserve">Power Automate Management couldn't read that flow's owner permissions</w:t>
+              <w:t xml:space="preserve">Power Automate for Admins couldn't read flow permissions</w:t>
+            </w:r>
+          </w:p>
+        </w:tc>
+        <w:tc>
+          <w:tcPr>
+            <w:tcW w:w="3000" w:type="dxa"/>
+            <w:vAlign w:val="center"/>
+          </w:tcPr>
+          <w:p>
+            <w:pPr>
+              <w:pStyle w:val="TableText"/>
+              <w:spacing w:after="40"/>
+            </w:pPr>
+            <w:r>
+              <w:rPr/>
+              <w:t xml:space="preserve">Repair that connection, verify admin access, and retry </w:t>
+            </w:r>
+            <w:r>
+              <w:rPr>
+                <w:b/>
+              </w:rPr>
+              <w:t xml:space="preserve">Load page details</w:t>
+            </w:r>
+          </w:p>
+        </w:tc>
+      </w:tr>
+      <w:tr>
+        <w:tc>
+          <w:tcPr>
+            <w:tcW w:w="3000" w:type="dxa"/>
+            <w:vAlign w:val="center"/>
+          </w:tcPr>
+          <w:p>
+            <w:pPr>
+              <w:pStyle w:val="TableText"/>
+              <w:spacing w:after="40"/>
+            </w:pPr>
+            <w:r>
+              <w:rPr/>
+              <w:t xml:space="preserve">Additional co-owners show GUIDs</w:t>
+            </w:r>
+          </w:p>
+        </w:tc>
+        <w:tc>
+          <w:tcPr>
+            <w:tcW w:w="3000" w:type="dxa"/>
+            <w:vAlign w:val="center"/>
+          </w:tcPr>
+          <w:p>
+            <w:pPr>
+              <w:pStyle w:val="TableText"/>
+              <w:spacing w:after="40"/>
+            </w:pPr>
+            <w:r>
+              <w:rPr/>
+              <w:t xml:space="preserve">Office 365 Users couldn't resolve those user IDs, or the principal is a group</w:t>
+            </w:r>
+          </w:p>
+        </w:tc>
+        <w:tc>
+          <w:tcPr>
+            <w:tcW w:w="3000" w:type="dxa"/>
+            <w:vAlign w:val="center"/>
+          </w:tcPr>
+          <w:p>
+            <w:pPr>
+              <w:pStyle w:val="TableText"/>
+              <w:spacing w:after="40"/>
+            </w:pPr>
+            <w:r>
+              <w:rPr/>
+              <w:t xml:space="preserve">Review scan notes; users resolve to names/UPNs while groups remain labeled as groups</w:t>
+            </w:r>
+          </w:p>
+        </w:tc>
+      </w:tr>
+      <w:tr>
+        <w:tc>
+          <w:tcPr>
+            <w:tcW w:w="3000" w:type="dxa"/>
+            <w:vAlign w:val="center"/>
+          </w:tcPr>
+          <w:p>
+            <w:pPr>
+              <w:pStyle w:val="TableText"/>
+              <w:spacing w:after="40"/>
+            </w:pPr>
+            <w:r>
+              <w:rPr/>
+              <w:t xml:space="preserve">Last flow run shows Not loaded</w:t>
+            </w:r>
+          </w:p>
+        </w:tc>
+        <w:tc>
+          <w:tcPr>
+            <w:tcW w:w="3000" w:type="dxa"/>
+            <w:vAlign w:val="center"/>
+          </w:tcPr>
+          <w:p>
+            <w:pPr>
+              <w:pStyle w:val="TableText"/>
+              <w:spacing w:after="40"/>
+            </w:pPr>
+            <w:r>
+              <w:rPr/>
+              <w:t xml:space="preserve">Page details haven't been requested</w:t>
+            </w:r>
+          </w:p>
+        </w:tc>
+        <w:tc>
+          <w:tcPr>
+            <w:tcW w:w="3000" w:type="dxa"/>
+            <w:vAlign w:val="center"/>
+          </w:tcPr>
+          <w:p>
+            <w:pPr>
+              <w:pStyle w:val="TableText"/>
+              <w:spacing w:after="40"/>
+            </w:pPr>
+            <w:r>
+              <w:rPr/>
+              <w:t xml:space="preserve">Select </w:t>
+            </w:r>
+            <w:r>
+              <w:rPr>
+                <w:b/>
+              </w:rPr>
+              <w:t xml:space="preserve">Load page details</w:t>
+            </w:r>
+            <w:r>
+              <w:rPr/>
+              <w:t xml:space="preserve"> above the result table</w:t>
+            </w:r>
+          </w:p>
+        </w:tc>
+      </w:tr>
+      <w:tr>
+        <w:tc>
+          <w:tcPr>
+            <w:tcW w:w="3000" w:type="dxa"/>
+            <w:vAlign w:val="center"/>
+          </w:tcPr>
+          <w:p>
+            <w:pPr>
+              <w:pStyle w:val="TableText"/>
+              <w:spacing w:after="40"/>
+            </w:pPr>
+            <w:r>
+              <w:rPr/>
+              <w:t xml:space="preserve">Last flow run shows Lookup failed</w:t>
+            </w:r>
+          </w:p>
+        </w:tc>
+        <w:tc>
+          <w:tcPr>
+            <w:tcW w:w="3000" w:type="dxa"/>
+            <w:vAlign w:val="center"/>
+          </w:tcPr>
+          <w:p>
+            <w:pPr>
+              <w:pStyle w:val="TableText"/>
+              <w:spacing w:after="40"/>
+            </w:pPr>
+            <w:r>
+              <w:rPr/>
+              <w:t xml:space="preserve">The Flow admin request failed or returned an unreadable response</w:t>
+            </w:r>
+          </w:p>
+        </w:tc>
+        <w:tc>
+          <w:tcPr>
+            <w:tcW w:w="3000" w:type="dxa"/>
+            <w:vAlign w:val="center"/>
+          </w:tcPr>
+          <w:p>
+            <w:pPr>
+              <w:pStyle w:val="TableText"/>
+              <w:spacing w:after="40"/>
+            </w:pPr>
+            <w:r>
+              <w:rPr/>
+              <w:t xml:space="preserve">Review scan notes and repair the Flow Admin API HTTP connection</w:t>
+            </w:r>
+          </w:p>
+        </w:tc>
+      </w:tr>
+      <w:tr>
+        <w:tc>
+          <w:tcPr>
+            <w:tcW w:w="3000" w:type="dxa"/>
+            <w:vAlign w:val="center"/>
+          </w:tcPr>
+          <w:p>
+            <w:pPr>
+              <w:pStyle w:val="TableText"/>
+              <w:spacing w:after="40"/>
+            </w:pPr>
+            <w:r>
+              <w:rPr/>
+              <w:t xml:space="preserve">Inventory is empty or stale</w:t>
+            </w:r>
+          </w:p>
+        </w:tc>
+        <w:tc>
+          <w:tcPr>
+            <w:tcW w:w="3000" w:type="dxa"/>
+            <w:vAlign w:val="center"/>
+          </w:tcPr>
+          <w:p>
+            <w:pPr>
+              <w:pStyle w:val="TableText"/>
+              <w:spacing w:after="40"/>
+            </w:pPr>
+            <w:r>
+              <w:rPr/>
+              <w:t xml:space="preserve">Role doesn't include tenant inventory access, wrong API endpoint, or inventory propagation delay</w:t>
+            </w:r>
+          </w:p>
+        </w:tc>
+        <w:tc>
+          <w:tcPr>
+            <w:tcW w:w="3000" w:type="dxa"/>
+            <w:vAlign w:val="center"/>
+          </w:tcPr>
+          <w:p>
+            <w:pPr>
+              <w:pStyle w:val="TableText"/>
+              <w:spacing w:after="40"/>
+            </w:pPr>
+            <w:r>
+              <w:rPr/>
+              <w:t xml:space="preserve">Verify role/endpoint and wait at least 15 minutes</w:t>
+            </w:r>
+          </w:p>
+        </w:tc>
+      </w:tr>
+      <w:tr>
+        <w:tc>
+          <w:tcPr>
+            <w:tcW w:w="3000" w:type="dxa"/>
+            <w:vAlign w:val="center"/>
+          </w:tcPr>
+          <w:p>
+            <w:pPr>
+              <w:pStyle w:val="TableText"/>
+              <w:spacing w:after="40"/>
+            </w:pPr>
+            <w:r>
+              <w:rPr/>
+              <w:t xml:space="preserve">Dataverse environment is missing</w:t>
+            </w:r>
+          </w:p>
+        </w:tc>
+        <w:tc>
+          <w:tcPr>
+            <w:tcW w:w="3000" w:type="dxa"/>
+            <w:vAlign w:val="center"/>
+          </w:tcPr>
+          <w:p>
+            <w:pPr>
+              <w:pStyle w:val="TableText"/>
+              <w:spacing w:after="40"/>
+            </w:pPr>
+            <w:r>
+              <w:rPr/>
+              <w:t xml:space="preserve">One environment-discovery source failed or inventory hasn't propagated</w:t>
             </w:r>
           </w:p>
         </w:tc>
@@ -6405,7 +7740,7 @@
             </w:r>
             <w:r>
               <w:rPr/>
-              <w:t xml:space="preserve">, repair the Power Automate Management connection, verify admin access, and scan again</w:t>
+              <w:t xml:space="preserve">, verify both admin connections, wait 15 minutes, and scan again; flow-referenced environments are added with an ID-based fallback</w:t>
             </w:r>
           </w:p>
         </w:tc>
@@ -6423,23 +7758,23 @@
             </w:pPr>
             <w:r>
               <w:rPr/>
-              <w:t xml:space="preserve">Last flow run shows Not available</w:t>
-            </w:r>
-          </w:p>
-        </w:tc>
-        <w:tc>
-          <w:tcPr>
-            <w:tcW w:w="3000" w:type="dxa"/>
-            <w:vAlign w:val="center"/>
-          </w:tcPr>
-          <w:p>
-            <w:pPr>
-              <w:pStyle w:val="TableText"/>
-              <w:spacing w:after="40"/>
-            </w:pPr>
-            <w:r>
-              <w:rPr/>
-              <w:t xml:space="preserve">The environment has no confirmed Dataverse database or the flow has no </w:t>
+              <w:t xml:space="preserve">A non-Dataverse environment shows Dataverse</w:t>
+            </w:r>
+          </w:p>
+        </w:tc>
+        <w:tc>
+          <w:tcPr>
+            <w:tcW w:w="3000" w:type="dxa"/>
+            <w:vAlign w:val="center"/>
+          </w:tcPr>
+          <w:p>
+            <w:pPr>
+              <w:pStyle w:val="TableText"/>
+              <w:spacing w:after="40"/>
+            </w:pPr>
+            <w:r>
+              <w:rPr/>
+              <w:t xml:space="preserve">An older build inferred environment state from flow-level </w:t>
             </w:r>
             <w:r>
               <w:rPr>
@@ -6464,235 +7799,6 @@
             </w:pPr>
             <w:r>
               <w:rPr/>
-              <w:t xml:space="preserve">Expected for unsupported rows; use the flow details experience if run history is required</w:t>
-            </w:r>
-          </w:p>
-        </w:tc>
-      </w:tr>
-      <w:tr>
-        <w:tc>
-          <w:tcPr>
-            <w:tcW w:w="3000" w:type="dxa"/>
-            <w:vAlign w:val="center"/>
-          </w:tcPr>
-          <w:p>
-            <w:pPr>
-              <w:pStyle w:val="TableText"/>
-              <w:spacing w:after="40"/>
-            </w:pPr>
-            <w:r>
-              <w:rPr/>
-              <w:t xml:space="preserve">Last flow run shows Lookup failed</w:t>
-            </w:r>
-          </w:p>
-        </w:tc>
-        <w:tc>
-          <w:tcPr>
-            <w:tcW w:w="3000" w:type="dxa"/>
-            <w:vAlign w:val="center"/>
-          </w:tcPr>
-          <w:p>
-            <w:pPr>
-              <w:pStyle w:val="TableText"/>
-              <w:spacing w:after="40"/>
-            </w:pPr>
-            <w:r>
-              <w:rPr/>
-              <w:t xml:space="preserve">The supported Power Platform flow-runs request failed or returned an unreadable response</w:t>
-            </w:r>
-          </w:p>
-        </w:tc>
-        <w:tc>
-          <w:tcPr>
-            <w:tcW w:w="3000" w:type="dxa"/>
-            <w:vAlign w:val="center"/>
-          </w:tcPr>
-          <w:p>
-            <w:pPr>
-              <w:pStyle w:val="TableText"/>
-              <w:spacing w:after="40"/>
-            </w:pPr>
-            <w:r>
-              <w:rPr/>
-              <w:t xml:space="preserve">Review </w:t>
-            </w:r>
-            <w:r>
-              <w:rPr>
-                <w:b/>
-              </w:rPr>
-              <w:t xml:space="preserve">Scan notes and exceptions</w:t>
-            </w:r>
-            <w:r>
-              <w:rPr/>
-              <w:t xml:space="preserve">, verify the GCC HTTP connection, and scan again</w:t>
-            </w:r>
-          </w:p>
-        </w:tc>
-      </w:tr>
-      <w:tr>
-        <w:tc>
-          <w:tcPr>
-            <w:tcW w:w="3000" w:type="dxa"/>
-            <w:vAlign w:val="center"/>
-          </w:tcPr>
-          <w:p>
-            <w:pPr>
-              <w:pStyle w:val="TableText"/>
-              <w:spacing w:after="40"/>
-            </w:pPr>
-            <w:r>
-              <w:rPr/>
-              <w:t xml:space="preserve">Inventory is empty or stale</w:t>
-            </w:r>
-          </w:p>
-        </w:tc>
-        <w:tc>
-          <w:tcPr>
-            <w:tcW w:w="3000" w:type="dxa"/>
-            <w:vAlign w:val="center"/>
-          </w:tcPr>
-          <w:p>
-            <w:pPr>
-              <w:pStyle w:val="TableText"/>
-              <w:spacing w:after="40"/>
-            </w:pPr>
-            <w:r>
-              <w:rPr/>
-              <w:t xml:space="preserve">Role doesn't include tenant inventory access, wrong API endpoint, or inventory propagation delay</w:t>
-            </w:r>
-          </w:p>
-        </w:tc>
-        <w:tc>
-          <w:tcPr>
-            <w:tcW w:w="3000" w:type="dxa"/>
-            <w:vAlign w:val="center"/>
-          </w:tcPr>
-          <w:p>
-            <w:pPr>
-              <w:pStyle w:val="TableText"/>
-              <w:spacing w:after="40"/>
-            </w:pPr>
-            <w:r>
-              <w:rPr/>
-              <w:t xml:space="preserve">Verify role/endpoint and wait at least 15 minutes</w:t>
-            </w:r>
-          </w:p>
-        </w:tc>
-      </w:tr>
-      <w:tr>
-        <w:tc>
-          <w:tcPr>
-            <w:tcW w:w="3000" w:type="dxa"/>
-            <w:vAlign w:val="center"/>
-          </w:tcPr>
-          <w:p>
-            <w:pPr>
-              <w:pStyle w:val="TableText"/>
-              <w:spacing w:after="40"/>
-            </w:pPr>
-            <w:r>
-              <w:rPr/>
-              <w:t xml:space="preserve">Dataverse environment is missing</w:t>
-            </w:r>
-          </w:p>
-        </w:tc>
-        <w:tc>
-          <w:tcPr>
-            <w:tcW w:w="3000" w:type="dxa"/>
-            <w:vAlign w:val="center"/>
-          </w:tcPr>
-          <w:p>
-            <w:pPr>
-              <w:pStyle w:val="TableText"/>
-              <w:spacing w:after="40"/>
-            </w:pPr>
-            <w:r>
-              <w:rPr/>
-              <w:t xml:space="preserve">One environment-discovery source failed or inventory hasn't propagated</w:t>
-            </w:r>
-          </w:p>
-        </w:tc>
-        <w:tc>
-          <w:tcPr>
-            <w:tcW w:w="3000" w:type="dxa"/>
-            <w:vAlign w:val="center"/>
-          </w:tcPr>
-          <w:p>
-            <w:pPr>
-              <w:pStyle w:val="TableText"/>
-              <w:spacing w:after="40"/>
-            </w:pPr>
-            <w:r>
-              <w:rPr/>
-              <w:t xml:space="preserve">Review </w:t>
-            </w:r>
-            <w:r>
-              <w:rPr>
-                <w:b/>
-              </w:rPr>
-              <w:t xml:space="preserve">Scan notes and exceptions</w:t>
-            </w:r>
-            <w:r>
-              <w:rPr/>
-              <w:t xml:space="preserve">, verify both admin connections, wait 15 minutes, and scan again; flow-referenced environments are added with an ID-based fallback</w:t>
-            </w:r>
-          </w:p>
-        </w:tc>
-      </w:tr>
-      <w:tr>
-        <w:tc>
-          <w:tcPr>
-            <w:tcW w:w="3000" w:type="dxa"/>
-            <w:vAlign w:val="center"/>
-          </w:tcPr>
-          <w:p>
-            <w:pPr>
-              <w:pStyle w:val="TableText"/>
-              <w:spacing w:after="40"/>
-            </w:pPr>
-            <w:r>
-              <w:rPr/>
-              <w:t xml:space="preserve">A non-Dataverse environment shows Dataverse</w:t>
-            </w:r>
-          </w:p>
-        </w:tc>
-        <w:tc>
-          <w:tcPr>
-            <w:tcW w:w="3000" w:type="dxa"/>
-            <w:vAlign w:val="center"/>
-          </w:tcPr>
-          <w:p>
-            <w:pPr>
-              <w:pStyle w:val="TableText"/>
-              <w:spacing w:after="40"/>
-            </w:pPr>
-            <w:r>
-              <w:rPr/>
-              <w:t xml:space="preserve">An older build inferred environment state from flow-level </w:t>
-            </w:r>
-            <w:r>
-              <w:rPr>
-                <w:rFonts w:ascii="Consolas" w:hAnsi="Consolas"/>
-                <w:sz w:val="18"/>
-                <w:szCs w:val="18"/>
-                <w:shd w:val="clear" w:color="auto" w:fill="F3F4F6"/>
-              </w:rPr>
-              <w:t xml:space="preserve">workflowEntityId</w:t>
-            </w:r>
-          </w:p>
-        </w:tc>
-        <w:tc>
-          <w:tcPr>
-            <w:tcW w:w="3000" w:type="dxa"/>
-            <w:vAlign w:val="center"/>
-          </w:tcPr>
-          <w:p>
-            <w:pPr>
-              <w:pStyle w:val="TableText"/>
-              <w:spacing w:after="40"/>
-            </w:pPr>
-            <w:r>
-              <w:rPr/>
               <w:t xml:space="preserve">Upgrade to the current build and scan again; only expanded linked-environment metadata now determines the badge</w:t>
             </w:r>
           </w:p>
@@ -7418,7 +8524,7 @@
       </w:r>
       <w:r>
         <w:rPr/>
-        <w:t xml:space="preserve">Four solution connection references exist</w:t>
+        <w:t xml:space="preserve">Six solution connection references exist</w:t>
       </w:r>
     </w:p>
     <w:p>
@@ -7615,7 +8721,7 @@
       </w:r>
       <w:r>
         <w:rPr/>
-        <w:t xml:space="preserve">Four target connections are Connected</w:t>
+        <w:t xml:space="preserve">Six target connections are Connected</w:t>
       </w:r>
     </w:p>
     <w:p>
@@ -7649,7 +8755,7 @@
       </w:r>
       <w:r>
         <w:rPr/>
-        <w:t xml:space="preserve">Four references map to target connections</w:t>
+        <w:t xml:space="preserve">Six references map to target connections</w:t>
       </w:r>
     </w:p>
     <w:p>

</xml_diff>

<commit_message>
Release v1.1.3 continuous flow inventory
Replace pagination with virtualized scrolling, automatically enrich visible flows, and add a throttled cancellable Load all details queue.

Co-authored-by: Copilot <223556219+Copilot@users.noreply.github.com>
</commit_message>
<xml_diff>
--- a/Orphaned Flow Finder - Deployment and Tenant Onboarding Guide.docx
+++ b/Orphaned Flow Finder - Deployment and Tenant Onboarding Guide.docx
@@ -276,7 +276,7 @@
           <w:szCs w:val="18"/>
           <w:shd w:val="clear" w:color="auto" w:fill="F3F4F6"/>
         </w:rPr>
-        <w:t xml:space="preserve">solutions/OrphanedFlowFinder_1_1_2_0_managed.zip</w:t>
+        <w:t xml:space="preserve">solutions/OrphanedFlowFinder_1_1_3_0_managed.zip</w:t>
       </w:r>
       <w:r>
         <w:rPr/>
@@ -1164,7 +1164,7 @@
             </w:pPr>
             <w:r>
               <w:rPr/>
-              <w:t xml:space="preserve">Reads flow owner permissions for the current page</w:t>
+              <w:t xml:space="preserve">Reads flow owner permissions for visible or queued flows</w:t>
             </w:r>
           </w:p>
         </w:tc>
@@ -4009,7 +4009,7 @@
           <w:szCs w:val="18"/>
           <w:shd w:val="clear" w:color="auto" w:fill="F3F4F6"/>
         </w:rPr>
-        <w:t xml:space="preserve">solutions/OrphanedFlowFinder_1_1_2_0_managed.zip</w:t>
+        <w:t xml:space="preserve">solutions/OrphanedFlowFinder_1_1_3_0_managed.zip</w:t>
       </w:r>
     </w:p>
     <w:p>
@@ -4031,7 +4031,7 @@
           <w:szCs w:val="18"/>
           <w:shd w:val="clear" w:color="auto" w:fill="F3F4F6"/>
         </w:rPr>
-        <w:t xml:space="preserve">solutions/OrphanedFlowFinder_1_1_2_0_unmanaged.zip</w:t>
+        <w:t xml:space="preserve">solutions/OrphanedFlowFinder_1_1_3_0_unmanaged.zip</w:t>
       </w:r>
     </w:p>
     <w:p>
@@ -5228,7 +5228,7 @@
           <w:szCs w:val="18"/>
           <w:shd w:val="clear" w:color="auto" w:fill="F3F4F6"/>
         </w:rPr>
-        <w:t xml:space="preserve">OrphanedFlowFinder_1_1_2_0_managed.zip</w:t>
+        <w:t xml:space="preserve">OrphanedFlowFinder_1_1_3_0_managed.zip</w:t>
       </w:r>
       <w:r>
         <w:rPr/>
@@ -5967,24 +5967,85 @@
         <w:t xml:space="preserve">• </w:t>
       </w:r>
       <w:r>
-        <w:rPr>
-          <w:b/>
-        </w:rPr>
-        <w:t xml:space="preserve">Load page details</w:t>
-      </w:r>
-      <w:r>
-        <w:rPr/>
-        <w:t xml:space="preserve"> resolves user co-owner names and returns the latest run</w:t>
-      </w:r>
-    </w:p>
-    <w:p>
-      <w:pPr>
-        <w:pStyle w:val="Normal"/>
-        <w:spacing w:before="0" w:after="120" w:line="276" w:lineRule="auto"/>
-      </w:pPr>
-      <w:r>
-        <w:rPr/>
-        <w:t xml:space="preserve">or </w:t>
+        <w:rPr/>
+        <w:t xml:space="preserve">The inventory uses one continuous scrollbar and doesn't show numbered</w:t>
+      </w:r>
+    </w:p>
+    <w:p>
+      <w:pPr>
+        <w:pStyle w:val="Normal"/>
+        <w:spacing w:before="0" w:after="120" w:line="276" w:lineRule="auto"/>
+      </w:pPr>
+      <w:r>
+        <w:rPr/>
+        <w:t xml:space="preserve">pagination.</w:t>
+      </w:r>
+    </w:p>
+    <w:p>
+      <w:pPr>
+        <w:pStyle w:val="Normal"/>
+        <w:spacing w:before="0" w:after="120" w:line="276" w:lineRule="auto"/>
+        <w:ind w:left="540" w:hanging="360"/>
+      </w:pPr>
+      <w:r>
+        <w:rPr>
+          <w:b/>
+        </w:rPr>
+        <w:t xml:space="preserve">• </w:t>
+      </w:r>
+      <w:r>
+        <w:rPr/>
+        <w:t xml:space="preserve">Details load automatically as rows enter view.</w:t>
+      </w:r>
+    </w:p>
+    <w:p>
+      <w:pPr>
+        <w:pStyle w:val="Normal"/>
+        <w:spacing w:before="0" w:after="120" w:line="276" w:lineRule="auto"/>
+        <w:ind w:left="540" w:hanging="360"/>
+      </w:pPr>
+      <w:r>
+        <w:rPr>
+          <w:b/>
+        </w:rPr>
+        <w:t xml:space="preserve">• </w:t>
+      </w:r>
+      <w:r>
+        <w:rPr>
+          <w:b/>
+        </w:rPr>
+        <w:t xml:space="preserve">Load all details</w:t>
+      </w:r>
+      <w:r>
+        <w:rPr/>
+        <w:t xml:space="preserve"> queues every remaining filtered flow, reports progress,</w:t>
+      </w:r>
+    </w:p>
+    <w:p>
+      <w:pPr>
+        <w:pStyle w:val="Normal"/>
+        <w:spacing w:before="0" w:after="120" w:line="276" w:lineRule="auto"/>
+      </w:pPr>
+      <w:r>
+        <w:rPr/>
+        <w:t xml:space="preserve">and can be cancelled.</w:t>
+      </w:r>
+    </w:p>
+    <w:p>
+      <w:pPr>
+        <w:pStyle w:val="Normal"/>
+        <w:spacing w:before="0" w:after="120" w:line="276" w:lineRule="auto"/>
+        <w:ind w:left="540" w:hanging="360"/>
+      </w:pPr>
+      <w:r>
+        <w:rPr>
+          <w:b/>
+        </w:rPr>
+        <w:t xml:space="preserve">• </w:t>
+      </w:r>
+      <w:r>
+        <w:rPr/>
+        <w:t xml:space="preserve">Co-owner names resolve and last-run returns a timestamp or </w:t>
       </w:r>
       <w:r>
         <w:rPr>
@@ -5994,7 +6055,7 @@
       </w:r>
       <w:r>
         <w:rPr/>
-        <w:t xml:space="preserve"> for the current page.</w:t>
+        <w:t xml:space="preserve">.</w:t>
       </w:r>
     </w:p>
     <w:p>
@@ -7464,13 +7525,13 @@
             </w:pPr>
             <w:r>
               <w:rPr/>
-              <w:t xml:space="preserve">Repair that connection, verify admin access, and retry </w:t>
+              <w:t xml:space="preserve">Repair that connection, verify admin access, and scroll the row into view or select </w:t>
             </w:r>
             <w:r>
               <w:rPr>
                 <w:b/>
               </w:rPr>
-              <w:t xml:space="preserve">Load page details</w:t>
+              <w:t xml:space="preserve">Load all details</w:t>
             </w:r>
           </w:p>
         </w:tc>
@@ -7554,33 +7615,29 @@
             </w:pPr>
             <w:r>
               <w:rPr/>
-              <w:t xml:space="preserve">Page details haven't been requested</w:t>
-            </w:r>
-          </w:p>
-        </w:tc>
-        <w:tc>
-          <w:tcPr>
-            <w:tcW w:w="3000" w:type="dxa"/>
-            <w:vAlign w:val="center"/>
-          </w:tcPr>
-          <w:p>
-            <w:pPr>
-              <w:pStyle w:val="TableText"/>
-              <w:spacing w:after="40"/>
-            </w:pPr>
-            <w:r>
-              <w:rPr/>
-              <w:t xml:space="preserve">Select </w:t>
+              <w:t xml:space="preserve">The row hasn't entered the virtualized view and Load all isn't running</w:t>
+            </w:r>
+          </w:p>
+        </w:tc>
+        <w:tc>
+          <w:tcPr>
+            <w:tcW w:w="3000" w:type="dxa"/>
+            <w:vAlign w:val="center"/>
+          </w:tcPr>
+          <w:p>
+            <w:pPr>
+              <w:pStyle w:val="TableText"/>
+              <w:spacing w:after="40"/>
+            </w:pPr>
+            <w:r>
+              <w:rPr/>
+              <w:t xml:space="preserve">Scroll the row into view or select </w:t>
             </w:r>
             <w:r>
               <w:rPr>
                 <w:b/>
               </w:rPr>
-              <w:t xml:space="preserve">Load page details</w:t>
-            </w:r>
-            <w:r>
-              <w:rPr/>
-              <w:t xml:space="preserve"> above the result table</w:t>
+              <w:t xml:space="preserve">Load all details</w:t>
             </w:r>
           </w:p>
         </w:tc>

</xml_diff>